<commit_message>
feat: Implement deformed tags recovery
</commit_message>
<xml_diff>
--- a/documentation/Projekt_43995.docx
+++ b/documentation/Projekt_43995.docx
@@ -2856,17 +2856,8 @@
           <w:sz w:val="20"/>
           <w:szCs w:val="20"/>
         </w:rPr>
-        <w:t>W celu obsługi długich tekstów zaimplementowano strategię Long Context z wykorzystaniem RoPE Scaling (Liu et al., 2023). W konfiguracji trenera ustawiono parametr max_seq_length = 16384, co w połączeniu z gradient_checkpointing umożliwiło trening na dostępnych zasobach (w Colabie). Model prototypowy osiągnął wynik F1 na poziomie 0.7824 na zbiorze testowym, dowodząc technicznej wykonalności przyjętej koncepcji.</w:t>
-      </w:r>
-    </w:p>
-    <w:p>
-      <w:pPr>
-        <w:rPr>
-          <w:rFonts w:ascii="Times New Roman" w:hAnsi="Times New Roman" w:cs="Times New Roman"/>
-          <w:sz w:val="20"/>
-          <w:szCs w:val="20"/>
-        </w:rPr>
-      </w:pPr>
+        <w:t>W celu obsługi długich tekstów zaimplementowano strategię Long Context z wykorzystaniem RoPE Scaling (Liu et al., 2023). W konfiguracji trenera ustawiono parametr max_seq_length = 16384, co w połączeniu z gradient_checkpointing umożliwiło trening na dostępnych zasobach (w Colabie). Dodatkowo, zastosowano technikę "Completion Only LM" (maskowanie promptu użytkownika w funkcji straty), co zmusiło model do uczenia się wyłącznie generowania analizy, a nie reprodukcji długiego tekstu wejściowego, znacząco przyspieszając konwergencję. Model prototypowy osiągnął wynik F1 na poziomie 0.7824 na zbiorze testowym, dowodząc technicznej wykonalności przyjętej koncepcji.</w:t>
+      </w:r>
     </w:p>
     <w:p>
       <w:pPr>
@@ -3072,7 +3063,7 @@
           <w:sz w:val="20"/>
           <w:szCs w:val="20"/>
         </w:rPr>
-        <w:t>1. Wskaźnik Sukcesu Parsowania (Parsing Success Rate - PSR): Techniczna metryka weryfikująca, czy odpowiedź modelu jest poprawnym obiektem JSON. Skrypt podejmuje dwie próby deserializacji: ścisłą (strict JSON) oraz opartą na wyrażeniach regularnych (regex recovery), aby odzyskać strukturę nawet w przypadku drobnych błędów formatowania (np. brak klamry zamykającej). Wysoki PSR (&gt;95%) jest warunkiem koniecznym do wdrożenia.</w:t>
+        <w:t>1. Wskaźnik Sukcesu Parsowania (Parsing Success Rate - PSR): Techniczna metryka weryfikująca, czy odpowiedź modelu jest poprawnym obiektem JSON. Skrypt podejmuje dwie próby deserializacji: ścisłą (strict JSON) oraz opartą na wyrażeniach regularnych (regex recovery), aby odzyskać strukturę nawet w przypadku drobnych błędów formatowania (np. brak klamry zamykającej) lub literówek w kluczach (np. "discoverted_techniques"). System inferencyjny (backend) implementuje ten sam mechanizm "Heurystycznego Odzyskiwania" (Heuristic Recovery), który normalizuje nazwy kluczy oraz naprawia typowe literówki w wartościach tagów (np. "CHERRY_PIcKING" -&gt; "CHERRY_PICKING") przed zwróceniem wyniku do użytkownika. Wysoki PSR (&gt;95%) jest warunkiem koniecznym do wdrożenia.</w:t>
       </w:r>
     </w:p>
     <w:p>
@@ -3425,6 +3416,40 @@
           <w:szCs w:val="20"/>
         </w:rPr>
         <w:t>Ryzyko biasu w procesie destylacji: Istnieje ryzyko, że model przejął pewne uprzedzenia (bias) zawarte w modelu Nauczyciela, co jest typowym zjawiskiem w procesie Knowledge Distillation.</w:t>
+      </w:r>
+    </w:p>
+    <w:p>
+      <w:pPr>
+        <w:rPr>
+          <w:rFonts w:ascii="Times New Roman" w:hAnsi="Times New Roman" w:cs="Times New Roman"/>
+          <w:sz w:val="20"/>
+          <w:szCs w:val="20"/>
+        </w:rPr>
+      </w:pPr>
+      <w:r>
+        <w:rPr>
+          <w:rFonts w:ascii="Times New Roman" w:hAnsi="Times New Roman" w:cs="Times New Roman"/>
+          <w:sz w:val="20"/>
+          <w:szCs w:val="20"/>
+        </w:rPr>
+        <w:t>Halucynacje nazw kluczy JSON: Mimo programowego wymuszania struktury JSON w zbiorze treningowym (model Nauczyciela generował tylko wartości, a klucze były doklejane), model w trakcie inferencji wykazuje znaczącą tendencję do modyfikacji nazw kluczy (np. "reasonng" zamiast "reasoning"). Zjawisko to sugeruje, że model traktuje nazwy kluczy jako część generowanego tekstu, a nie sztywny kontrakt. Wykrycie i eliminacja tego problemu wymagałaby rozszerzenia benchmarku o ścisłą walidację schematu (schema validation) oraz dalszych badań nad mechanizmem atencji modelu w kontekście syntaktyki JSON.</w:t>
+      </w:r>
+    </w:p>
+    <w:p>
+      <w:pPr>
+        <w:rPr>
+          <w:rFonts w:ascii="Times New Roman" w:hAnsi="Times New Roman" w:cs="Times New Roman"/>
+          <w:sz w:val="20"/>
+          <w:szCs w:val="20"/>
+        </w:rPr>
+      </w:pPr>
+      <w:r>
+        <w:rPr>
+          <w:rFonts w:ascii="Times New Roman" w:hAnsi="Times New Roman" w:cs="Times New Roman"/>
+          <w:sz w:val="20"/>
+          <w:szCs w:val="20"/>
+        </w:rPr>
+        <w:t>Halucynacje nazw tagów (wartości): Obserwowano również przypadki generowania błędnych nazw etykiet, będących literówkami nazw poprawnych (np. "EMOTIORAL_CONTENT" zamiast "EMOTIONAL_CONTENT" lub "MISLEADING_CLICKBAI"). Wskazuje to na problem "rozmycia" rzadkich tokenów w procesie kwantyzacji lub niedostateczną liczbę powtórzeń poprawnych etykiet w zbiorze treningowym względem etykiet pustych. Obecny system ewaluacji traktuje takie tagi jako błędne (False Negative dla poprawnej klasy), ale nie klasyfikuje ich jako błędu strukturalnego.</w:t>
       </w:r>
     </w:p>
     <w:p>
@@ -4017,16 +4042,7 @@
           <w:sz w:val="20"/>
           <w:szCs w:val="20"/>
         </w:rPr>
-        <w:t xml:space="preserve">* Wpływ jakości generowanych wyjaśnień (XAI): Teoretycznie integracja warstwy wyjaśnialności powinna wspierać precyzję klasyfikacji poprzez wymuszenie głębszej analizy tekstu. Obserwowany spadek skuteczności wariantu "XAI" (F1 0.28 vs 0.49) wskazuje jednak na wpływ jakości danych trenujących w zakresie wyjaśnień (NLE). Jak wskazano w sekcji ograniczeń ("Brak formalnej walidacji jakości wyjaśnień"), model "Nauczyciela" mógł generować halucynacje lub błędne uzasadnienia, które model "Ucznia" następnie powielił, co </w:t>
-      </w:r>
-      <w:r>
-        <w:rPr>
-          <w:rFonts w:ascii="Times New Roman" w:hAnsi="Times New Roman" w:cs="Times New Roman"/>
-          <w:sz w:val="20"/>
-          <w:szCs w:val="20"/>
-        </w:rPr>
-        <w:lastRenderedPageBreak/>
-        <w:t>paradoksalnie zaburzyło proces decyzyjny zamiast go wspomóc. Potwierdza to kluczową rolę weryfikacji jakości danych w procesie destylacji wiedzy.</w:t>
+        <w:t>* Wpływ jakości generowanych wyjaśnień (XAI): Teoretycznie integracja warstwy wyjaśnialności powinna wspierać precyzję klasyfikacji poprzez wymuszenie głębszej analizy tekstu. Obserwowany spadek skuteczności wariantu "XAI" (F1 0.28 vs 0.49) wskazuje jednak na wpływ jakości danych trenujących w zakresie wyjaśnień (NLE). Jak wskazano w sekcji ograniczeń ("Brak formalnej walidacji jakości wyjaśnień"), model "Nauczyciela" mógł generować halucynacje lub błędne uzasadnienia, które model "Ucznia" następnie powielił, co paradoksalnie zaburzyło proces decyzyjny zamiast go wspomóc. Potwierdza to kluczową rolę weryfikacji jakości danych w procesie destylacji wiedzy.</w:t>
       </w:r>
     </w:p>
     <w:p>
@@ -4160,15 +4176,6 @@
         </w:rPr>
         <w:t xml:space="preserve"> można przedstawić – nieobowiązkowo – dodatkowe materiały, które nie zostały umieszczone w sekcji nr 2., na przykład zrzuty ekranu z aplikacji, czy dodatkowe wizualizacje w przypadku projektów graficznych. Każdy zrzut ekranu lub inne zdjęcie/obraz/materiał graficzny musi być opatrzone podpisem.</w:t>
       </w:r>
-    </w:p>
-    <w:p>
-      <w:pPr>
-        <w:rPr>
-          <w:rFonts w:ascii="Times New Roman" w:hAnsi="Times New Roman" w:cs="Times New Roman"/>
-          <w:color w:val="FF0000"/>
-          <w:sz w:val="20"/>
-        </w:rPr>
-      </w:pPr>
     </w:p>
     <w:p>
       <w:pPr>
@@ -4478,15 +4485,12 @@
         <w:keepNext/>
       </w:pPr>
       <w:r>
-        <w:rPr>
-          <w:noProof/>
-        </w:rPr>
         <w:lastRenderedPageBreak/>
         <w:drawing>
-          <wp:inline distT="0" distB="0" distL="0" distR="0" wp14:anchorId="42A72587" wp14:editId="7F479CD7">
-            <wp:extent cx="5736590" cy="2717165"/>
-            <wp:effectExtent l="0" t="0" r="0" b="6985"/>
-            <wp:docPr id="299038603" name="Picture 3"/>
+          <wp:inline distT="0" distB="0" distL="0" distR="0" wp14:anchorId="56F8EEE4" wp14:editId="0A9BE396">
+            <wp:extent cx="5755640" cy="2730500"/>
+            <wp:effectExtent l="0" t="0" r="0" b="0"/>
+            <wp:docPr id="891713317" name="Picture 1"/>
             <wp:cNvGraphicFramePr>
               <a:graphicFrameLocks xmlns:a="http://schemas.openxmlformats.org/drawingml/2006/main" noChangeAspect="1"/>
             </wp:cNvGraphicFramePr>
@@ -4494,36 +4498,23 @@
               <a:graphicData uri="http://schemas.openxmlformats.org/drawingml/2006/picture">
                 <pic:pic xmlns:pic="http://schemas.openxmlformats.org/drawingml/2006/picture">
                   <pic:nvPicPr>
-                    <pic:cNvPr id="0" name="Picture 3"/>
-                    <pic:cNvPicPr>
-                      <a:picLocks noChangeAspect="1" noChangeArrowheads="1"/>
-                    </pic:cNvPicPr>
+                    <pic:cNvPr id="891713317" name=""/>
+                    <pic:cNvPicPr/>
                   </pic:nvPicPr>
                   <pic:blipFill>
-                    <a:blip r:embed="rId14" cstate="print">
-                      <a:extLst>
-                        <a:ext uri="{28A0092B-C50C-407E-A947-70E740481C1C}">
-                          <a14:useLocalDpi xmlns:a14="http://schemas.microsoft.com/office/drawing/2010/main" val="0"/>
-                        </a:ext>
-                      </a:extLst>
-                    </a:blip>
-                    <a:srcRect/>
+                    <a:blip r:embed="rId14"/>
                     <a:stretch>
                       <a:fillRect/>
                     </a:stretch>
                   </pic:blipFill>
-                  <pic:spPr bwMode="auto">
+                  <pic:spPr>
                     <a:xfrm>
                       <a:off x="0" y="0"/>
-                      <a:ext cx="5736590" cy="2717165"/>
+                      <a:ext cx="5755640" cy="2730500"/>
                     </a:xfrm>
                     <a:prstGeom prst="rect">
                       <a:avLst/>
                     </a:prstGeom>
-                    <a:noFill/>
-                    <a:ln>
-                      <a:noFill/>
-                    </a:ln>
                   </pic:spPr>
                 </pic:pic>
               </a:graphicData>
@@ -4537,22 +4528,23 @@
         <w:pStyle w:val="Caption"/>
       </w:pPr>
       <w:r>
+        <w:t>Wynik wnioskowania: interfejs wyświetla tagi wraz z podpowiedziami i objaśnieniami.</w:t>
+      </w:r>
+    </w:p>
+    <w:p>
+      <w:pPr>
+        <w:pStyle w:val="Caption"/>
+        <w:keepNext/>
+      </w:pPr>
+      <w:r>
         <w:rPr>
           <w:noProof/>
         </w:rPr>
         <w:drawing>
-          <wp:anchor distT="0" distB="0" distL="114300" distR="114300" simplePos="0" relativeHeight="251661312" behindDoc="0" locked="0" layoutInCell="1" allowOverlap="1" wp14:anchorId="1ED1D112" wp14:editId="7628AF02">
-            <wp:simplePos x="0" y="0"/>
-            <wp:positionH relativeFrom="margin">
-              <wp:align>left</wp:align>
-            </wp:positionH>
-            <wp:positionV relativeFrom="margin">
-              <wp:posOffset>3174521</wp:posOffset>
-            </wp:positionV>
-            <wp:extent cx="5753735" cy="2726055"/>
+          <wp:inline distT="0" distB="0" distL="0" distR="0" wp14:anchorId="2C434A1B" wp14:editId="40DB8C73">
+            <wp:extent cx="5753100" cy="2724150"/>
             <wp:effectExtent l="0" t="0" r="0" b="0"/>
-            <wp:wrapSquare wrapText="bothSides"/>
-            <wp:docPr id="1169148929" name="Picture 4"/>
+            <wp:docPr id="1348928702" name="Picture 2"/>
             <wp:cNvGraphicFramePr>
               <a:graphicFrameLocks xmlns:a="http://schemas.openxmlformats.org/drawingml/2006/main" noChangeAspect="1"/>
             </wp:cNvGraphicFramePr>
@@ -4560,7 +4552,7 @@
               <a:graphicData uri="http://schemas.openxmlformats.org/drawingml/2006/picture">
                 <pic:pic xmlns:pic="http://schemas.openxmlformats.org/drawingml/2006/picture">
                   <pic:nvPicPr>
-                    <pic:cNvPr id="0" name="Picture 4"/>
+                    <pic:cNvPr id="0" name="Picture 1"/>
                     <pic:cNvPicPr>
                       <a:picLocks noChangeAspect="1" noChangeArrowheads="1"/>
                     </pic:cNvPicPr>
@@ -4581,99 +4573,7 @@
                   <pic:spPr bwMode="auto">
                     <a:xfrm>
                       <a:off x="0" y="0"/>
-                      <a:ext cx="5753735" cy="2726055"/>
-                    </a:xfrm>
-                    <a:prstGeom prst="rect">
-                      <a:avLst/>
-                    </a:prstGeom>
-                    <a:noFill/>
-                    <a:ln>
-                      <a:noFill/>
-                    </a:ln>
-                  </pic:spPr>
-                </pic:pic>
-              </a:graphicData>
-            </a:graphic>
-          </wp:anchor>
-        </w:drawing>
-      </w:r>
-      <w:r>
-        <w:t>Panel ekspertski interfejs</w:t>
-      </w:r>
-    </w:p>
-    <w:p>
-      <w:pPr>
-        <w:pStyle w:val="Caption"/>
-      </w:pPr>
-      <w:r>
-        <w:t>Panel ekspert</w:t>
-      </w:r>
-      <w:r>
-        <w:t>ski</w:t>
-      </w:r>
-      <w:r>
-        <w:t xml:space="preserve"> pokazuje postępy w </w:t>
-      </w:r>
-      <w:r>
-        <w:t>treningu</w:t>
-      </w:r>
-      <w:r>
-        <w:t xml:space="preserve"> i testowaniu po przesłaniu zestawu </w:t>
-      </w:r>
-      <w:r>
-        <w:t>treningowego</w:t>
-      </w:r>
-      <w:r>
-        <w:t>.</w:t>
-      </w:r>
-      <w:r>
-        <w:t xml:space="preserve"> </w:t>
-      </w:r>
-    </w:p>
-    <w:p>
-      <w:pPr>
-        <w:pStyle w:val="Caption"/>
-        <w:keepNext/>
-      </w:pPr>
-      <w:r>
-        <w:rPr>
-          <w:noProof/>
-        </w:rPr>
-        <w:lastRenderedPageBreak/>
-        <w:drawing>
-          <wp:inline distT="0" distB="0" distL="0" distR="0" wp14:anchorId="0AF26E58" wp14:editId="117FDC12">
-            <wp:extent cx="5753735" cy="2596515"/>
-            <wp:effectExtent l="0" t="0" r="0" b="0"/>
-            <wp:docPr id="1836481323" name="Picture 7"/>
-            <wp:cNvGraphicFramePr>
-              <a:graphicFrameLocks xmlns:a="http://schemas.openxmlformats.org/drawingml/2006/main" noChangeAspect="1"/>
-            </wp:cNvGraphicFramePr>
-            <a:graphic xmlns:a="http://schemas.openxmlformats.org/drawingml/2006/main">
-              <a:graphicData uri="http://schemas.openxmlformats.org/drawingml/2006/picture">
-                <pic:pic xmlns:pic="http://schemas.openxmlformats.org/drawingml/2006/picture">
-                  <pic:nvPicPr>
-                    <pic:cNvPr id="0" name="Picture 7"/>
-                    <pic:cNvPicPr>
-                      <a:picLocks noChangeAspect="1" noChangeArrowheads="1"/>
-                    </pic:cNvPicPr>
-                  </pic:nvPicPr>
-                  <pic:blipFill>
-                    <a:blip r:embed="rId16" cstate="print">
-                      <a:extLst>
-                        <a:ext uri="{28A0092B-C50C-407E-A947-70E740481C1C}">
-                          <a14:useLocalDpi xmlns:a14="http://schemas.microsoft.com/office/drawing/2010/main" val="0"/>
-                        </a:ext>
-                      </a:extLst>
-                    </a:blip>
-                    <a:srcRect/>
-                    <a:stretch>
-                      <a:fillRect/>
-                    </a:stretch>
-                  </pic:blipFill>
-                  <pic:spPr bwMode="auto">
-                    <a:xfrm>
-                      <a:off x="0" y="0"/>
-                      <a:ext cx="5753735" cy="2596515"/>
+                      <a:ext cx="5753100" cy="2724150"/>
                     </a:xfrm>
                     <a:prstGeom prst="rect">
                       <a:avLst/>
@@ -4695,23 +4595,17 @@
         <w:pStyle w:val="Caption"/>
       </w:pPr>
       <w:r>
-        <w:t>Po szkoleniu i benchmarkingu panel ekspertów pokazuje wskaźniki, a przycisk modelu wdroz staje się aktywny.</w:t>
-      </w:r>
-    </w:p>
-    <w:p>
-      <w:pPr>
-        <w:pStyle w:val="Caption"/>
-        <w:keepNext/>
-      </w:pPr>
-      <w:r>
-        <w:rPr>
-          <w:noProof/>
-        </w:rPr>
+        <w:t>Panel ekspertski interfejs</w:t>
+      </w:r>
+    </w:p>
+    <w:p>
+      <w:r>
+        <w:lastRenderedPageBreak/>
         <w:drawing>
-          <wp:inline distT="0" distB="0" distL="0" distR="0" wp14:anchorId="4E8C08DB" wp14:editId="6D3C86E2">
-            <wp:extent cx="5753735" cy="2726055"/>
-            <wp:effectExtent l="0" t="0" r="0" b="0"/>
-            <wp:docPr id="1055154479" name="Picture 6"/>
+          <wp:inline distT="0" distB="0" distL="0" distR="0" wp14:anchorId="1FBCEC11" wp14:editId="2FA75102">
+            <wp:extent cx="5755640" cy="2720340"/>
+            <wp:effectExtent l="0" t="0" r="0" b="3810"/>
+            <wp:docPr id="910981615" name="Picture 1"/>
             <wp:cNvGraphicFramePr>
               <a:graphicFrameLocks xmlns:a="http://schemas.openxmlformats.org/drawingml/2006/main" noChangeAspect="1"/>
             </wp:cNvGraphicFramePr>
@@ -4719,36 +4613,23 @@
               <a:graphicData uri="http://schemas.openxmlformats.org/drawingml/2006/picture">
                 <pic:pic xmlns:pic="http://schemas.openxmlformats.org/drawingml/2006/picture">
                   <pic:nvPicPr>
-                    <pic:cNvPr id="0" name="Picture 6"/>
-                    <pic:cNvPicPr>
-                      <a:picLocks noChangeAspect="1" noChangeArrowheads="1"/>
-                    </pic:cNvPicPr>
+                    <pic:cNvPr id="910981615" name=""/>
+                    <pic:cNvPicPr/>
                   </pic:nvPicPr>
                   <pic:blipFill>
-                    <a:blip r:embed="rId17" cstate="print">
-                      <a:extLst>
-                        <a:ext uri="{28A0092B-C50C-407E-A947-70E740481C1C}">
-                          <a14:useLocalDpi xmlns:a14="http://schemas.microsoft.com/office/drawing/2010/main" val="0"/>
-                        </a:ext>
-                      </a:extLst>
-                    </a:blip>
-                    <a:srcRect/>
+                    <a:blip r:embed="rId16"/>
                     <a:stretch>
                       <a:fillRect/>
                     </a:stretch>
                   </pic:blipFill>
-                  <pic:spPr bwMode="auto">
+                  <pic:spPr>
                     <a:xfrm>
                       <a:off x="0" y="0"/>
-                      <a:ext cx="5753735" cy="2726055"/>
+                      <a:ext cx="5755640" cy="2720340"/>
                     </a:xfrm>
                     <a:prstGeom prst="rect">
                       <a:avLst/>
                     </a:prstGeom>
-                    <a:noFill/>
-                    <a:ln>
-                      <a:noFill/>
-                    </a:ln>
                   </pic:spPr>
                 </pic:pic>
               </a:graphicData>
@@ -4762,13 +4643,25 @@
         <w:pStyle w:val="Caption"/>
       </w:pPr>
       <w:r>
-        <w:t>Podczas wrdozeni</w:t>
-      </w:r>
-      <w:r>
-        <w:t>a</w:t>
-      </w:r>
-      <w:r>
-        <w:t xml:space="preserve"> koło świeci na żółto</w:t>
+        <w:t>Panel ekspert</w:t>
+      </w:r>
+      <w:r>
+        <w:t>ski</w:t>
+      </w:r>
+      <w:r>
+        <w:t xml:space="preserve"> pokazuje postępy w </w:t>
+      </w:r>
+      <w:r>
+        <w:t>treningu</w:t>
+      </w:r>
+      <w:r>
+        <w:t xml:space="preserve"> i testowaniu po przesłaniu zestawu </w:t>
+      </w:r>
+      <w:r>
+        <w:t>treningowego</w:t>
+      </w:r>
+      <w:r>
+        <w:t xml:space="preserve">. </w:t>
       </w:r>
     </w:p>
     <w:p>
@@ -4777,15 +4670,11 @@
         <w:keepNext/>
       </w:pPr>
       <w:r>
-        <w:rPr>
-          <w:noProof/>
-        </w:rPr>
-        <w:lastRenderedPageBreak/>
         <w:drawing>
-          <wp:inline distT="0" distB="0" distL="0" distR="0" wp14:anchorId="2FD2C66A" wp14:editId="00150B97">
-            <wp:extent cx="5753735" cy="2726055"/>
-            <wp:effectExtent l="0" t="0" r="0" b="0"/>
-            <wp:docPr id="1179834464" name="Picture 1"/>
+          <wp:inline distT="0" distB="0" distL="0" distR="0" wp14:anchorId="0CE64EC1" wp14:editId="158FD48B">
+            <wp:extent cx="5755640" cy="2722880"/>
+            <wp:effectExtent l="0" t="0" r="0" b="1270"/>
+            <wp:docPr id="542347481" name="Picture 1"/>
             <wp:cNvGraphicFramePr>
               <a:graphicFrameLocks xmlns:a="http://schemas.openxmlformats.org/drawingml/2006/main" noChangeAspect="1"/>
             </wp:cNvGraphicFramePr>
@@ -4793,61 +4682,257 @@
               <a:graphicData uri="http://schemas.openxmlformats.org/drawingml/2006/picture">
                 <pic:pic xmlns:pic="http://schemas.openxmlformats.org/drawingml/2006/picture">
                   <pic:nvPicPr>
-                    <pic:cNvPr id="0" name="Picture 1"/>
-                    <pic:cNvPicPr>
-                      <a:picLocks noChangeAspect="1" noChangeArrowheads="1"/>
-                    </pic:cNvPicPr>
+                    <pic:cNvPr id="542347481" name=""/>
+                    <pic:cNvPicPr/>
                   </pic:nvPicPr>
                   <pic:blipFill>
-                    <a:blip r:embed="rId18" cstate="print">
+                    <a:blip r:embed="rId17"/>
+                    <a:stretch>
+                      <a:fillRect/>
+                    </a:stretch>
+                  </pic:blipFill>
+                  <pic:spPr>
+                    <a:xfrm>
+                      <a:off x="0" y="0"/>
+                      <a:ext cx="5755640" cy="2722880"/>
+                    </a:xfrm>
+                    <a:prstGeom prst="rect">
+                      <a:avLst/>
+                    </a:prstGeom>
+                  </pic:spPr>
+                </pic:pic>
+              </a:graphicData>
+            </a:graphic>
+          </wp:inline>
+        </w:drawing>
+      </w:r>
+    </w:p>
+    <w:p>
+      <w:pPr>
+        <w:pStyle w:val="Caption"/>
+      </w:pPr>
+      <w:r>
+        <w:t>Po szkoleniu i benchmarkingu panel ekspert</w:t>
+      </w:r>
+      <w:r>
+        <w:t>a</w:t>
+      </w:r>
+      <w:r>
+        <w:t xml:space="preserve"> pokazuje wskaźniki, a przycisk wdroz </w:t>
+      </w:r>
+      <w:r>
+        <w:t>model</w:t>
+      </w:r>
+      <w:r>
+        <w:t xml:space="preserve"> </w:t>
+      </w:r>
+      <w:r>
+        <w:t>staje się aktywny.</w:t>
+      </w:r>
+    </w:p>
+    <w:p>
+      <w:pPr>
+        <w:pStyle w:val="Caption"/>
+        <w:keepNext/>
+      </w:pPr>
+      <w:r>
+        <w:lastRenderedPageBreak/>
+        <w:drawing>
+          <wp:inline distT="0" distB="0" distL="0" distR="0" wp14:anchorId="53FA9972" wp14:editId="0E4F4359">
+            <wp:extent cx="5755640" cy="2722880"/>
+            <wp:effectExtent l="0" t="0" r="0" b="1270"/>
+            <wp:docPr id="118682826" name="Picture 1"/>
+            <wp:cNvGraphicFramePr>
+              <a:graphicFrameLocks xmlns:a="http://schemas.openxmlformats.org/drawingml/2006/main" noChangeAspect="1"/>
+            </wp:cNvGraphicFramePr>
+            <a:graphic xmlns:a="http://schemas.openxmlformats.org/drawingml/2006/main">
+              <a:graphicData uri="http://schemas.openxmlformats.org/drawingml/2006/picture">
+                <pic:pic xmlns:pic="http://schemas.openxmlformats.org/drawingml/2006/picture">
+                  <pic:nvPicPr>
+                    <pic:cNvPr id="118682826" name=""/>
+                    <pic:cNvPicPr/>
+                  </pic:nvPicPr>
+                  <pic:blipFill>
+                    <a:blip r:embed="rId18"/>
+                    <a:stretch>
+                      <a:fillRect/>
+                    </a:stretch>
+                  </pic:blipFill>
+                  <pic:spPr>
+                    <a:xfrm>
+                      <a:off x="0" y="0"/>
+                      <a:ext cx="5755640" cy="2722880"/>
+                    </a:xfrm>
+                    <a:prstGeom prst="rect">
+                      <a:avLst/>
+                    </a:prstGeom>
+                  </pic:spPr>
+                </pic:pic>
+              </a:graphicData>
+            </a:graphic>
+          </wp:inline>
+        </w:drawing>
+      </w:r>
+    </w:p>
+    <w:p>
+      <w:pPr>
+        <w:pStyle w:val="Caption"/>
+      </w:pPr>
+      <w:r>
+        <w:rPr>
+          <w:noProof/>
+        </w:rPr>
+        <mc:AlternateContent>
+          <mc:Choice Requires="wps">
+            <w:drawing>
+              <wp:anchor distT="0" distB="0" distL="114300" distR="114300" simplePos="0" relativeHeight="251663360" behindDoc="0" locked="0" layoutInCell="1" allowOverlap="1" wp14:anchorId="401B6BC3" wp14:editId="6984823A">
+                <wp:simplePos x="0" y="0"/>
+                <wp:positionH relativeFrom="column">
+                  <wp:posOffset>0</wp:posOffset>
+                </wp:positionH>
+                <wp:positionV relativeFrom="paragraph">
+                  <wp:posOffset>3083560</wp:posOffset>
+                </wp:positionV>
+                <wp:extent cx="5755640" cy="635"/>
+                <wp:effectExtent l="0" t="0" r="0" b="0"/>
+                <wp:wrapSquare wrapText="bothSides"/>
+                <wp:docPr id="694308024" name="Text Box 1"/>
+                <wp:cNvGraphicFramePr/>
+                <a:graphic xmlns:a="http://schemas.openxmlformats.org/drawingml/2006/main">
+                  <a:graphicData uri="http://schemas.microsoft.com/office/word/2010/wordprocessingShape">
+                    <wps:wsp>
+                      <wps:cNvSpPr txBox="1"/>
+                      <wps:spPr>
+                        <a:xfrm>
+                          <a:off x="0" y="0"/>
+                          <a:ext cx="5755640" cy="635"/>
+                        </a:xfrm>
+                        <a:prstGeom prst="rect">
+                          <a:avLst/>
+                        </a:prstGeom>
+                        <a:solidFill>
+                          <a:prstClr val="white"/>
+                        </a:solidFill>
+                        <a:ln>
+                          <a:noFill/>
+                        </a:ln>
+                      </wps:spPr>
+                      <wps:txbx>
+                        <w:txbxContent>
+                          <w:p>
+                            <w:pPr>
+                              <w:pStyle w:val="Caption"/>
+                            </w:pPr>
+                            <w:r>
+                              <w:t>Po zmianie koloru koła na zielony, podstawowe wskaźniki są aktualizowane, a nowy model może być używany za pośrednictwem interfejsu użytkownika.</w:t>
+                            </w:r>
+                          </w:p>
+                        </w:txbxContent>
+                      </wps:txbx>
+                      <wps:bodyPr rot="0" spcFirstLastPara="0" vertOverflow="overflow" horzOverflow="overflow" vert="horz" wrap="square" lIns="0" tIns="0" rIns="0" bIns="0" numCol="1" spcCol="0" rtlCol="0" fromWordArt="0" anchor="t" anchorCtr="0" forceAA="0" compatLnSpc="1">
+                        <a:prstTxWarp prst="textNoShape">
+                          <a:avLst/>
+                        </a:prstTxWarp>
+                        <a:spAutoFit/>
+                      </wps:bodyPr>
+                    </wps:wsp>
+                  </a:graphicData>
+                </a:graphic>
+              </wp:anchor>
+            </w:drawing>
+          </mc:Choice>
+          <mc:Fallback>
+            <w:pict>
+              <v:shapetype w14:anchorId="401B6BC3" id="_x0000_t202" coordsize="21600,21600" o:spt="202" path="m,l,21600r21600,l21600,xe">
+                <v:stroke joinstyle="miter"/>
+                <v:path gradientshapeok="t" o:connecttype="rect"/>
+              </v:shapetype>
+              <v:shape id="Text Box 1" o:spid="_x0000_s1026" type="#_x0000_t202" style="position:absolute;margin-left:0;margin-top:242.8pt;width:453.2pt;height:.05pt;z-index:251663360;visibility:visible;mso-wrap-style:square;mso-wrap-distance-left:9pt;mso-wrap-distance-top:0;mso-wrap-distance-right:9pt;mso-wrap-distance-bottom:0;mso-position-horizontal:absolute;mso-position-horizontal-relative:text;mso-position-vertical:absolute;mso-position-vertical-relative:text;v-text-anchor:top" o:gfxdata="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" stroked="f">
+                <v:textbox style="mso-fit-shape-to-text:t" inset="0,0,0,0">
+                  <w:txbxContent>
+                    <w:p>
+                      <w:pPr>
+                        <w:pStyle w:val="Caption"/>
+                      </w:pPr>
+                      <w:r>
+                        <w:t>Po zmianie koloru koła na zielony, podstawowe wskaźniki są aktualizowane, a nowy model może być używany za pośrednictwem interfejsu użytkownika.</w:t>
+                      </w:r>
+                    </w:p>
+                  </w:txbxContent>
+                </v:textbox>
+                <w10:wrap type="square"/>
+              </v:shape>
+            </w:pict>
+          </mc:Fallback>
+        </mc:AlternateContent>
+      </w:r>
+      <w:r>
+        <w:drawing>
+          <wp:anchor distT="0" distB="0" distL="114300" distR="114300" simplePos="0" relativeHeight="251661312" behindDoc="1" locked="0" layoutInCell="1" allowOverlap="1" wp14:anchorId="0F7835D4" wp14:editId="3E0691F7">
+            <wp:simplePos x="0" y="0"/>
+            <wp:positionH relativeFrom="margin">
+              <wp:align>right</wp:align>
+            </wp:positionH>
+            <wp:positionV relativeFrom="margin">
+              <wp:posOffset>3157869</wp:posOffset>
+            </wp:positionV>
+            <wp:extent cx="5755640" cy="2719705"/>
+            <wp:effectExtent l="0" t="0" r="0" b="4445"/>
+            <wp:wrapSquare wrapText="bothSides"/>
+            <wp:docPr id="1678192666" name="Picture 1"/>
+            <wp:cNvGraphicFramePr>
+              <a:graphicFrameLocks xmlns:a="http://schemas.openxmlformats.org/drawingml/2006/main" noChangeAspect="1"/>
+            </wp:cNvGraphicFramePr>
+            <a:graphic xmlns:a="http://schemas.openxmlformats.org/drawingml/2006/main">
+              <a:graphicData uri="http://schemas.openxmlformats.org/drawingml/2006/picture">
+                <pic:pic xmlns:pic="http://schemas.openxmlformats.org/drawingml/2006/picture">
+                  <pic:nvPicPr>
+                    <pic:cNvPr id="1678192666" name=""/>
+                    <pic:cNvPicPr/>
+                  </pic:nvPicPr>
+                  <pic:blipFill>
+                    <a:blip r:embed="rId19" cstate="print">
                       <a:extLst>
                         <a:ext uri="{28A0092B-C50C-407E-A947-70E740481C1C}">
                           <a14:useLocalDpi xmlns:a14="http://schemas.microsoft.com/office/drawing/2010/main" val="0"/>
                         </a:ext>
                       </a:extLst>
                     </a:blip>
-                    <a:srcRect/>
                     <a:stretch>
                       <a:fillRect/>
                     </a:stretch>
                   </pic:blipFill>
-                  <pic:spPr bwMode="auto">
+                  <pic:spPr>
                     <a:xfrm>
                       <a:off x="0" y="0"/>
-                      <a:ext cx="5753735" cy="2726055"/>
+                      <a:ext cx="5755640" cy="2719705"/>
                     </a:xfrm>
                     <a:prstGeom prst="rect">
                       <a:avLst/>
                     </a:prstGeom>
-                    <a:noFill/>
-                    <a:ln>
-                      <a:noFill/>
-                    </a:ln>
                   </pic:spPr>
                 </pic:pic>
               </a:graphicData>
             </a:graphic>
-          </wp:inline>
+          </wp:anchor>
         </w:drawing>
       </w:r>
-    </w:p>
-    <w:p>
-      <w:pPr>
-        <w:pStyle w:val="Caption"/>
-        <w:rPr>
-          <w:rFonts w:ascii="Times New Roman" w:hAnsi="Times New Roman" w:cs="Times New Roman"/>
-          <w:color w:val="FF0000"/>
-          <w:sz w:val="20"/>
-        </w:rPr>
-      </w:pPr>
-      <w:r>
-        <w:t>Po zmianie koloru koła na zielony nowy model może być używany za pośrednictwem interfejsu użytkownika</w:t>
-      </w:r>
-    </w:p>
-    <w:p>
-      <w:pPr>
-        <w:keepNext/>
-      </w:pPr>
+      <w:r>
+        <w:t>Podczas wrdozeni</w:t>
+      </w:r>
+      <w:r>
+        <w:t>a</w:t>
+      </w:r>
+      <w:r>
+        <w:t xml:space="preserve"> koło świeci na żółto</w:t>
+      </w:r>
+    </w:p>
+    <w:p>
+      <w:r>
+        <w:br w:type="page"/>
+      </w:r>
+    </w:p>
+    <w:p>
       <w:r>
         <w:rPr>
           <w:rFonts w:ascii="Times New Roman" w:hAnsi="Times New Roman" w:cs="Times New Roman"/>
@@ -4857,7 +4942,7 @@
         </w:rPr>
         <w:lastRenderedPageBreak/>
         <w:drawing>
-          <wp:inline distT="0" distB="0" distL="0" distR="0" wp14:anchorId="4794D6FA" wp14:editId="7F86A7FA">
+          <wp:inline distT="0" distB="0" distL="0" distR="0" wp14:anchorId="6575F318" wp14:editId="78FBD487">
             <wp:extent cx="5610609" cy="8721306"/>
             <wp:effectExtent l="0" t="0" r="9525" b="3810"/>
             <wp:docPr id="1594061867" name="Picture 8"/>
@@ -4874,7 +4959,7 @@
                     </pic:cNvPicPr>
                   </pic:nvPicPr>
                   <pic:blipFill>
-                    <a:blip r:embed="rId19" cstate="print">
+                    <a:blip r:embed="rId20" cstate="print">
                       <a:extLst>
                         <a:ext uri="{28A0092B-C50C-407E-A947-70E740481C1C}">
                           <a14:useLocalDpi xmlns:a14="http://schemas.microsoft.com/office/drawing/2010/main" val="0"/>
@@ -4916,7 +5001,13 @@
         </w:rPr>
       </w:pPr>
       <w:r>
-        <w:t>Diagram systemu</w:t>
+        <w:t xml:space="preserve">Diagram </w:t>
+      </w:r>
+      <w:r>
+        <w:t xml:space="preserve">architektury </w:t>
+      </w:r>
+      <w:r>
+        <w:t>systemu</w:t>
       </w:r>
     </w:p>
     <w:p>
@@ -4927,107 +5018,6 @@
           <w:sz w:val="20"/>
         </w:rPr>
       </w:pPr>
-      <w:r>
-        <w:rPr>
-          <w:noProof/>
-        </w:rPr>
-        <w:lastRenderedPageBreak/>
-        <mc:AlternateContent>
-          <mc:Choice Requires="wps">
-            <w:drawing>
-              <wp:anchor distT="0" distB="0" distL="114300" distR="114300" simplePos="0" relativeHeight="251660288" behindDoc="0" locked="0" layoutInCell="1" allowOverlap="1" wp14:anchorId="3888239C" wp14:editId="5A220AF6">
-                <wp:simplePos x="0" y="0"/>
-                <wp:positionH relativeFrom="column">
-                  <wp:posOffset>919587</wp:posOffset>
-                </wp:positionH>
-                <wp:positionV relativeFrom="paragraph">
-                  <wp:posOffset>8476974</wp:posOffset>
-                </wp:positionV>
-                <wp:extent cx="3951605" cy="635"/>
-                <wp:effectExtent l="0" t="0" r="0" b="0"/>
-                <wp:wrapSquare wrapText="bothSides"/>
-                <wp:docPr id="1352527975" name="Text Box 1"/>
-                <wp:cNvGraphicFramePr/>
-                <a:graphic xmlns:a="http://schemas.openxmlformats.org/drawingml/2006/main">
-                  <a:graphicData uri="http://schemas.microsoft.com/office/word/2010/wordprocessingShape">
-                    <wps:wsp>
-                      <wps:cNvSpPr txBox="1"/>
-                      <wps:spPr>
-                        <a:xfrm>
-                          <a:off x="0" y="0"/>
-                          <a:ext cx="3951605" cy="635"/>
-                        </a:xfrm>
-                        <a:prstGeom prst="rect">
-                          <a:avLst/>
-                        </a:prstGeom>
-                        <a:solidFill>
-                          <a:prstClr val="white"/>
-                        </a:solidFill>
-                        <a:ln>
-                          <a:noFill/>
-                        </a:ln>
-                      </wps:spPr>
-                      <wps:txbx>
-                        <w:txbxContent>
-                          <w:p>
-                            <w:pPr>
-                              <w:pStyle w:val="Caption"/>
-                              <w:rPr>
-                                <w:rFonts w:ascii="Times New Roman" w:hAnsi="Times New Roman" w:cs="Times New Roman"/>
-                                <w:noProof/>
-                                <w:color w:val="FF0000"/>
-                                <w:sz w:val="20"/>
-                              </w:rPr>
-                            </w:pPr>
-                            <w:r>
-                              <w:t>Schemat systemu informatycznego</w:t>
-                            </w:r>
-                          </w:p>
-                        </w:txbxContent>
-                      </wps:txbx>
-                      <wps:bodyPr rot="0" spcFirstLastPara="0" vertOverflow="overflow" horzOverflow="overflow" vert="horz" wrap="square" lIns="0" tIns="0" rIns="0" bIns="0" numCol="1" spcCol="0" rtlCol="0" fromWordArt="0" anchor="t" anchorCtr="0" forceAA="0" compatLnSpc="1">
-                        <a:prstTxWarp prst="textNoShape">
-                          <a:avLst/>
-                        </a:prstTxWarp>
-                        <a:spAutoFit/>
-                      </wps:bodyPr>
-                    </wps:wsp>
-                  </a:graphicData>
-                </a:graphic>
-              </wp:anchor>
-            </w:drawing>
-          </mc:Choice>
-          <mc:Fallback>
-            <w:pict>
-              <v:shapetype w14:anchorId="3888239C" id="_x0000_t202" coordsize="21600,21600" o:spt="202" path="m,l,21600r21600,l21600,xe">
-                <v:stroke joinstyle="miter"/>
-                <v:path gradientshapeok="t" o:connecttype="rect"/>
-              </v:shapetype>
-              <v:shape id="Text Box 1" o:spid="_x0000_s1026" type="#_x0000_t202" style="position:absolute;margin-left:72.4pt;margin-top:667.5pt;width:311.15pt;height:.05pt;z-index:251660288;visibility:visible;mso-wrap-style:square;mso-wrap-distance-left:9pt;mso-wrap-distance-top:0;mso-wrap-distance-right:9pt;mso-wrap-distance-bottom:0;mso-position-horizontal:absolute;mso-position-horizontal-relative:text;mso-position-vertical:absolute;mso-position-vertical-relative:text;v-text-anchor:top" o:gfxdata="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" stroked="f">
-                <v:textbox style="mso-fit-shape-to-text:t" inset="0,0,0,0">
-                  <w:txbxContent>
-                    <w:p>
-                      <w:pPr>
-                        <w:pStyle w:val="Caption"/>
-                        <w:rPr>
-                          <w:rFonts w:ascii="Times New Roman" w:hAnsi="Times New Roman" w:cs="Times New Roman"/>
-                          <w:noProof/>
-                          <w:color w:val="FF0000"/>
-                          <w:sz w:val="20"/>
-                        </w:rPr>
-                      </w:pPr>
-                      <w:r>
-                        <w:t>Schemat systemu informatycznego</w:t>
-                      </w:r>
-                    </w:p>
-                  </w:txbxContent>
-                </v:textbox>
-                <w10:wrap type="square"/>
-              </v:shape>
-            </w:pict>
-          </mc:Fallback>
-        </mc:AlternateContent>
-      </w:r>
     </w:p>
     <w:p>
       <w:pPr>
@@ -6002,7 +5992,7 @@
       </w:pPr>
     </w:p>
     <w:sectPr>
-      <w:headerReference w:type="first" r:id="rId20"/>
+      <w:headerReference w:type="first" r:id="rId21"/>
       <w:pgSz w:w="11900" w:h="16840" w:code="9"/>
       <w:pgMar w:top="1418" w:right="1418" w:bottom="1418" w:left="1418" w:header="709" w:footer="709" w:gutter="0"/>
       <w:cols w:space="708"/>
@@ -9977,6 +9967,15 @@
 </file>
 
 <file path=customXml/item2.xml><?xml version="1.0" encoding="utf-8"?>
+<?mso-contentType ?>
+<FormTemplates xmlns="http://schemas.microsoft.com/sharepoint/v3/contenttype/forms">
+  <Display>DocumentLibraryForm</Display>
+  <Edit>DocumentLibraryForm</Edit>
+  <New>DocumentLibraryForm</New>
+</FormTemplates>
+</file>
+
+<file path=customXml/item3.xml><?xml version="1.0" encoding="utf-8"?>
 <ct:contentTypeSchema xmlns:ct="http://schemas.microsoft.com/office/2006/metadata/contentType" xmlns:ma="http://schemas.microsoft.com/office/2006/metadata/properties/metaAttributes" ct:_="" ma:_="" ma:contentTypeName="Dokument" ma:contentTypeID="0x010100C7B3477DA0B97842A4AB3CAC2FC7CCA9" ma:contentTypeVersion="3" ma:contentTypeDescription="Utwórz nowy dokument." ma:contentTypeScope="" ma:versionID="08acbf4e69e1c417c0654eb506165124">
   <xsd:schema xmlns:xsd="http://www.w3.org/2001/XMLSchema" xmlns:xs="http://www.w3.org/2001/XMLSchema" xmlns:p="http://schemas.microsoft.com/office/2006/metadata/properties" xmlns:ns2="90ad895e-3eee-4c0f-8ee5-203ad6452046" targetNamespace="http://schemas.microsoft.com/office/2006/metadata/properties" ma:root="true" ma:fieldsID="0612b0a3dcdc06ca4f4ab8731dc57d64" ns2:_="">
     <xsd:import namespace="90ad895e-3eee-4c0f-8ee5-203ad6452046"/>
@@ -10114,15 +10113,6 @@
 </ct:contentTypeSchema>
 </file>
 
-<file path=customXml/item3.xml><?xml version="1.0" encoding="utf-8"?>
-<?mso-contentType ?>
-<FormTemplates xmlns="http://schemas.microsoft.com/sharepoint/v3/contenttype/forms">
-  <Display>DocumentLibraryForm</Display>
-  <Edit>DocumentLibraryForm</Edit>
-  <New>DocumentLibraryForm</New>
-</FormTemplates>
-</file>
-
 <file path=customXml/itemProps1.xml><?xml version="1.0" encoding="utf-8"?>
 <ds:datastoreItem xmlns:ds="http://schemas.openxmlformats.org/officeDocument/2006/customXml" ds:itemID="{9A4B9707-3390-4BAA-9D3A-F1BCEDCBE263}">
   <ds:schemaRefs>
@@ -10133,6 +10123,14 @@
 </file>
 
 <file path=customXml/itemProps2.xml><?xml version="1.0" encoding="utf-8"?>
+<ds:datastoreItem xmlns:ds="http://schemas.openxmlformats.org/officeDocument/2006/customXml" ds:itemID="{C7ED8927-B6BE-4A5E-8E7E-ABB33AB171D8}">
+  <ds:schemaRefs>
+    <ds:schemaRef ds:uri="http://schemas.microsoft.com/sharepoint/v3/contenttype/forms"/>
+  </ds:schemaRefs>
+</ds:datastoreItem>
+</file>
+
+<file path=customXml/itemProps3.xml><?xml version="1.0" encoding="utf-8"?>
 <ds:datastoreItem xmlns:ds="http://schemas.openxmlformats.org/officeDocument/2006/customXml" ds:itemID="{8B32E23D-F441-40B0-8BD3-500F27940F29}">
   <ds:schemaRefs>
     <ds:schemaRef ds:uri="http://schemas.microsoft.com/office/2006/metadata/contentType"/>
@@ -10148,12 +10146,4 @@
     <ds:schemaRef ds:uri="http://schemas.microsoft.com/internal/obd"/>
   </ds:schemaRefs>
 </ds:datastoreItem>
-</file>
-
-<file path=customXml/itemProps3.xml><?xml version="1.0" encoding="utf-8"?>
-<ds:datastoreItem xmlns:ds="http://schemas.openxmlformats.org/officeDocument/2006/customXml" ds:itemID="{C7ED8927-B6BE-4A5E-8E7E-ABB33AB171D8}">
-  <ds:schemaRefs>
-    <ds:schemaRef ds:uri="http://schemas.microsoft.com/sharepoint/v3/contenttype/forms"/>
-  </ds:schemaRefs>
-</ds:datastoreItem>
 </file>
</xml_diff>

<commit_message>
docs: update thesis-sections.md and document changes
</commit_message>
<xml_diff>
--- a/documentation/Projekt_43995.docx
+++ b/documentation/Projekt_43995.docx
@@ -1535,7 +1535,6 @@
                 <w:rFonts w:ascii="Times New Roman" w:hAnsi="Times New Roman" w:cs="Times New Roman"/>
                 <w:sz w:val="20"/>
                 <w:szCs w:val="20"/>
-                <w:lang w:val="en-US"/>
               </w:rPr>
             </w:pPr>
             <w:r>
@@ -1543,69 +1542,8 @@
                 <w:rFonts w:ascii="Times New Roman" w:hAnsi="Times New Roman" w:cs="Times New Roman"/>
                 <w:sz w:val="20"/>
                 <w:szCs w:val="20"/>
-                <w:lang w:val="en-US"/>
-              </w:rPr>
-              <w:t xml:space="preserve">- </w:t>
-            </w:r>
-            <w:proofErr w:type="spellStart"/>
-            <w:r>
-              <w:rPr>
-                <w:rFonts w:ascii="Times New Roman" w:hAnsi="Times New Roman" w:cs="Times New Roman"/>
-                <w:sz w:val="20"/>
-                <w:szCs w:val="20"/>
-                <w:lang w:val="en-US"/>
-              </w:rPr>
-              <w:t>Serwery</w:t>
-            </w:r>
-            <w:proofErr w:type="spellEnd"/>
-            <w:r>
-              <w:rPr>
-                <w:rFonts w:ascii="Times New Roman" w:hAnsi="Times New Roman" w:cs="Times New Roman"/>
-                <w:sz w:val="20"/>
-                <w:szCs w:val="20"/>
-                <w:lang w:val="en-US"/>
-              </w:rPr>
-              <w:t xml:space="preserve"> </w:t>
-            </w:r>
-            <w:proofErr w:type="spellStart"/>
-            <w:r>
-              <w:rPr>
-                <w:rFonts w:ascii="Times New Roman" w:hAnsi="Times New Roman" w:cs="Times New Roman"/>
-                <w:sz w:val="20"/>
-                <w:szCs w:val="20"/>
-                <w:lang w:val="en-US"/>
-              </w:rPr>
-              <w:t>i</w:t>
-            </w:r>
-            <w:proofErr w:type="spellEnd"/>
-            <w:r>
-              <w:rPr>
-                <w:rFonts w:ascii="Times New Roman" w:hAnsi="Times New Roman" w:cs="Times New Roman"/>
-                <w:sz w:val="20"/>
-                <w:szCs w:val="20"/>
-                <w:lang w:val="en-US"/>
-              </w:rPr>
-              <w:t xml:space="preserve"> Backend: Ollama, Python (</w:t>
-            </w:r>
-            <w:proofErr w:type="spellStart"/>
-            <w:r>
-              <w:rPr>
-                <w:rFonts w:ascii="Times New Roman" w:hAnsi="Times New Roman" w:cs="Times New Roman"/>
-                <w:sz w:val="20"/>
-                <w:szCs w:val="20"/>
-                <w:lang w:val="en-US"/>
-              </w:rPr>
-              <w:t>FastAPI</w:t>
-            </w:r>
-            <w:proofErr w:type="spellEnd"/>
-            <w:r>
-              <w:rPr>
-                <w:rFonts w:ascii="Times New Roman" w:hAnsi="Times New Roman" w:cs="Times New Roman"/>
-                <w:sz w:val="20"/>
-                <w:szCs w:val="20"/>
-                <w:lang w:val="en-US"/>
-              </w:rPr>
-              <w:t>).</w:t>
+              </w:rPr>
+              <w:t>- Serwery i Backend: Ollama (oparty na llama.cpp), Python (FastAPI).</w:t>
             </w:r>
           </w:p>
           <w:p>
@@ -2528,7 +2466,7 @@
           <w:sz w:val="20"/>
           <w:szCs w:val="20"/>
         </w:rPr>
-        <w:t>Jednym z największych wyzwań projektu był brak zbioru danych zawierającego nie tylko etykiety (np. "REFERENCE_ERROR"), ale również wyjaśnienia w języku naturalnym (Natural Language Explanations - NLE). Zgodnie z literaturą (Camburu et al., 2018), systemy NLE mają na celu generowanie tekstowego wyjaśnienia decyzji klasyfikatora, co jest kluczowe dla budowania zaufania użytkownika.</w:t>
+        <w:t>Jednym z największych wyzwań projektu był brak zbioru danych zawierającego nie tylko etykiety (np. "REFERENCE_ERROR"), ale również wyjaśnienia w języku naturalnym (Natural Language Explanations - NLE). Koncepcja NLE, wprowadzona m.in. przez Camburu et al. (2018), zakłada generowanie tekstowego uzasadnienia decyzji klasyfikatora, co jest kluczowe dla budowania zaufania użytkownika w systemach Explainable AI (XAI). Podwaliny pod to podejście położyły również prace takie jak Lei et al. (2016), koncentrujące się na ekstrakcji fragmentów tekstu uzasadniających predykcję (Rationale Generation). Ścisłe powiązanie klasyfikacji z generowaniem uzasadnień zapobiega tworzeniu modeli typu "czarna skrzynka".</w:t>
       </w:r>
     </w:p>
     <w:p>
@@ -2691,7 +2629,234 @@
           <w:sz w:val="20"/>
           <w:szCs w:val="20"/>
         </w:rPr>
-        <w:t>Separacja logiki: Model generował treść wyjaśnienia, a struktura JSON była składana programowo, co eliminowało błędy składniowe.</w:t>
+        <w:t>Separacja logiki: Model generował treść wyjaśnienia, a struktura JSON była składana programowo, co eliminowało błędy składniowe. W docelowym systemie (XAI Adapter) model jest trenowany, aby na wyjściu zwracać spójną strukturę zawierającą listę zidentyfikowanych technik oraz pole uzasadnienia (reasoning):</w:t>
+      </w:r>
+    </w:p>
+    <w:p>
+      <w:pPr>
+        <w:rPr>
+          <w:rFonts w:ascii="Times New Roman" w:hAnsi="Times New Roman" w:cs="Times New Roman"/>
+          <w:sz w:val="20"/>
+          <w:szCs w:val="20"/>
+        </w:rPr>
+      </w:pPr>
+    </w:p>
+    <w:p>
+      <w:pPr>
+        <w:shd w:val="clear" w:color="auto" w:fill="1F1F1F"/>
+        <w:spacing w:line="285" w:lineRule="atLeast"/>
+        <w:rPr>
+          <w:rFonts w:ascii="Consolas" w:eastAsia="Times New Roman" w:hAnsi="Consolas" w:cs="Times New Roman"/>
+          <w:color w:val="CCCCCC"/>
+          <w:sz w:val="21"/>
+          <w:szCs w:val="21"/>
+        </w:rPr>
+      </w:pPr>
+      <w:r>
+        <w:rPr>
+          <w:rFonts w:ascii="Consolas" w:eastAsia="Times New Roman" w:hAnsi="Consolas" w:cs="Times New Roman"/>
+          <w:color w:val="D4D4D4"/>
+          <w:sz w:val="21"/>
+          <w:szCs w:val="21"/>
+        </w:rPr>
+        <w:lastRenderedPageBreak/>
+        <w:t>{</w:t>
+      </w:r>
+    </w:p>
+    <w:p>
+      <w:pPr>
+        <w:shd w:val="clear" w:color="auto" w:fill="1F1F1F"/>
+        <w:spacing w:line="285" w:lineRule="atLeast"/>
+        <w:rPr>
+          <w:rFonts w:ascii="Consolas" w:eastAsia="Times New Roman" w:hAnsi="Consolas" w:cs="Times New Roman"/>
+          <w:color w:val="CCCCCC"/>
+          <w:sz w:val="21"/>
+          <w:szCs w:val="21"/>
+        </w:rPr>
+      </w:pPr>
+      <w:r>
+        <w:rPr>
+          <w:rFonts w:ascii="Consolas" w:eastAsia="Times New Roman" w:hAnsi="Consolas" w:cs="Times New Roman"/>
+          <w:color w:val="D4D4D4"/>
+          <w:sz w:val="21"/>
+          <w:szCs w:val="21"/>
+        </w:rPr>
+        <w:t xml:space="preserve">  </w:t>
+      </w:r>
+      <w:r>
+        <w:rPr>
+          <w:rFonts w:ascii="Consolas" w:eastAsia="Times New Roman" w:hAnsi="Consolas" w:cs="Times New Roman"/>
+          <w:color w:val="9CDCFE"/>
+          <w:sz w:val="21"/>
+          <w:szCs w:val="21"/>
+        </w:rPr>
+        <w:t>"reasoning"</w:t>
+      </w:r>
+      <w:r>
+        <w:rPr>
+          <w:rFonts w:ascii="Consolas" w:eastAsia="Times New Roman" w:hAnsi="Consolas" w:cs="Times New Roman"/>
+          <w:color w:val="D4D4D4"/>
+          <w:sz w:val="21"/>
+          <w:szCs w:val="21"/>
+        </w:rPr>
+        <w:t xml:space="preserve">: </w:t>
+      </w:r>
+      <w:r>
+        <w:rPr>
+          <w:rFonts w:ascii="Consolas" w:eastAsia="Times New Roman" w:hAnsi="Consolas" w:cs="Times New Roman"/>
+          <w:color w:val="CE9178"/>
+          <w:sz w:val="21"/>
+          <w:szCs w:val="21"/>
+        </w:rPr>
+        <w:t>"Na podstawie analizy podanych fragmentów, tekst wykazuje cechy selektywnego doboru faktów, co w połączeniu z wyolbrzymieniem skali zjawiska służy budowaniu narracji..."</w:t>
+      </w:r>
+      <w:r>
+        <w:rPr>
+          <w:rFonts w:ascii="Consolas" w:eastAsia="Times New Roman" w:hAnsi="Consolas" w:cs="Times New Roman"/>
+          <w:color w:val="D4D4D4"/>
+          <w:sz w:val="21"/>
+          <w:szCs w:val="21"/>
+        </w:rPr>
+        <w:t>,</w:t>
+      </w:r>
+    </w:p>
+    <w:p>
+      <w:pPr>
+        <w:shd w:val="clear" w:color="auto" w:fill="1F1F1F"/>
+        <w:spacing w:line="285" w:lineRule="atLeast"/>
+        <w:rPr>
+          <w:rFonts w:ascii="Consolas" w:eastAsia="Times New Roman" w:hAnsi="Consolas" w:cs="Times New Roman"/>
+          <w:color w:val="CCCCCC"/>
+          <w:sz w:val="21"/>
+          <w:szCs w:val="21"/>
+          <w:lang w:val="en-US"/>
+        </w:rPr>
+      </w:pPr>
+      <w:r>
+        <w:rPr>
+          <w:rFonts w:ascii="Consolas" w:eastAsia="Times New Roman" w:hAnsi="Consolas" w:cs="Times New Roman"/>
+          <w:color w:val="D4D4D4"/>
+          <w:sz w:val="21"/>
+          <w:szCs w:val="21"/>
+        </w:rPr>
+        <w:t xml:space="preserve">  </w:t>
+      </w:r>
+      <w:r>
+        <w:rPr>
+          <w:rFonts w:ascii="Consolas" w:eastAsia="Times New Roman" w:hAnsi="Consolas" w:cs="Times New Roman"/>
+          <w:color w:val="9CDCFE"/>
+          <w:sz w:val="21"/>
+          <w:szCs w:val="21"/>
+          <w:lang w:val="en-US"/>
+        </w:rPr>
+        <w:t>"</w:t>
+      </w:r>
+      <w:proofErr w:type="spellStart"/>
+      <w:proofErr w:type="gramStart"/>
+      <w:r>
+        <w:rPr>
+          <w:rFonts w:ascii="Consolas" w:eastAsia="Times New Roman" w:hAnsi="Consolas" w:cs="Times New Roman"/>
+          <w:color w:val="9CDCFE"/>
+          <w:sz w:val="21"/>
+          <w:szCs w:val="21"/>
+          <w:lang w:val="en-US"/>
+        </w:rPr>
+        <w:t>discovered</w:t>
+      </w:r>
+      <w:proofErr w:type="gramEnd"/>
+      <w:r>
+        <w:rPr>
+          <w:rFonts w:ascii="Consolas" w:eastAsia="Times New Roman" w:hAnsi="Consolas" w:cs="Times New Roman"/>
+          <w:color w:val="9CDCFE"/>
+          <w:sz w:val="21"/>
+          <w:szCs w:val="21"/>
+          <w:lang w:val="en-US"/>
+        </w:rPr>
+        <w:t>_techniques</w:t>
+      </w:r>
+      <w:proofErr w:type="spellEnd"/>
+      <w:r>
+        <w:rPr>
+          <w:rFonts w:ascii="Consolas" w:eastAsia="Times New Roman" w:hAnsi="Consolas" w:cs="Times New Roman"/>
+          <w:color w:val="9CDCFE"/>
+          <w:sz w:val="21"/>
+          <w:szCs w:val="21"/>
+          <w:lang w:val="en-US"/>
+        </w:rPr>
+        <w:t>"</w:t>
+      </w:r>
+      <w:r>
+        <w:rPr>
+          <w:rFonts w:ascii="Consolas" w:eastAsia="Times New Roman" w:hAnsi="Consolas" w:cs="Times New Roman"/>
+          <w:color w:val="D4D4D4"/>
+          <w:sz w:val="21"/>
+          <w:szCs w:val="21"/>
+          <w:lang w:val="en-US"/>
+        </w:rPr>
+        <w:t>: [</w:t>
+      </w:r>
+      <w:r>
+        <w:rPr>
+          <w:rFonts w:ascii="Consolas" w:eastAsia="Times New Roman" w:hAnsi="Consolas" w:cs="Times New Roman"/>
+          <w:color w:val="CE9178"/>
+          <w:sz w:val="21"/>
+          <w:szCs w:val="21"/>
+          <w:lang w:val="en-US"/>
+        </w:rPr>
+        <w:t>"CHERRY_PICKING"</w:t>
+      </w:r>
+      <w:r>
+        <w:rPr>
+          <w:rFonts w:ascii="Consolas" w:eastAsia="Times New Roman" w:hAnsi="Consolas" w:cs="Times New Roman"/>
+          <w:color w:val="D4D4D4"/>
+          <w:sz w:val="21"/>
+          <w:szCs w:val="21"/>
+          <w:lang w:val="en-US"/>
+        </w:rPr>
+        <w:t xml:space="preserve">, </w:t>
+      </w:r>
+      <w:r>
+        <w:rPr>
+          <w:rFonts w:ascii="Consolas" w:eastAsia="Times New Roman" w:hAnsi="Consolas" w:cs="Times New Roman"/>
+          <w:color w:val="CE9178"/>
+          <w:sz w:val="21"/>
+          <w:szCs w:val="21"/>
+          <w:lang w:val="en-US"/>
+        </w:rPr>
+        <w:t>"EXAGGERATION"</w:t>
+      </w:r>
+      <w:r>
+        <w:rPr>
+          <w:rFonts w:ascii="Consolas" w:eastAsia="Times New Roman" w:hAnsi="Consolas" w:cs="Times New Roman"/>
+          <w:color w:val="D4D4D4"/>
+          <w:sz w:val="21"/>
+          <w:szCs w:val="21"/>
+          <w:lang w:val="en-US"/>
+        </w:rPr>
+        <w:t>]</w:t>
+      </w:r>
+    </w:p>
+    <w:p>
+      <w:pPr>
+        <w:shd w:val="clear" w:color="auto" w:fill="1F1F1F"/>
+        <w:spacing w:line="285" w:lineRule="atLeast"/>
+        <w:rPr>
+          <w:rFonts w:ascii="Consolas" w:eastAsia="Times New Roman" w:hAnsi="Consolas" w:cs="Times New Roman"/>
+          <w:color w:val="CCCCCC"/>
+          <w:sz w:val="21"/>
+          <w:szCs w:val="21"/>
+          <w:lang w:val="en-US"/>
+        </w:rPr>
+      </w:pPr>
+      <w:r>
+        <w:rPr>
+          <w:rFonts w:ascii="Consolas" w:eastAsia="Times New Roman" w:hAnsi="Consolas" w:cs="Times New Roman"/>
+          <w:color w:val="D4D4D4"/>
+          <w:sz w:val="21"/>
+          <w:szCs w:val="21"/>
+          <w:lang w:val="en-US"/>
+        </w:rPr>
+        <w:t>}</w:t>
       </w:r>
     </w:p>
     <w:p>
@@ -2743,300 +2908,1129 @@
           <w:sz w:val="20"/>
           <w:szCs w:val="20"/>
         </w:rPr>
+        <w:t>Sercem systemu jest model Bielik-4.5B-Instruct (SpeakLeash Team, 2024). Bezpośrednie użycie modelu bazowego dawało wyniki niesatysfakcjonujące w kontekście specyficznego zadania detekcji manipulacji, co wymusiło proces dostrajania (Fine-Tuning).</w:t>
+      </w:r>
+    </w:p>
+    <w:p>
+      <w:pPr>
+        <w:rPr>
+          <w:rFonts w:ascii="Times New Roman" w:hAnsi="Times New Roman" w:cs="Times New Roman"/>
+          <w:sz w:val="20"/>
+          <w:szCs w:val="20"/>
+        </w:rPr>
+      </w:pPr>
+    </w:p>
+    <w:p>
+      <w:pPr>
+        <w:rPr>
+          <w:rFonts w:ascii="Times New Roman" w:hAnsi="Times New Roman" w:cs="Times New Roman"/>
+          <w:sz w:val="20"/>
+          <w:szCs w:val="20"/>
+        </w:rPr>
+      </w:pPr>
+      <w:r>
+        <w:rPr>
+          <w:rFonts w:ascii="Times New Roman" w:hAnsi="Times New Roman" w:cs="Times New Roman"/>
+          <w:sz w:val="20"/>
+          <w:szCs w:val="20"/>
+        </w:rPr>
+        <w:t>Wyzwanie implementacyjne:</w:t>
+      </w:r>
+    </w:p>
+    <w:p>
+      <w:pPr>
+        <w:rPr>
+          <w:rFonts w:ascii="Times New Roman" w:hAnsi="Times New Roman" w:cs="Times New Roman"/>
+          <w:sz w:val="20"/>
+          <w:szCs w:val="20"/>
+        </w:rPr>
+      </w:pPr>
+      <w:r>
+        <w:rPr>
+          <w:rFonts w:ascii="Times New Roman" w:hAnsi="Times New Roman" w:cs="Times New Roman"/>
+          <w:sz w:val="20"/>
+          <w:szCs w:val="20"/>
+        </w:rPr>
+        <w:t>Standardowy trening modelu o 4.5 miliarda parametrów wymagał optymalizacji pamięciowej oraz obsługi długich tekstów (artykuły z datasetu MIPD często przekraczają standardowe okna kontekstowe).</w:t>
+      </w:r>
+    </w:p>
+    <w:p>
+      <w:pPr>
+        <w:rPr>
+          <w:rFonts w:ascii="Times New Roman" w:hAnsi="Times New Roman" w:cs="Times New Roman"/>
+          <w:sz w:val="20"/>
+          <w:szCs w:val="20"/>
+        </w:rPr>
+      </w:pPr>
+    </w:p>
+    <w:p>
+      <w:pPr>
+        <w:rPr>
+          <w:rFonts w:ascii="Times New Roman" w:hAnsi="Times New Roman" w:cs="Times New Roman"/>
+          <w:sz w:val="20"/>
+          <w:szCs w:val="20"/>
+        </w:rPr>
+      </w:pPr>
+      <w:r>
+        <w:rPr>
+          <w:rFonts w:ascii="Times New Roman" w:hAnsi="Times New Roman" w:cs="Times New Roman"/>
+          <w:sz w:val="20"/>
+          <w:szCs w:val="20"/>
+        </w:rPr>
+        <w:t>Zastosowane rozwiązanie:</w:t>
+      </w:r>
+    </w:p>
+    <w:p>
+      <w:pPr>
+        <w:rPr>
+          <w:rFonts w:ascii="Times New Roman" w:hAnsi="Times New Roman" w:cs="Times New Roman"/>
+          <w:sz w:val="20"/>
+          <w:szCs w:val="20"/>
+        </w:rPr>
+      </w:pPr>
+      <w:r>
+        <w:rPr>
+          <w:rFonts w:ascii="Times New Roman" w:hAnsi="Times New Roman" w:cs="Times New Roman"/>
+          <w:sz w:val="20"/>
+          <w:szCs w:val="20"/>
+        </w:rPr>
+        <w:t>Zastosowano technikę QLoRA (Dettmers et al., 2023) z wykorzystaniem biblioteki Unsloth. Pozwoliło to na zamrożenie głównych wag modelu (zapisanych w formacie 4-bitowym NF4) i trenowanie jedynie niewielkich macierzy adapterów (Hu et al., 2021). Proces konfiguracji warstwy adaptacyjnej (LoRA) przedstawia poniższy fragment kodu (plik `trainer.py`):</w:t>
+      </w:r>
+    </w:p>
+    <w:p>
+      <w:pPr>
+        <w:shd w:val="clear" w:color="auto" w:fill="1F1F1F"/>
+        <w:spacing w:line="285" w:lineRule="atLeast"/>
+        <w:rPr>
+          <w:rFonts w:ascii="Consolas" w:eastAsia="Times New Roman" w:hAnsi="Consolas" w:cs="Times New Roman"/>
+          <w:color w:val="CCCCCC"/>
+          <w:sz w:val="21"/>
+          <w:szCs w:val="21"/>
+          <w:lang w:val="en-US"/>
+        </w:rPr>
+      </w:pPr>
+      <w:r>
+        <w:rPr>
+          <w:rFonts w:ascii="Consolas" w:eastAsia="Times New Roman" w:hAnsi="Consolas" w:cs="Times New Roman"/>
+          <w:color w:val="D4D4D4"/>
+          <w:sz w:val="21"/>
+          <w:szCs w:val="21"/>
+          <w:lang w:val="en-US"/>
+        </w:rPr>
+        <w:t xml:space="preserve">model = </w:t>
+      </w:r>
+      <w:proofErr w:type="spellStart"/>
+      <w:r>
+        <w:rPr>
+          <w:rFonts w:ascii="Consolas" w:eastAsia="Times New Roman" w:hAnsi="Consolas" w:cs="Times New Roman"/>
+          <w:color w:val="D4D4D4"/>
+          <w:sz w:val="21"/>
+          <w:szCs w:val="21"/>
+          <w:lang w:val="en-US"/>
+        </w:rPr>
+        <w:t>FastLanguageModel.get_peft_</w:t>
+      </w:r>
+      <w:proofErr w:type="gramStart"/>
+      <w:r>
+        <w:rPr>
+          <w:rFonts w:ascii="Consolas" w:eastAsia="Times New Roman" w:hAnsi="Consolas" w:cs="Times New Roman"/>
+          <w:color w:val="D4D4D4"/>
+          <w:sz w:val="21"/>
+          <w:szCs w:val="21"/>
+          <w:lang w:val="en-US"/>
+        </w:rPr>
+        <w:t>model</w:t>
+      </w:r>
+      <w:proofErr w:type="spellEnd"/>
+      <w:r>
+        <w:rPr>
+          <w:rFonts w:ascii="Consolas" w:eastAsia="Times New Roman" w:hAnsi="Consolas" w:cs="Times New Roman"/>
+          <w:color w:val="D4D4D4"/>
+          <w:sz w:val="21"/>
+          <w:szCs w:val="21"/>
+          <w:lang w:val="en-US"/>
+        </w:rPr>
+        <w:t>(</w:t>
+      </w:r>
+      <w:proofErr w:type="gramEnd"/>
+    </w:p>
+    <w:p>
+      <w:pPr>
+        <w:shd w:val="clear" w:color="auto" w:fill="1F1F1F"/>
+        <w:spacing w:line="285" w:lineRule="atLeast"/>
+        <w:rPr>
+          <w:rFonts w:ascii="Consolas" w:eastAsia="Times New Roman" w:hAnsi="Consolas" w:cs="Times New Roman"/>
+          <w:color w:val="CCCCCC"/>
+          <w:sz w:val="21"/>
+          <w:szCs w:val="21"/>
+          <w:lang w:val="en-US"/>
+        </w:rPr>
+      </w:pPr>
+      <w:r>
+        <w:rPr>
+          <w:rFonts w:ascii="Consolas" w:eastAsia="Times New Roman" w:hAnsi="Consolas" w:cs="Times New Roman"/>
+          <w:color w:val="D4D4D4"/>
+          <w:sz w:val="21"/>
+          <w:szCs w:val="21"/>
+          <w:lang w:val="en-US"/>
+        </w:rPr>
+        <w:t>    model,</w:t>
+      </w:r>
+    </w:p>
+    <w:p>
+      <w:pPr>
+        <w:shd w:val="clear" w:color="auto" w:fill="1F1F1F"/>
+        <w:spacing w:line="285" w:lineRule="atLeast"/>
+        <w:rPr>
+          <w:rFonts w:ascii="Consolas" w:eastAsia="Times New Roman" w:hAnsi="Consolas" w:cs="Times New Roman"/>
+          <w:color w:val="CCCCCC"/>
+          <w:sz w:val="21"/>
+          <w:szCs w:val="21"/>
+          <w:lang w:val="en-US"/>
+        </w:rPr>
+      </w:pPr>
+      <w:r>
+        <w:rPr>
+          <w:rFonts w:ascii="Consolas" w:eastAsia="Times New Roman" w:hAnsi="Consolas" w:cs="Times New Roman"/>
+          <w:color w:val="D4D4D4"/>
+          <w:sz w:val="21"/>
+          <w:szCs w:val="21"/>
+          <w:lang w:val="en-US"/>
+        </w:rPr>
+        <w:t xml:space="preserve">    </w:t>
+      </w:r>
+      <w:r>
+        <w:rPr>
+          <w:rFonts w:ascii="Consolas" w:eastAsia="Times New Roman" w:hAnsi="Consolas" w:cs="Times New Roman"/>
+          <w:color w:val="9CDCFE"/>
+          <w:sz w:val="21"/>
+          <w:szCs w:val="21"/>
+          <w:lang w:val="en-US"/>
+        </w:rPr>
+        <w:t>r</w:t>
+      </w:r>
+      <w:r>
+        <w:rPr>
+          <w:rFonts w:ascii="Consolas" w:eastAsia="Times New Roman" w:hAnsi="Consolas" w:cs="Times New Roman"/>
+          <w:color w:val="D4D4D4"/>
+          <w:sz w:val="21"/>
+          <w:szCs w:val="21"/>
+          <w:lang w:val="en-US"/>
+        </w:rPr>
+        <w:t xml:space="preserve"> = </w:t>
+      </w:r>
+      <w:r>
+        <w:rPr>
+          <w:rFonts w:ascii="Consolas" w:eastAsia="Times New Roman" w:hAnsi="Consolas" w:cs="Times New Roman"/>
+          <w:color w:val="B5CEA8"/>
+          <w:sz w:val="21"/>
+          <w:szCs w:val="21"/>
+          <w:lang w:val="en-US"/>
+        </w:rPr>
+        <w:t>16</w:t>
+      </w:r>
+      <w:r>
+        <w:rPr>
+          <w:rFonts w:ascii="Consolas" w:eastAsia="Times New Roman" w:hAnsi="Consolas" w:cs="Times New Roman"/>
+          <w:color w:val="D4D4D4"/>
+          <w:sz w:val="21"/>
+          <w:szCs w:val="21"/>
+          <w:lang w:val="en-US"/>
+        </w:rPr>
+        <w:t xml:space="preserve">, </w:t>
+      </w:r>
+      <w:r>
+        <w:rPr>
+          <w:rFonts w:ascii="Consolas" w:eastAsia="Times New Roman" w:hAnsi="Consolas" w:cs="Times New Roman"/>
+          <w:color w:val="6A9955"/>
+          <w:sz w:val="21"/>
+          <w:szCs w:val="21"/>
+          <w:lang w:val="en-US"/>
+        </w:rPr>
+        <w:t xml:space="preserve"># Ranga </w:t>
+      </w:r>
+      <w:proofErr w:type="spellStart"/>
+      <w:r>
+        <w:rPr>
+          <w:rFonts w:ascii="Consolas" w:eastAsia="Times New Roman" w:hAnsi="Consolas" w:cs="Times New Roman"/>
+          <w:color w:val="6A9955"/>
+          <w:sz w:val="21"/>
+          <w:szCs w:val="21"/>
+          <w:lang w:val="en-US"/>
+        </w:rPr>
+        <w:t>macierzy</w:t>
+      </w:r>
+      <w:proofErr w:type="spellEnd"/>
+      <w:r>
+        <w:rPr>
+          <w:rFonts w:ascii="Consolas" w:eastAsia="Times New Roman" w:hAnsi="Consolas" w:cs="Times New Roman"/>
+          <w:color w:val="6A9955"/>
+          <w:sz w:val="21"/>
+          <w:szCs w:val="21"/>
+          <w:lang w:val="en-US"/>
+        </w:rPr>
+        <w:t xml:space="preserve"> </w:t>
+      </w:r>
+      <w:proofErr w:type="spellStart"/>
+      <w:r>
+        <w:rPr>
+          <w:rFonts w:ascii="Consolas" w:eastAsia="Times New Roman" w:hAnsi="Consolas" w:cs="Times New Roman"/>
+          <w:color w:val="6A9955"/>
+          <w:sz w:val="21"/>
+          <w:szCs w:val="21"/>
+          <w:lang w:val="en-US"/>
+        </w:rPr>
+        <w:t>LoRA</w:t>
+      </w:r>
+      <w:proofErr w:type="spellEnd"/>
+    </w:p>
+    <w:p>
+      <w:pPr>
+        <w:shd w:val="clear" w:color="auto" w:fill="1F1F1F"/>
+        <w:spacing w:line="285" w:lineRule="atLeast"/>
+        <w:rPr>
+          <w:rFonts w:ascii="Consolas" w:eastAsia="Times New Roman" w:hAnsi="Consolas" w:cs="Times New Roman"/>
+          <w:color w:val="CCCCCC"/>
+          <w:sz w:val="21"/>
+          <w:szCs w:val="21"/>
+          <w:lang w:val="en-US"/>
+        </w:rPr>
+      </w:pPr>
+      <w:r>
+        <w:rPr>
+          <w:rFonts w:ascii="Consolas" w:eastAsia="Times New Roman" w:hAnsi="Consolas" w:cs="Times New Roman"/>
+          <w:color w:val="D4D4D4"/>
+          <w:sz w:val="21"/>
+          <w:szCs w:val="21"/>
+          <w:lang w:val="en-US"/>
+        </w:rPr>
+        <w:t xml:space="preserve">    </w:t>
+      </w:r>
+      <w:proofErr w:type="spellStart"/>
+      <w:r>
+        <w:rPr>
+          <w:rFonts w:ascii="Consolas" w:eastAsia="Times New Roman" w:hAnsi="Consolas" w:cs="Times New Roman"/>
+          <w:color w:val="9CDCFE"/>
+          <w:sz w:val="21"/>
+          <w:szCs w:val="21"/>
+          <w:lang w:val="en-US"/>
+        </w:rPr>
+        <w:t>target_modules</w:t>
+      </w:r>
+      <w:proofErr w:type="spellEnd"/>
+      <w:r>
+        <w:rPr>
+          <w:rFonts w:ascii="Consolas" w:eastAsia="Times New Roman" w:hAnsi="Consolas" w:cs="Times New Roman"/>
+          <w:color w:val="D4D4D4"/>
+          <w:sz w:val="21"/>
+          <w:szCs w:val="21"/>
+          <w:lang w:val="en-US"/>
+        </w:rPr>
+        <w:t xml:space="preserve"> = [</w:t>
+      </w:r>
+      <w:r>
+        <w:rPr>
+          <w:rFonts w:ascii="Consolas" w:eastAsia="Times New Roman" w:hAnsi="Consolas" w:cs="Times New Roman"/>
+          <w:color w:val="CE9178"/>
+          <w:sz w:val="21"/>
+          <w:szCs w:val="21"/>
+          <w:lang w:val="en-US"/>
+        </w:rPr>
+        <w:t>"</w:t>
+      </w:r>
+      <w:proofErr w:type="spellStart"/>
+      <w:r>
+        <w:rPr>
+          <w:rFonts w:ascii="Consolas" w:eastAsia="Times New Roman" w:hAnsi="Consolas" w:cs="Times New Roman"/>
+          <w:color w:val="CE9178"/>
+          <w:sz w:val="21"/>
+          <w:szCs w:val="21"/>
+          <w:lang w:val="en-US"/>
+        </w:rPr>
+        <w:t>q_proj</w:t>
+      </w:r>
+      <w:proofErr w:type="spellEnd"/>
+      <w:r>
+        <w:rPr>
+          <w:rFonts w:ascii="Consolas" w:eastAsia="Times New Roman" w:hAnsi="Consolas" w:cs="Times New Roman"/>
+          <w:color w:val="CE9178"/>
+          <w:sz w:val="21"/>
+          <w:szCs w:val="21"/>
+          <w:lang w:val="en-US"/>
+        </w:rPr>
+        <w:t>"</w:t>
+      </w:r>
+      <w:r>
+        <w:rPr>
+          <w:rFonts w:ascii="Consolas" w:eastAsia="Times New Roman" w:hAnsi="Consolas" w:cs="Times New Roman"/>
+          <w:color w:val="D4D4D4"/>
+          <w:sz w:val="21"/>
+          <w:szCs w:val="21"/>
+          <w:lang w:val="en-US"/>
+        </w:rPr>
+        <w:t xml:space="preserve">, </w:t>
+      </w:r>
+      <w:r>
+        <w:rPr>
+          <w:rFonts w:ascii="Consolas" w:eastAsia="Times New Roman" w:hAnsi="Consolas" w:cs="Times New Roman"/>
+          <w:color w:val="CE9178"/>
+          <w:sz w:val="21"/>
+          <w:szCs w:val="21"/>
+          <w:lang w:val="en-US"/>
+        </w:rPr>
+        <w:t>"</w:t>
+      </w:r>
+      <w:proofErr w:type="spellStart"/>
+      <w:r>
+        <w:rPr>
+          <w:rFonts w:ascii="Consolas" w:eastAsia="Times New Roman" w:hAnsi="Consolas" w:cs="Times New Roman"/>
+          <w:color w:val="CE9178"/>
+          <w:sz w:val="21"/>
+          <w:szCs w:val="21"/>
+          <w:lang w:val="en-US"/>
+        </w:rPr>
+        <w:t>k_proj</w:t>
+      </w:r>
+      <w:proofErr w:type="spellEnd"/>
+      <w:r>
+        <w:rPr>
+          <w:rFonts w:ascii="Consolas" w:eastAsia="Times New Roman" w:hAnsi="Consolas" w:cs="Times New Roman"/>
+          <w:color w:val="CE9178"/>
+          <w:sz w:val="21"/>
+          <w:szCs w:val="21"/>
+          <w:lang w:val="en-US"/>
+        </w:rPr>
+        <w:t>"</w:t>
+      </w:r>
+      <w:r>
+        <w:rPr>
+          <w:rFonts w:ascii="Consolas" w:eastAsia="Times New Roman" w:hAnsi="Consolas" w:cs="Times New Roman"/>
+          <w:color w:val="D4D4D4"/>
+          <w:sz w:val="21"/>
+          <w:szCs w:val="21"/>
+          <w:lang w:val="en-US"/>
+        </w:rPr>
+        <w:t xml:space="preserve">, </w:t>
+      </w:r>
+      <w:r>
+        <w:rPr>
+          <w:rFonts w:ascii="Consolas" w:eastAsia="Times New Roman" w:hAnsi="Consolas" w:cs="Times New Roman"/>
+          <w:color w:val="CE9178"/>
+          <w:sz w:val="21"/>
+          <w:szCs w:val="21"/>
+          <w:lang w:val="en-US"/>
+        </w:rPr>
+        <w:t>"</w:t>
+      </w:r>
+      <w:proofErr w:type="spellStart"/>
+      <w:r>
+        <w:rPr>
+          <w:rFonts w:ascii="Consolas" w:eastAsia="Times New Roman" w:hAnsi="Consolas" w:cs="Times New Roman"/>
+          <w:color w:val="CE9178"/>
+          <w:sz w:val="21"/>
+          <w:szCs w:val="21"/>
+          <w:lang w:val="en-US"/>
+        </w:rPr>
+        <w:t>v_proj</w:t>
+      </w:r>
+      <w:proofErr w:type="spellEnd"/>
+      <w:r>
+        <w:rPr>
+          <w:rFonts w:ascii="Consolas" w:eastAsia="Times New Roman" w:hAnsi="Consolas" w:cs="Times New Roman"/>
+          <w:color w:val="CE9178"/>
+          <w:sz w:val="21"/>
+          <w:szCs w:val="21"/>
+          <w:lang w:val="en-US"/>
+        </w:rPr>
+        <w:t>"</w:t>
+      </w:r>
+      <w:r>
+        <w:rPr>
+          <w:rFonts w:ascii="Consolas" w:eastAsia="Times New Roman" w:hAnsi="Consolas" w:cs="Times New Roman"/>
+          <w:color w:val="D4D4D4"/>
+          <w:sz w:val="21"/>
+          <w:szCs w:val="21"/>
+          <w:lang w:val="en-US"/>
+        </w:rPr>
+        <w:t xml:space="preserve">, </w:t>
+      </w:r>
+      <w:r>
+        <w:rPr>
+          <w:rFonts w:ascii="Consolas" w:eastAsia="Times New Roman" w:hAnsi="Consolas" w:cs="Times New Roman"/>
+          <w:color w:val="CE9178"/>
+          <w:sz w:val="21"/>
+          <w:szCs w:val="21"/>
+          <w:lang w:val="en-US"/>
+        </w:rPr>
+        <w:t>"</w:t>
+      </w:r>
+      <w:proofErr w:type="spellStart"/>
+      <w:r>
+        <w:rPr>
+          <w:rFonts w:ascii="Consolas" w:eastAsia="Times New Roman" w:hAnsi="Consolas" w:cs="Times New Roman"/>
+          <w:color w:val="CE9178"/>
+          <w:sz w:val="21"/>
+          <w:szCs w:val="21"/>
+          <w:lang w:val="en-US"/>
+        </w:rPr>
+        <w:t>o_proj</w:t>
+      </w:r>
+      <w:proofErr w:type="spellEnd"/>
+      <w:r>
+        <w:rPr>
+          <w:rFonts w:ascii="Consolas" w:eastAsia="Times New Roman" w:hAnsi="Consolas" w:cs="Times New Roman"/>
+          <w:color w:val="CE9178"/>
+          <w:sz w:val="21"/>
+          <w:szCs w:val="21"/>
+          <w:lang w:val="en-US"/>
+        </w:rPr>
+        <w:t>"</w:t>
+      </w:r>
+      <w:r>
+        <w:rPr>
+          <w:rFonts w:ascii="Consolas" w:eastAsia="Times New Roman" w:hAnsi="Consolas" w:cs="Times New Roman"/>
+          <w:color w:val="D4D4D4"/>
+          <w:sz w:val="21"/>
+          <w:szCs w:val="21"/>
+          <w:lang w:val="en-US"/>
+        </w:rPr>
+        <w:t xml:space="preserve">, </w:t>
+      </w:r>
+      <w:r>
+        <w:rPr>
+          <w:rFonts w:ascii="Consolas" w:eastAsia="Times New Roman" w:hAnsi="Consolas" w:cs="Times New Roman"/>
+          <w:color w:val="CE9178"/>
+          <w:sz w:val="21"/>
+          <w:szCs w:val="21"/>
+          <w:lang w:val="en-US"/>
+        </w:rPr>
+        <w:t>"</w:t>
+      </w:r>
+      <w:proofErr w:type="spellStart"/>
+      <w:r>
+        <w:rPr>
+          <w:rFonts w:ascii="Consolas" w:eastAsia="Times New Roman" w:hAnsi="Consolas" w:cs="Times New Roman"/>
+          <w:color w:val="CE9178"/>
+          <w:sz w:val="21"/>
+          <w:szCs w:val="21"/>
+          <w:lang w:val="en-US"/>
+        </w:rPr>
+        <w:t>gate_proj</w:t>
+      </w:r>
+      <w:proofErr w:type="spellEnd"/>
+      <w:r>
+        <w:rPr>
+          <w:rFonts w:ascii="Consolas" w:eastAsia="Times New Roman" w:hAnsi="Consolas" w:cs="Times New Roman"/>
+          <w:color w:val="CE9178"/>
+          <w:sz w:val="21"/>
+          <w:szCs w:val="21"/>
+          <w:lang w:val="en-US"/>
+        </w:rPr>
+        <w:t>"</w:t>
+      </w:r>
+      <w:r>
+        <w:rPr>
+          <w:rFonts w:ascii="Consolas" w:eastAsia="Times New Roman" w:hAnsi="Consolas" w:cs="Times New Roman"/>
+          <w:color w:val="D4D4D4"/>
+          <w:sz w:val="21"/>
+          <w:szCs w:val="21"/>
+          <w:lang w:val="en-US"/>
+        </w:rPr>
+        <w:t xml:space="preserve">, </w:t>
+      </w:r>
+      <w:r>
+        <w:rPr>
+          <w:rFonts w:ascii="Consolas" w:eastAsia="Times New Roman" w:hAnsi="Consolas" w:cs="Times New Roman"/>
+          <w:color w:val="CE9178"/>
+          <w:sz w:val="21"/>
+          <w:szCs w:val="21"/>
+          <w:lang w:val="en-US"/>
+        </w:rPr>
+        <w:t>"</w:t>
+      </w:r>
+      <w:proofErr w:type="spellStart"/>
+      <w:r>
+        <w:rPr>
+          <w:rFonts w:ascii="Consolas" w:eastAsia="Times New Roman" w:hAnsi="Consolas" w:cs="Times New Roman"/>
+          <w:color w:val="CE9178"/>
+          <w:sz w:val="21"/>
+          <w:szCs w:val="21"/>
+          <w:lang w:val="en-US"/>
+        </w:rPr>
+        <w:t>up_proj</w:t>
+      </w:r>
+      <w:proofErr w:type="spellEnd"/>
+      <w:r>
+        <w:rPr>
+          <w:rFonts w:ascii="Consolas" w:eastAsia="Times New Roman" w:hAnsi="Consolas" w:cs="Times New Roman"/>
+          <w:color w:val="CE9178"/>
+          <w:sz w:val="21"/>
+          <w:szCs w:val="21"/>
+          <w:lang w:val="en-US"/>
+        </w:rPr>
+        <w:t>"</w:t>
+      </w:r>
+      <w:r>
+        <w:rPr>
+          <w:rFonts w:ascii="Consolas" w:eastAsia="Times New Roman" w:hAnsi="Consolas" w:cs="Times New Roman"/>
+          <w:color w:val="D4D4D4"/>
+          <w:sz w:val="21"/>
+          <w:szCs w:val="21"/>
+          <w:lang w:val="en-US"/>
+        </w:rPr>
+        <w:t xml:space="preserve">, </w:t>
+      </w:r>
+      <w:r>
+        <w:rPr>
+          <w:rFonts w:ascii="Consolas" w:eastAsia="Times New Roman" w:hAnsi="Consolas" w:cs="Times New Roman"/>
+          <w:color w:val="CE9178"/>
+          <w:sz w:val="21"/>
+          <w:szCs w:val="21"/>
+          <w:lang w:val="en-US"/>
+        </w:rPr>
+        <w:t>"</w:t>
+      </w:r>
+      <w:proofErr w:type="spellStart"/>
+      <w:r>
+        <w:rPr>
+          <w:rFonts w:ascii="Consolas" w:eastAsia="Times New Roman" w:hAnsi="Consolas" w:cs="Times New Roman"/>
+          <w:color w:val="CE9178"/>
+          <w:sz w:val="21"/>
+          <w:szCs w:val="21"/>
+          <w:lang w:val="en-US"/>
+        </w:rPr>
+        <w:t>down_proj</w:t>
+      </w:r>
+      <w:proofErr w:type="spellEnd"/>
+      <w:r>
+        <w:rPr>
+          <w:rFonts w:ascii="Consolas" w:eastAsia="Times New Roman" w:hAnsi="Consolas" w:cs="Times New Roman"/>
+          <w:color w:val="CE9178"/>
+          <w:sz w:val="21"/>
+          <w:szCs w:val="21"/>
+          <w:lang w:val="en-US"/>
+        </w:rPr>
+        <w:t>"</w:t>
+      </w:r>
+      <w:r>
+        <w:rPr>
+          <w:rFonts w:ascii="Consolas" w:eastAsia="Times New Roman" w:hAnsi="Consolas" w:cs="Times New Roman"/>
+          <w:color w:val="D4D4D4"/>
+          <w:sz w:val="21"/>
+          <w:szCs w:val="21"/>
+          <w:lang w:val="en-US"/>
+        </w:rPr>
+        <w:t>],</w:t>
+      </w:r>
+    </w:p>
+    <w:p>
+      <w:pPr>
+        <w:shd w:val="clear" w:color="auto" w:fill="1F1F1F"/>
+        <w:spacing w:line="285" w:lineRule="atLeast"/>
+        <w:rPr>
+          <w:rFonts w:ascii="Consolas" w:eastAsia="Times New Roman" w:hAnsi="Consolas" w:cs="Times New Roman"/>
+          <w:color w:val="CCCCCC"/>
+          <w:sz w:val="21"/>
+          <w:szCs w:val="21"/>
+          <w:lang w:val="en-US"/>
+        </w:rPr>
+      </w:pPr>
+      <w:r>
+        <w:rPr>
+          <w:rFonts w:ascii="Consolas" w:eastAsia="Times New Roman" w:hAnsi="Consolas" w:cs="Times New Roman"/>
+          <w:color w:val="D4D4D4"/>
+          <w:sz w:val="21"/>
+          <w:szCs w:val="21"/>
+          <w:lang w:val="en-US"/>
+        </w:rPr>
+        <w:t xml:space="preserve">    </w:t>
+      </w:r>
+      <w:proofErr w:type="spellStart"/>
+      <w:r>
+        <w:rPr>
+          <w:rFonts w:ascii="Consolas" w:eastAsia="Times New Roman" w:hAnsi="Consolas" w:cs="Times New Roman"/>
+          <w:color w:val="9CDCFE"/>
+          <w:sz w:val="21"/>
+          <w:szCs w:val="21"/>
+          <w:lang w:val="en-US"/>
+        </w:rPr>
+        <w:t>lora_alpha</w:t>
+      </w:r>
+      <w:proofErr w:type="spellEnd"/>
+      <w:r>
+        <w:rPr>
+          <w:rFonts w:ascii="Consolas" w:eastAsia="Times New Roman" w:hAnsi="Consolas" w:cs="Times New Roman"/>
+          <w:color w:val="D4D4D4"/>
+          <w:sz w:val="21"/>
+          <w:szCs w:val="21"/>
+          <w:lang w:val="en-US"/>
+        </w:rPr>
+        <w:t xml:space="preserve"> = </w:t>
+      </w:r>
+      <w:r>
+        <w:rPr>
+          <w:rFonts w:ascii="Consolas" w:eastAsia="Times New Roman" w:hAnsi="Consolas" w:cs="Times New Roman"/>
+          <w:color w:val="B5CEA8"/>
+          <w:sz w:val="21"/>
+          <w:szCs w:val="21"/>
+          <w:lang w:val="en-US"/>
+        </w:rPr>
+        <w:t>16</w:t>
+      </w:r>
+      <w:r>
+        <w:rPr>
+          <w:rFonts w:ascii="Consolas" w:eastAsia="Times New Roman" w:hAnsi="Consolas" w:cs="Times New Roman"/>
+          <w:color w:val="D4D4D4"/>
+          <w:sz w:val="21"/>
+          <w:szCs w:val="21"/>
+          <w:lang w:val="en-US"/>
+        </w:rPr>
+        <w:t>,</w:t>
+      </w:r>
+    </w:p>
+    <w:p>
+      <w:pPr>
+        <w:shd w:val="clear" w:color="auto" w:fill="1F1F1F"/>
+        <w:spacing w:line="285" w:lineRule="atLeast"/>
+        <w:rPr>
+          <w:rFonts w:ascii="Consolas" w:eastAsia="Times New Roman" w:hAnsi="Consolas" w:cs="Times New Roman"/>
+          <w:color w:val="CCCCCC"/>
+          <w:sz w:val="21"/>
+          <w:szCs w:val="21"/>
+          <w:lang w:val="en-US"/>
+        </w:rPr>
+      </w:pPr>
+      <w:r>
+        <w:rPr>
+          <w:rFonts w:ascii="Consolas" w:eastAsia="Times New Roman" w:hAnsi="Consolas" w:cs="Times New Roman"/>
+          <w:color w:val="D4D4D4"/>
+          <w:sz w:val="21"/>
+          <w:szCs w:val="21"/>
+          <w:lang w:val="en-US"/>
+        </w:rPr>
+        <w:t xml:space="preserve">    </w:t>
+      </w:r>
+      <w:proofErr w:type="spellStart"/>
+      <w:r>
+        <w:rPr>
+          <w:rFonts w:ascii="Consolas" w:eastAsia="Times New Roman" w:hAnsi="Consolas" w:cs="Times New Roman"/>
+          <w:color w:val="9CDCFE"/>
+          <w:sz w:val="21"/>
+          <w:szCs w:val="21"/>
+          <w:lang w:val="en-US"/>
+        </w:rPr>
+        <w:t>lora_dropout</w:t>
+      </w:r>
+      <w:proofErr w:type="spellEnd"/>
+      <w:r>
+        <w:rPr>
+          <w:rFonts w:ascii="Consolas" w:eastAsia="Times New Roman" w:hAnsi="Consolas" w:cs="Times New Roman"/>
+          <w:color w:val="D4D4D4"/>
+          <w:sz w:val="21"/>
+          <w:szCs w:val="21"/>
+          <w:lang w:val="en-US"/>
+        </w:rPr>
+        <w:t xml:space="preserve"> = </w:t>
+      </w:r>
+      <w:r>
+        <w:rPr>
+          <w:rFonts w:ascii="Consolas" w:eastAsia="Times New Roman" w:hAnsi="Consolas" w:cs="Times New Roman"/>
+          <w:color w:val="B5CEA8"/>
+          <w:sz w:val="21"/>
+          <w:szCs w:val="21"/>
+          <w:lang w:val="en-US"/>
+        </w:rPr>
+        <w:t>0</w:t>
+      </w:r>
+      <w:r>
+        <w:rPr>
+          <w:rFonts w:ascii="Consolas" w:eastAsia="Times New Roman" w:hAnsi="Consolas" w:cs="Times New Roman"/>
+          <w:color w:val="D4D4D4"/>
+          <w:sz w:val="21"/>
+          <w:szCs w:val="21"/>
+          <w:lang w:val="en-US"/>
+        </w:rPr>
+        <w:t>,</w:t>
+      </w:r>
+    </w:p>
+    <w:p>
+      <w:pPr>
+        <w:shd w:val="clear" w:color="auto" w:fill="1F1F1F"/>
+        <w:spacing w:line="285" w:lineRule="atLeast"/>
+        <w:rPr>
+          <w:rFonts w:ascii="Consolas" w:eastAsia="Times New Roman" w:hAnsi="Consolas" w:cs="Times New Roman"/>
+          <w:color w:val="CCCCCC"/>
+          <w:sz w:val="21"/>
+          <w:szCs w:val="21"/>
+          <w:lang w:val="en-US"/>
+        </w:rPr>
+      </w:pPr>
+      <w:r>
+        <w:rPr>
+          <w:rFonts w:ascii="Consolas" w:eastAsia="Times New Roman" w:hAnsi="Consolas" w:cs="Times New Roman"/>
+          <w:color w:val="D4D4D4"/>
+          <w:sz w:val="21"/>
+          <w:szCs w:val="21"/>
+          <w:lang w:val="en-US"/>
+        </w:rPr>
+        <w:t xml:space="preserve">    </w:t>
+      </w:r>
+      <w:r>
+        <w:rPr>
+          <w:rFonts w:ascii="Consolas" w:eastAsia="Times New Roman" w:hAnsi="Consolas" w:cs="Times New Roman"/>
+          <w:color w:val="9CDCFE"/>
+          <w:sz w:val="21"/>
+          <w:szCs w:val="21"/>
+          <w:lang w:val="en-US"/>
+        </w:rPr>
+        <w:t>bias</w:t>
+      </w:r>
+      <w:r>
+        <w:rPr>
+          <w:rFonts w:ascii="Consolas" w:eastAsia="Times New Roman" w:hAnsi="Consolas" w:cs="Times New Roman"/>
+          <w:color w:val="D4D4D4"/>
+          <w:sz w:val="21"/>
+          <w:szCs w:val="21"/>
+          <w:lang w:val="en-US"/>
+        </w:rPr>
+        <w:t xml:space="preserve"> = </w:t>
+      </w:r>
+      <w:r>
+        <w:rPr>
+          <w:rFonts w:ascii="Consolas" w:eastAsia="Times New Roman" w:hAnsi="Consolas" w:cs="Times New Roman"/>
+          <w:color w:val="CE9178"/>
+          <w:sz w:val="21"/>
+          <w:szCs w:val="21"/>
+          <w:lang w:val="en-US"/>
+        </w:rPr>
+        <w:t>"none"</w:t>
+      </w:r>
+      <w:r>
+        <w:rPr>
+          <w:rFonts w:ascii="Consolas" w:eastAsia="Times New Roman" w:hAnsi="Consolas" w:cs="Times New Roman"/>
+          <w:color w:val="D4D4D4"/>
+          <w:sz w:val="21"/>
+          <w:szCs w:val="21"/>
+          <w:lang w:val="en-US"/>
+        </w:rPr>
+        <w:t>,</w:t>
+      </w:r>
+    </w:p>
+    <w:p>
+      <w:pPr>
+        <w:shd w:val="clear" w:color="auto" w:fill="1F1F1F"/>
+        <w:spacing w:line="285" w:lineRule="atLeast"/>
+        <w:rPr>
+          <w:rFonts w:ascii="Consolas" w:eastAsia="Times New Roman" w:hAnsi="Consolas" w:cs="Times New Roman"/>
+          <w:color w:val="CCCCCC"/>
+          <w:sz w:val="21"/>
+          <w:szCs w:val="21"/>
+          <w:lang w:val="en-US"/>
+        </w:rPr>
+      </w:pPr>
+      <w:r>
+        <w:rPr>
+          <w:rFonts w:ascii="Consolas" w:eastAsia="Times New Roman" w:hAnsi="Consolas" w:cs="Times New Roman"/>
+          <w:color w:val="D4D4D4"/>
+          <w:sz w:val="21"/>
+          <w:szCs w:val="21"/>
+          <w:lang w:val="en-US"/>
+        </w:rPr>
+        <w:t xml:space="preserve">    </w:t>
+      </w:r>
+      <w:proofErr w:type="spellStart"/>
+      <w:r>
+        <w:rPr>
+          <w:rFonts w:ascii="Consolas" w:eastAsia="Times New Roman" w:hAnsi="Consolas" w:cs="Times New Roman"/>
+          <w:color w:val="9CDCFE"/>
+          <w:sz w:val="21"/>
+          <w:szCs w:val="21"/>
+          <w:lang w:val="en-US"/>
+        </w:rPr>
+        <w:t>use_gradient_checkpointing</w:t>
+      </w:r>
+      <w:proofErr w:type="spellEnd"/>
+      <w:r>
+        <w:rPr>
+          <w:rFonts w:ascii="Consolas" w:eastAsia="Times New Roman" w:hAnsi="Consolas" w:cs="Times New Roman"/>
+          <w:color w:val="D4D4D4"/>
+          <w:sz w:val="21"/>
+          <w:szCs w:val="21"/>
+          <w:lang w:val="en-US"/>
+        </w:rPr>
+        <w:t xml:space="preserve"> = </w:t>
+      </w:r>
+      <w:r>
+        <w:rPr>
+          <w:rFonts w:ascii="Consolas" w:eastAsia="Times New Roman" w:hAnsi="Consolas" w:cs="Times New Roman"/>
+          <w:color w:val="CE9178"/>
+          <w:sz w:val="21"/>
+          <w:szCs w:val="21"/>
+          <w:lang w:val="en-US"/>
+        </w:rPr>
+        <w:t>"</w:t>
+      </w:r>
+      <w:proofErr w:type="spellStart"/>
+      <w:r>
+        <w:rPr>
+          <w:rFonts w:ascii="Consolas" w:eastAsia="Times New Roman" w:hAnsi="Consolas" w:cs="Times New Roman"/>
+          <w:color w:val="CE9178"/>
+          <w:sz w:val="21"/>
+          <w:szCs w:val="21"/>
+          <w:lang w:val="en-US"/>
+        </w:rPr>
+        <w:t>unsloth</w:t>
+      </w:r>
+      <w:proofErr w:type="spellEnd"/>
+      <w:r>
+        <w:rPr>
+          <w:rFonts w:ascii="Consolas" w:eastAsia="Times New Roman" w:hAnsi="Consolas" w:cs="Times New Roman"/>
+          <w:color w:val="CE9178"/>
+          <w:sz w:val="21"/>
+          <w:szCs w:val="21"/>
+          <w:lang w:val="en-US"/>
+        </w:rPr>
+        <w:t>"</w:t>
+      </w:r>
+      <w:r>
+        <w:rPr>
+          <w:rFonts w:ascii="Consolas" w:eastAsia="Times New Roman" w:hAnsi="Consolas" w:cs="Times New Roman"/>
+          <w:color w:val="D4D4D4"/>
+          <w:sz w:val="21"/>
+          <w:szCs w:val="21"/>
+          <w:lang w:val="en-US"/>
+        </w:rPr>
+        <w:t>,</w:t>
+      </w:r>
+    </w:p>
+    <w:p>
+      <w:pPr>
+        <w:shd w:val="clear" w:color="auto" w:fill="1F1F1F"/>
+        <w:spacing w:line="285" w:lineRule="atLeast"/>
+        <w:rPr>
+          <w:rFonts w:ascii="Consolas" w:eastAsia="Times New Roman" w:hAnsi="Consolas" w:cs="Times New Roman"/>
+          <w:color w:val="CCCCCC"/>
+          <w:sz w:val="21"/>
+          <w:szCs w:val="21"/>
+          <w:lang w:val="en-US"/>
+        </w:rPr>
+      </w:pPr>
+      <w:r>
+        <w:rPr>
+          <w:rFonts w:ascii="Consolas" w:eastAsia="Times New Roman" w:hAnsi="Consolas" w:cs="Times New Roman"/>
+          <w:color w:val="D4D4D4"/>
+          <w:sz w:val="21"/>
+          <w:szCs w:val="21"/>
+          <w:lang w:val="en-US"/>
+        </w:rPr>
+        <w:t>)</w:t>
+      </w:r>
+    </w:p>
+    <w:p>
+      <w:pPr>
+        <w:rPr>
+          <w:rFonts w:ascii="Times New Roman" w:hAnsi="Times New Roman" w:cs="Times New Roman"/>
+          <w:sz w:val="20"/>
+          <w:szCs w:val="20"/>
+        </w:rPr>
+      </w:pPr>
+    </w:p>
+    <w:p>
+      <w:pPr>
+        <w:rPr>
+          <w:rFonts w:ascii="Times New Roman" w:hAnsi="Times New Roman" w:cs="Times New Roman"/>
+          <w:sz w:val="20"/>
+          <w:szCs w:val="20"/>
+        </w:rPr>
+      </w:pPr>
+      <w:r>
+        <w:rPr>
+          <w:rFonts w:ascii="Times New Roman" w:hAnsi="Times New Roman" w:cs="Times New Roman"/>
+          <w:sz w:val="20"/>
+          <w:szCs w:val="20"/>
+        </w:rPr>
+        <w:t>W celu obsługi długich tekstów zaimplementowano strategię Long Context z wykorzystaniem RoPE Scaling (Liu et al., 2023). W konfiguracji trenera ustawiono parametr max_seq_length = 16384, co w połączeniu z gradient_checkpointing umożliwiło trening na dostępnych zasobach (w Colabie). Dodatkowo, zastosowano technikę "Completion Only LM" (maskowanie promptu użytkownika w funkcji straty), co zmusiło model do uczenia się wyłącznie generowania analizy, a nie reprodukcji długiego tekstu wejściowego, znacząco przyspieszając konwergencję. Model prototypowy osiągnął wynik F1 na poziomie 0.7824 na zbiorze testowym, dowodząc technicznej wykonalności przyjętej koncepcji.</w:t>
+      </w:r>
+    </w:p>
+    <w:p>
+      <w:pPr>
+        <w:rPr>
+          <w:rFonts w:ascii="Times New Roman" w:hAnsi="Times New Roman" w:cs="Times New Roman"/>
+          <w:sz w:val="20"/>
+          <w:szCs w:val="20"/>
+        </w:rPr>
+      </w:pPr>
+      <w:r>
+        <w:rPr>
+          <w:rFonts w:ascii="Times New Roman" w:hAnsi="Times New Roman" w:cs="Times New Roman"/>
+          <w:sz w:val="20"/>
+          <w:szCs w:val="20"/>
+        </w:rPr>
+        <w:t>2.4. Architektura inferencji i konwersja modelu</w:t>
+      </w:r>
+    </w:p>
+    <w:p>
+      <w:pPr>
+        <w:rPr>
+          <w:rFonts w:ascii="Times New Roman" w:hAnsi="Times New Roman" w:cs="Times New Roman"/>
+          <w:sz w:val="20"/>
+          <w:szCs w:val="20"/>
+        </w:rPr>
+      </w:pPr>
+    </w:p>
+    <w:p>
+      <w:pPr>
+        <w:rPr>
+          <w:rFonts w:ascii="Times New Roman" w:hAnsi="Times New Roman" w:cs="Times New Roman"/>
+          <w:sz w:val="20"/>
+          <w:szCs w:val="20"/>
+        </w:rPr>
+      </w:pPr>
+      <w:r>
+        <w:rPr>
+          <w:rFonts w:ascii="Times New Roman" w:hAnsi="Times New Roman" w:cs="Times New Roman"/>
+          <w:sz w:val="20"/>
+          <w:szCs w:val="20"/>
+        </w:rPr>
+        <w:t>Kluczowym wymaganiem projektowym była optymalizacja procesu inferencji, aby umożliwić działanie modelu w środowisku o ograniczonych zasobach, przy jednoczesnym zachowaniu akceptowalnego czasu odpowiedzi.</w:t>
+      </w:r>
+    </w:p>
+    <w:p>
+      <w:pPr>
+        <w:rPr>
+          <w:rFonts w:ascii="Times New Roman" w:hAnsi="Times New Roman" w:cs="Times New Roman"/>
+          <w:sz w:val="20"/>
+          <w:szCs w:val="20"/>
+        </w:rPr>
+      </w:pPr>
+    </w:p>
+    <w:p>
+      <w:pPr>
+        <w:rPr>
+          <w:rFonts w:ascii="Times New Roman" w:hAnsi="Times New Roman" w:cs="Times New Roman"/>
+          <w:sz w:val="20"/>
+          <w:szCs w:val="20"/>
+        </w:rPr>
+      </w:pPr>
+      <w:r>
+        <w:rPr>
+          <w:rFonts w:ascii="Times New Roman" w:hAnsi="Times New Roman" w:cs="Times New Roman"/>
+          <w:sz w:val="20"/>
+          <w:szCs w:val="20"/>
+        </w:rPr>
+        <w:t>Wyzwanie implementacyjne:</w:t>
+      </w:r>
+    </w:p>
+    <w:p>
+      <w:pPr>
+        <w:rPr>
+          <w:rFonts w:ascii="Times New Roman" w:hAnsi="Times New Roman" w:cs="Times New Roman"/>
+          <w:sz w:val="20"/>
+          <w:szCs w:val="20"/>
+        </w:rPr>
+      </w:pPr>
+      <w:r>
+        <w:rPr>
+          <w:rFonts w:ascii="Times New Roman" w:hAnsi="Times New Roman" w:cs="Times New Roman"/>
+          <w:sz w:val="20"/>
+          <w:szCs w:val="20"/>
+        </w:rPr>
+        <w:t>Uruchomienie modelu o długim kontekście (16k tokenów) z zachowaniem interaktywności i precyzji odpowiedzi ustrukturyzowanych (JSON).</w:t>
+      </w:r>
+    </w:p>
+    <w:p>
+      <w:pPr>
+        <w:rPr>
+          <w:rFonts w:ascii="Times New Roman" w:hAnsi="Times New Roman" w:cs="Times New Roman"/>
+          <w:sz w:val="20"/>
+          <w:szCs w:val="20"/>
+        </w:rPr>
+      </w:pPr>
+    </w:p>
+    <w:p>
+      <w:pPr>
+        <w:rPr>
+          <w:rFonts w:ascii="Times New Roman" w:hAnsi="Times New Roman" w:cs="Times New Roman"/>
+          <w:sz w:val="20"/>
+          <w:szCs w:val="20"/>
+        </w:rPr>
+      </w:pPr>
+      <w:r>
+        <w:rPr>
+          <w:rFonts w:ascii="Times New Roman" w:hAnsi="Times New Roman" w:cs="Times New Roman"/>
+          <w:sz w:val="20"/>
+          <w:szCs w:val="20"/>
+        </w:rPr>
+        <w:t>Zastosowane rozwiązanie:</w:t>
+      </w:r>
+    </w:p>
+    <w:p>
+      <w:pPr>
+        <w:rPr>
+          <w:rFonts w:ascii="Times New Roman" w:hAnsi="Times New Roman" w:cs="Times New Roman"/>
+          <w:sz w:val="20"/>
+          <w:szCs w:val="20"/>
+        </w:rPr>
+      </w:pPr>
+      <w:r>
+        <w:rPr>
+          <w:rFonts w:ascii="Times New Roman" w:hAnsi="Times New Roman" w:cs="Times New Roman"/>
+          <w:sz w:val="20"/>
+          <w:szCs w:val="20"/>
+        </w:rPr>
+        <w:t>Zastosowano architekturę Runtime Adapter Loading w serwerze Ollama. Podejście to polega na dynamicznym ładowaniu adaptera LoRA na wysokiej jakości model bazowy (Bielik-4.5B w kwantyzacji 8-bitowej). W pliku konfiguracyjnym Modelfile ustawiono temperaturę generacji na 0.1 oraz zdefiniowano precyzyjny szablon ChatML, co jest kluczowe dla determinizmu zwracanych struktur danych.</w:t>
+      </w:r>
+    </w:p>
+    <w:p>
+      <w:pPr>
+        <w:rPr>
+          <w:rFonts w:ascii="Times New Roman" w:hAnsi="Times New Roman" w:cs="Times New Roman"/>
+          <w:sz w:val="20"/>
+          <w:szCs w:val="20"/>
+        </w:rPr>
+      </w:pPr>
+    </w:p>
+    <w:p>
+      <w:pPr>
+        <w:rPr>
+          <w:rFonts w:ascii="Times New Roman" w:hAnsi="Times New Roman" w:cs="Times New Roman"/>
+          <w:sz w:val="20"/>
+          <w:szCs w:val="20"/>
+        </w:rPr>
+      </w:pPr>
+      <w:r>
+        <w:rPr>
+          <w:rFonts w:ascii="Times New Roman" w:hAnsi="Times New Roman" w:cs="Times New Roman"/>
+          <w:sz w:val="20"/>
+          <w:szCs w:val="20"/>
+        </w:rPr>
+        <w:t>2.5. Implementacja systemu automatycznej ewaluacji (Auto-Benchmark)</w:t>
+      </w:r>
+    </w:p>
+    <w:p>
+      <w:pPr>
+        <w:rPr>
+          <w:rFonts w:ascii="Times New Roman" w:hAnsi="Times New Roman" w:cs="Times New Roman"/>
+          <w:sz w:val="20"/>
+          <w:szCs w:val="20"/>
+        </w:rPr>
+      </w:pPr>
+    </w:p>
+    <w:p>
+      <w:pPr>
+        <w:rPr>
+          <w:rFonts w:ascii="Times New Roman" w:hAnsi="Times New Roman" w:cs="Times New Roman"/>
+          <w:sz w:val="20"/>
+          <w:szCs w:val="20"/>
+        </w:rPr>
+      </w:pPr>
+      <w:r>
+        <w:rPr>
+          <w:rFonts w:ascii="Times New Roman" w:hAnsi="Times New Roman" w:cs="Times New Roman"/>
+          <w:sz w:val="20"/>
+          <w:szCs w:val="20"/>
+        </w:rPr>
         <w:lastRenderedPageBreak/>
-        <w:t>Sercem systemu jest model Bielik-4.5B-Instruct (SpeakLeash Team, 2024). Bezpośrednie użycie modelu bazowego dawało wyniki niesatysfakcjonujące w kontekście specyficznego zadania detekcji manipulacji, co wymusiło proces dostrajania (Fine-Tuning).</w:t>
-      </w:r>
-    </w:p>
-    <w:p>
-      <w:pPr>
-        <w:rPr>
-          <w:rFonts w:ascii="Times New Roman" w:hAnsi="Times New Roman" w:cs="Times New Roman"/>
-          <w:sz w:val="20"/>
-          <w:szCs w:val="20"/>
-        </w:rPr>
-      </w:pPr>
-    </w:p>
-    <w:p>
-      <w:pPr>
-        <w:rPr>
-          <w:rFonts w:ascii="Times New Roman" w:hAnsi="Times New Roman" w:cs="Times New Roman"/>
-          <w:sz w:val="20"/>
-          <w:szCs w:val="20"/>
-        </w:rPr>
-      </w:pPr>
-      <w:r>
-        <w:rPr>
-          <w:rFonts w:ascii="Times New Roman" w:hAnsi="Times New Roman" w:cs="Times New Roman"/>
-          <w:sz w:val="20"/>
-          <w:szCs w:val="20"/>
-        </w:rPr>
-        <w:t>Wyzwanie implementacyjne:</w:t>
-      </w:r>
-    </w:p>
-    <w:p>
-      <w:pPr>
-        <w:rPr>
-          <w:rFonts w:ascii="Times New Roman" w:hAnsi="Times New Roman" w:cs="Times New Roman"/>
-          <w:sz w:val="20"/>
-          <w:szCs w:val="20"/>
-        </w:rPr>
-      </w:pPr>
-      <w:r>
-        <w:rPr>
-          <w:rFonts w:ascii="Times New Roman" w:hAnsi="Times New Roman" w:cs="Times New Roman"/>
-          <w:sz w:val="20"/>
-          <w:szCs w:val="20"/>
-        </w:rPr>
-        <w:t>Standardowy trening modelu o 4.5 miliarda parametrów wymagał optymalizacji pamięciowej oraz obsługi długich tekstów (artykuły z datasetu MIPD często przekraczają standardowe okna kontekstowe).</w:t>
-      </w:r>
-    </w:p>
-    <w:p>
-      <w:pPr>
-        <w:rPr>
-          <w:rFonts w:ascii="Times New Roman" w:hAnsi="Times New Roman" w:cs="Times New Roman"/>
-          <w:sz w:val="20"/>
-          <w:szCs w:val="20"/>
-        </w:rPr>
-      </w:pPr>
-    </w:p>
-    <w:p>
-      <w:pPr>
-        <w:rPr>
-          <w:rFonts w:ascii="Times New Roman" w:hAnsi="Times New Roman" w:cs="Times New Roman"/>
-          <w:sz w:val="20"/>
-          <w:szCs w:val="20"/>
-        </w:rPr>
-      </w:pPr>
-      <w:r>
-        <w:rPr>
-          <w:rFonts w:ascii="Times New Roman" w:hAnsi="Times New Roman" w:cs="Times New Roman"/>
-          <w:sz w:val="20"/>
-          <w:szCs w:val="20"/>
-        </w:rPr>
-        <w:t>Zastosowane rozwiązanie:</w:t>
-      </w:r>
-    </w:p>
-    <w:p>
-      <w:pPr>
-        <w:rPr>
-          <w:rFonts w:ascii="Times New Roman" w:hAnsi="Times New Roman" w:cs="Times New Roman"/>
-          <w:sz w:val="20"/>
-          <w:szCs w:val="20"/>
-        </w:rPr>
-      </w:pPr>
-      <w:r>
-        <w:rPr>
-          <w:rFonts w:ascii="Times New Roman" w:hAnsi="Times New Roman" w:cs="Times New Roman"/>
-          <w:sz w:val="20"/>
-          <w:szCs w:val="20"/>
-        </w:rPr>
-        <w:t>Zastosowano technikę QLoRA (Dettmers et al., 2023) z wykorzystaniem biblioteki Unsloth. Pozwoliło to na zamrożenie głównych wag modelu (zapisanych w formacie 4-bitowym NF4) i trenowanie jedynie niewielkich macierzy adapterów (Hu et al., 2021).</w:t>
-      </w:r>
-    </w:p>
-    <w:p>
-      <w:pPr>
-        <w:rPr>
-          <w:rFonts w:ascii="Times New Roman" w:hAnsi="Times New Roman" w:cs="Times New Roman"/>
-          <w:sz w:val="20"/>
-          <w:szCs w:val="20"/>
-        </w:rPr>
-      </w:pPr>
-    </w:p>
-    <w:p>
-      <w:pPr>
-        <w:rPr>
-          <w:rFonts w:ascii="Times New Roman" w:hAnsi="Times New Roman" w:cs="Times New Roman"/>
-          <w:sz w:val="20"/>
-          <w:szCs w:val="20"/>
-        </w:rPr>
-      </w:pPr>
-      <w:r>
-        <w:rPr>
-          <w:rFonts w:ascii="Times New Roman" w:hAnsi="Times New Roman" w:cs="Times New Roman"/>
-          <w:sz w:val="20"/>
-          <w:szCs w:val="20"/>
-        </w:rPr>
-        <w:t>W celu obsługi długich tekstów zaimplementowano strategię Long Context z wykorzystaniem RoPE Scaling (Liu et al., 2023). W konfiguracji trenera ustawiono parametr max_seq_length = 16384, co w połączeniu z gradient_checkpointing umożliwiło trening na dostępnych zasobach (w Colabie). Dodatkowo, zastosowano technikę "Completion Only LM" (maskowanie promptu użytkownika w funkcji straty), co zmusiło model do uczenia się wyłącznie generowania analizy, a nie reprodukcji długiego tekstu wejściowego, znacząco przyspieszając konwergencję. Model prototypowy osiągnął wynik F1 na poziomie 0.7824 na zbiorze testowym, dowodząc technicznej wykonalności przyjętej koncepcji.</w:t>
-      </w:r>
-    </w:p>
-    <w:p>
-      <w:pPr>
-        <w:rPr>
-          <w:rFonts w:ascii="Times New Roman" w:hAnsi="Times New Roman" w:cs="Times New Roman"/>
-          <w:sz w:val="20"/>
-          <w:szCs w:val="20"/>
-        </w:rPr>
-      </w:pPr>
-      <w:r>
-        <w:rPr>
-          <w:rFonts w:ascii="Times New Roman" w:hAnsi="Times New Roman" w:cs="Times New Roman"/>
-          <w:sz w:val="20"/>
-          <w:szCs w:val="20"/>
-        </w:rPr>
-        <w:t>2.4. Architektura inferencji i konwersja modelu</w:t>
-      </w:r>
-    </w:p>
-    <w:p>
-      <w:pPr>
-        <w:rPr>
-          <w:rFonts w:ascii="Times New Roman" w:hAnsi="Times New Roman" w:cs="Times New Roman"/>
-          <w:sz w:val="20"/>
-          <w:szCs w:val="20"/>
-        </w:rPr>
-      </w:pPr>
-    </w:p>
-    <w:p>
-      <w:pPr>
-        <w:rPr>
-          <w:rFonts w:ascii="Times New Roman" w:hAnsi="Times New Roman" w:cs="Times New Roman"/>
-          <w:sz w:val="20"/>
-          <w:szCs w:val="20"/>
-        </w:rPr>
-      </w:pPr>
-      <w:r>
-        <w:rPr>
-          <w:rFonts w:ascii="Times New Roman" w:hAnsi="Times New Roman" w:cs="Times New Roman"/>
-          <w:sz w:val="20"/>
-          <w:szCs w:val="20"/>
-        </w:rPr>
-        <w:t>Kluczowym wymaganiem projektowym była optymalizacja procesu inferencji, aby umożliwić działanie modelu w środowisku o ograniczonych zasobach, przy jednoczesnym zachowaniu akceptowalnego czasu odpowiedzi.</w:t>
-      </w:r>
-    </w:p>
-    <w:p>
-      <w:pPr>
-        <w:rPr>
-          <w:rFonts w:ascii="Times New Roman" w:hAnsi="Times New Roman" w:cs="Times New Roman"/>
-          <w:sz w:val="20"/>
-          <w:szCs w:val="20"/>
-        </w:rPr>
-      </w:pPr>
-    </w:p>
-    <w:p>
-      <w:pPr>
-        <w:rPr>
-          <w:rFonts w:ascii="Times New Roman" w:hAnsi="Times New Roman" w:cs="Times New Roman"/>
-          <w:sz w:val="20"/>
-          <w:szCs w:val="20"/>
-        </w:rPr>
-      </w:pPr>
-      <w:r>
-        <w:rPr>
-          <w:rFonts w:ascii="Times New Roman" w:hAnsi="Times New Roman" w:cs="Times New Roman"/>
-          <w:sz w:val="20"/>
-          <w:szCs w:val="20"/>
-        </w:rPr>
-        <w:t>Wyzwanie implementacyjne:</w:t>
-      </w:r>
-    </w:p>
-    <w:p>
-      <w:pPr>
-        <w:rPr>
-          <w:rFonts w:ascii="Times New Roman" w:hAnsi="Times New Roman" w:cs="Times New Roman"/>
-          <w:sz w:val="20"/>
-          <w:szCs w:val="20"/>
-        </w:rPr>
-      </w:pPr>
-      <w:r>
-        <w:rPr>
-          <w:rFonts w:ascii="Times New Roman" w:hAnsi="Times New Roman" w:cs="Times New Roman"/>
-          <w:sz w:val="20"/>
-          <w:szCs w:val="20"/>
-        </w:rPr>
-        <w:t>Uruchomienie modelu o długim kontekście (16k tokenów) z zachowaniem interaktywności i precyzji odpowiedzi ustrukturyzowanych (JSON).</w:t>
-      </w:r>
-    </w:p>
-    <w:p>
-      <w:pPr>
-        <w:rPr>
-          <w:rFonts w:ascii="Times New Roman" w:hAnsi="Times New Roman" w:cs="Times New Roman"/>
-          <w:sz w:val="20"/>
-          <w:szCs w:val="20"/>
-        </w:rPr>
-      </w:pPr>
-    </w:p>
-    <w:p>
-      <w:pPr>
-        <w:rPr>
-          <w:rFonts w:ascii="Times New Roman" w:hAnsi="Times New Roman" w:cs="Times New Roman"/>
-          <w:sz w:val="20"/>
-          <w:szCs w:val="20"/>
-        </w:rPr>
-      </w:pPr>
-      <w:r>
-        <w:rPr>
-          <w:rFonts w:ascii="Times New Roman" w:hAnsi="Times New Roman" w:cs="Times New Roman"/>
-          <w:sz w:val="20"/>
-          <w:szCs w:val="20"/>
-        </w:rPr>
-        <w:t>Zastosowane rozwiązanie:</w:t>
-      </w:r>
-    </w:p>
-    <w:p>
-      <w:pPr>
-        <w:rPr>
-          <w:rFonts w:ascii="Times New Roman" w:hAnsi="Times New Roman" w:cs="Times New Roman"/>
-          <w:sz w:val="20"/>
-          <w:szCs w:val="20"/>
-        </w:rPr>
-      </w:pPr>
-      <w:r>
-        <w:rPr>
-          <w:rFonts w:ascii="Times New Roman" w:hAnsi="Times New Roman" w:cs="Times New Roman"/>
-          <w:sz w:val="20"/>
-          <w:szCs w:val="20"/>
-        </w:rPr>
-        <w:t>Zastosowano architekturę Runtime Adapter Loading w serwerze Ollama. Podejście to polega na dynamicznym ładowaniu adaptera LoRA na wysokiej jakości model bazowy (Bielik-4.5B w kwantyzacji 8-bitowej). W pliku konfiguracyjnym Modelfile ustawiono temperaturę generacji na 0.1 oraz zdefiniowano precyzyjny szablon ChatML, co jest kluczowe dla determinizmu zwracanych struktur danych.</w:t>
-      </w:r>
-    </w:p>
-    <w:p>
-      <w:pPr>
-        <w:rPr>
-          <w:rFonts w:ascii="Times New Roman" w:hAnsi="Times New Roman" w:cs="Times New Roman"/>
-          <w:sz w:val="20"/>
-          <w:szCs w:val="20"/>
-        </w:rPr>
-      </w:pPr>
-    </w:p>
-    <w:p>
-      <w:pPr>
-        <w:rPr>
-          <w:rFonts w:ascii="Times New Roman" w:hAnsi="Times New Roman" w:cs="Times New Roman"/>
-          <w:sz w:val="20"/>
-          <w:szCs w:val="20"/>
-        </w:rPr>
-      </w:pPr>
-      <w:r>
-        <w:rPr>
-          <w:rFonts w:ascii="Times New Roman" w:hAnsi="Times New Roman" w:cs="Times New Roman"/>
-          <w:sz w:val="20"/>
-          <w:szCs w:val="20"/>
-        </w:rPr>
-        <w:t>2.5. Implementacja systemu automatycznej ewaluacji (Auto-Benchmark)</w:t>
-      </w:r>
-    </w:p>
-    <w:p>
-      <w:pPr>
-        <w:rPr>
-          <w:rFonts w:ascii="Times New Roman" w:hAnsi="Times New Roman" w:cs="Times New Roman"/>
-          <w:sz w:val="20"/>
-          <w:szCs w:val="20"/>
-        </w:rPr>
-      </w:pPr>
-    </w:p>
-    <w:p>
-      <w:pPr>
-        <w:rPr>
-          <w:rFonts w:ascii="Times New Roman" w:hAnsi="Times New Roman" w:cs="Times New Roman"/>
-          <w:sz w:val="20"/>
-          <w:szCs w:val="20"/>
-        </w:rPr>
-      </w:pPr>
-      <w:r>
-        <w:rPr>
-          <w:rFonts w:ascii="Times New Roman" w:hAnsi="Times New Roman" w:cs="Times New Roman"/>
-          <w:sz w:val="20"/>
-          <w:szCs w:val="20"/>
-        </w:rPr>
         <w:t>W projektach opartych na LLM, gdzie wyjście jest tekstem strukturalnym (JSON), standardowe metryki (jak accuracy) są niewystarczające. Zaimplementowano autorski system ewaluacji (`benchmark.py`), który analizuje odpowiedzi modelu na wydzielonym zbiorze testowym w trzech wymiarach:</w:t>
       </w:r>
     </w:p>
@@ -3218,66 +4212,645 @@
           <w:sz w:val="20"/>
           <w:szCs w:val="20"/>
         </w:rPr>
-        <w:t>1. Backendu Orkiestracyjnego: Serwisu w Pythonie, który monitoruje przyrost danych i zarządza procesami w tle.</w:t>
-      </w:r>
-    </w:p>
-    <w:p>
-      <w:pPr>
-        <w:rPr>
-          <w:rFonts w:ascii="Times New Roman" w:hAnsi="Times New Roman" w:cs="Times New Roman"/>
-          <w:sz w:val="20"/>
-          <w:szCs w:val="20"/>
-        </w:rPr>
-      </w:pPr>
-      <w:r>
-        <w:rPr>
-          <w:rFonts w:ascii="Times New Roman" w:hAnsi="Times New Roman" w:cs="Times New Roman"/>
-          <w:sz w:val="20"/>
-          <w:szCs w:val="20"/>
-        </w:rPr>
-        <w:t>2. Automatyzacji Treningu (Trigger &amp; Retraining): Mechanizmu, który po zebraniu odpowiedniej liczby nowych próbek automatycznie uruchamia proces douczania, wykorzystując techniki zapobiegające "katastrofalnemu zapominaniu" (Replay Buffer).</w:t>
-      </w:r>
-    </w:p>
-    <w:p>
-      <w:pPr>
-        <w:rPr>
-          <w:rFonts w:ascii="Times New Roman" w:hAnsi="Times New Roman" w:cs="Times New Roman"/>
-          <w:sz w:val="20"/>
-          <w:szCs w:val="20"/>
-        </w:rPr>
-      </w:pPr>
-      <w:r>
-        <w:rPr>
-          <w:rFonts w:ascii="Times New Roman" w:hAnsi="Times New Roman" w:cs="Times New Roman"/>
-          <w:sz w:val="20"/>
-          <w:szCs w:val="20"/>
-        </w:rPr>
-        <w:t>3. Automatycznego Wdrożenia (Hot-Swap): Logiki decyzyjnej, która na podstawie wyników benchmarku automatycznie podmienia model na produkcji (bez przerywania dostępności usługi), tylko jeśli nowa wersja osiąga lepsze wyniki F1.</w:t>
-      </w:r>
-    </w:p>
-    <w:p>
-      <w:pPr>
-        <w:rPr>
-          <w:rFonts w:ascii="Times New Roman" w:hAnsi="Times New Roman" w:cs="Times New Roman"/>
-          <w:sz w:val="20"/>
-          <w:szCs w:val="20"/>
-        </w:rPr>
-      </w:pPr>
-    </w:p>
-    <w:p>
-      <w:pPr>
-        <w:rPr>
-          <w:rFonts w:ascii="Times New Roman" w:hAnsi="Times New Roman" w:cs="Times New Roman"/>
-          <w:sz w:val="20"/>
-          <w:szCs w:val="20"/>
-        </w:rPr>
-      </w:pPr>
-      <w:r>
-        <w:rPr>
-          <w:rFonts w:ascii="Times New Roman" w:hAnsi="Times New Roman" w:cs="Times New Roman"/>
-          <w:sz w:val="20"/>
-          <w:szCs w:val="20"/>
-        </w:rPr>
+        <w:t>1. Backendu Orkiestracyjnego: Serwisu w Pythonie, który monitoruje przyrost danych i zarządza procesami w tle. Wykorzystuje on środowisko WSL (Windows Subsystem for Linux) jako warstwę izolacji obliczeniowej (`orchestrator.py`):</w:t>
+      </w:r>
+    </w:p>
+    <w:p>
+      <w:pPr>
+        <w:shd w:val="clear" w:color="auto" w:fill="1F1F1F"/>
+        <w:spacing w:line="285" w:lineRule="atLeast"/>
+        <w:rPr>
+          <w:rFonts w:ascii="Consolas" w:eastAsia="Times New Roman" w:hAnsi="Consolas" w:cs="Times New Roman"/>
+          <w:color w:val="CCCCCC"/>
+          <w:sz w:val="21"/>
+          <w:szCs w:val="21"/>
+        </w:rPr>
+      </w:pPr>
+      <w:r>
+        <w:rPr>
+          <w:rFonts w:ascii="Consolas" w:eastAsia="Times New Roman" w:hAnsi="Consolas" w:cs="Times New Roman"/>
+          <w:color w:val="6A9955"/>
+          <w:sz w:val="21"/>
+          <w:szCs w:val="21"/>
+        </w:rPr>
+        <w:t># Inicjalizacja treningu w wyizolowanym kontenerze WSL</w:t>
+      </w:r>
+    </w:p>
+    <w:p>
+      <w:pPr>
+        <w:shd w:val="clear" w:color="auto" w:fill="1F1F1F"/>
+        <w:spacing w:line="285" w:lineRule="atLeast"/>
+        <w:rPr>
+          <w:rFonts w:ascii="Consolas" w:eastAsia="Times New Roman" w:hAnsi="Consolas" w:cs="Times New Roman"/>
+          <w:color w:val="CCCCCC"/>
+          <w:sz w:val="21"/>
+          <w:szCs w:val="21"/>
+          <w:lang w:val="en-US"/>
+        </w:rPr>
+      </w:pPr>
+      <w:proofErr w:type="spellStart"/>
+      <w:r>
+        <w:rPr>
+          <w:rFonts w:ascii="Consolas" w:eastAsia="Times New Roman" w:hAnsi="Consolas" w:cs="Times New Roman"/>
+          <w:color w:val="D4D4D4"/>
+          <w:sz w:val="21"/>
+          <w:szCs w:val="21"/>
+          <w:lang w:val="en-US"/>
+        </w:rPr>
+        <w:t>cmd</w:t>
+      </w:r>
+      <w:proofErr w:type="spellEnd"/>
+      <w:r>
+        <w:rPr>
+          <w:rFonts w:ascii="Consolas" w:eastAsia="Times New Roman" w:hAnsi="Consolas" w:cs="Times New Roman"/>
+          <w:color w:val="D4D4D4"/>
+          <w:sz w:val="21"/>
+          <w:szCs w:val="21"/>
+          <w:lang w:val="en-US"/>
+        </w:rPr>
+        <w:t xml:space="preserve"> = </w:t>
+      </w:r>
+      <w:proofErr w:type="spellStart"/>
+      <w:r>
+        <w:rPr>
+          <w:rFonts w:ascii="Consolas" w:eastAsia="Times New Roman" w:hAnsi="Consolas" w:cs="Times New Roman"/>
+          <w:color w:val="569CD6"/>
+          <w:sz w:val="21"/>
+          <w:szCs w:val="21"/>
+          <w:lang w:val="en-US"/>
+        </w:rPr>
+        <w:t>f</w:t>
+      </w:r>
+      <w:r>
+        <w:rPr>
+          <w:rFonts w:ascii="Consolas" w:eastAsia="Times New Roman" w:hAnsi="Consolas" w:cs="Times New Roman"/>
+          <w:color w:val="CE9178"/>
+          <w:sz w:val="21"/>
+          <w:szCs w:val="21"/>
+          <w:lang w:val="en-US"/>
+        </w:rPr>
+        <w:t>"wsl</w:t>
+      </w:r>
+      <w:proofErr w:type="spellEnd"/>
+      <w:r>
+        <w:rPr>
+          <w:rFonts w:ascii="Consolas" w:eastAsia="Times New Roman" w:hAnsi="Consolas" w:cs="Times New Roman"/>
+          <w:color w:val="CE9178"/>
+          <w:sz w:val="21"/>
+          <w:szCs w:val="21"/>
+          <w:lang w:val="en-US"/>
+        </w:rPr>
+        <w:t xml:space="preserve"> --exec python3 -u -m </w:t>
+      </w:r>
+      <w:proofErr w:type="spellStart"/>
+      <w:proofErr w:type="gramStart"/>
+      <w:r>
+        <w:rPr>
+          <w:rFonts w:ascii="Consolas" w:eastAsia="Times New Roman" w:hAnsi="Consolas" w:cs="Times New Roman"/>
+          <w:color w:val="CE9178"/>
+          <w:sz w:val="21"/>
+          <w:szCs w:val="21"/>
+          <w:lang w:val="en-US"/>
+        </w:rPr>
+        <w:t>app.training</w:t>
+      </w:r>
+      <w:proofErr w:type="gramEnd"/>
+      <w:r>
+        <w:rPr>
+          <w:rFonts w:ascii="Consolas" w:eastAsia="Times New Roman" w:hAnsi="Consolas" w:cs="Times New Roman"/>
+          <w:color w:val="CE9178"/>
+          <w:sz w:val="21"/>
+          <w:szCs w:val="21"/>
+          <w:lang w:val="en-US"/>
+        </w:rPr>
+        <w:t>.trainer</w:t>
+      </w:r>
+      <w:proofErr w:type="spellEnd"/>
+      <w:r>
+        <w:rPr>
+          <w:rFonts w:ascii="Consolas" w:eastAsia="Times New Roman" w:hAnsi="Consolas" w:cs="Times New Roman"/>
+          <w:color w:val="CE9178"/>
+          <w:sz w:val="21"/>
+          <w:szCs w:val="21"/>
+          <w:lang w:val="en-US"/>
+        </w:rPr>
+        <w:t xml:space="preserve"> --data </w:t>
+      </w:r>
+      <w:r>
+        <w:rPr>
+          <w:rFonts w:ascii="Consolas" w:eastAsia="Times New Roman" w:hAnsi="Consolas" w:cs="Times New Roman"/>
+          <w:color w:val="569CD6"/>
+          <w:sz w:val="21"/>
+          <w:szCs w:val="21"/>
+          <w:lang w:val="en-US"/>
+        </w:rPr>
+        <w:t>{</w:t>
+      </w:r>
+      <w:proofErr w:type="spellStart"/>
+      <w:r>
+        <w:rPr>
+          <w:rFonts w:ascii="Consolas" w:eastAsia="Times New Roman" w:hAnsi="Consolas" w:cs="Times New Roman"/>
+          <w:color w:val="D4D4D4"/>
+          <w:sz w:val="21"/>
+          <w:szCs w:val="21"/>
+          <w:lang w:val="en-US"/>
+        </w:rPr>
+        <w:t>wsl_path</w:t>
+      </w:r>
+      <w:proofErr w:type="spellEnd"/>
+      <w:r>
+        <w:rPr>
+          <w:rFonts w:ascii="Consolas" w:eastAsia="Times New Roman" w:hAnsi="Consolas" w:cs="Times New Roman"/>
+          <w:color w:val="569CD6"/>
+          <w:sz w:val="21"/>
+          <w:szCs w:val="21"/>
+          <w:lang w:val="en-US"/>
+        </w:rPr>
+        <w:t>}</w:t>
+      </w:r>
+      <w:r>
+        <w:rPr>
+          <w:rFonts w:ascii="Consolas" w:eastAsia="Times New Roman" w:hAnsi="Consolas" w:cs="Times New Roman"/>
+          <w:color w:val="CE9178"/>
+          <w:sz w:val="21"/>
+          <w:szCs w:val="21"/>
+          <w:lang w:val="en-US"/>
+        </w:rPr>
+        <w:t xml:space="preserve"> --</w:t>
+      </w:r>
+      <w:proofErr w:type="gramStart"/>
+      <w:r>
+        <w:rPr>
+          <w:rFonts w:ascii="Consolas" w:eastAsia="Times New Roman" w:hAnsi="Consolas" w:cs="Times New Roman"/>
+          <w:color w:val="CE9178"/>
+          <w:sz w:val="21"/>
+          <w:szCs w:val="21"/>
+          <w:lang w:val="en-US"/>
+        </w:rPr>
+        <w:t>output .</w:t>
+      </w:r>
+      <w:proofErr w:type="gramEnd"/>
+      <w:r>
+        <w:rPr>
+          <w:rFonts w:ascii="Consolas" w:eastAsia="Times New Roman" w:hAnsi="Consolas" w:cs="Times New Roman"/>
+          <w:color w:val="CE9178"/>
+          <w:sz w:val="21"/>
+          <w:szCs w:val="21"/>
+          <w:lang w:val="en-US"/>
+        </w:rPr>
+        <w:t xml:space="preserve">/model/latest --base </w:t>
+      </w:r>
+      <w:r>
+        <w:rPr>
+          <w:rFonts w:ascii="Consolas" w:eastAsia="Times New Roman" w:hAnsi="Consolas" w:cs="Times New Roman"/>
+          <w:color w:val="569CD6"/>
+          <w:sz w:val="21"/>
+          <w:szCs w:val="21"/>
+          <w:lang w:val="en-US"/>
+        </w:rPr>
+        <w:t>{</w:t>
+      </w:r>
+      <w:proofErr w:type="spellStart"/>
+      <w:r>
+        <w:rPr>
+          <w:rFonts w:ascii="Consolas" w:eastAsia="Times New Roman" w:hAnsi="Consolas" w:cs="Times New Roman"/>
+          <w:color w:val="D4D4D4"/>
+          <w:sz w:val="21"/>
+          <w:szCs w:val="21"/>
+          <w:lang w:val="en-US"/>
+        </w:rPr>
+        <w:t>base_model_wsl</w:t>
+      </w:r>
+      <w:proofErr w:type="spellEnd"/>
+      <w:r>
+        <w:rPr>
+          <w:rFonts w:ascii="Consolas" w:eastAsia="Times New Roman" w:hAnsi="Consolas" w:cs="Times New Roman"/>
+          <w:color w:val="569CD6"/>
+          <w:sz w:val="21"/>
+          <w:szCs w:val="21"/>
+          <w:lang w:val="en-US"/>
+        </w:rPr>
+        <w:t>}</w:t>
+      </w:r>
+      <w:r>
+        <w:rPr>
+          <w:rFonts w:ascii="Consolas" w:eastAsia="Times New Roman" w:hAnsi="Consolas" w:cs="Times New Roman"/>
+          <w:color w:val="CE9178"/>
+          <w:sz w:val="21"/>
+          <w:szCs w:val="21"/>
+          <w:lang w:val="en-US"/>
+        </w:rPr>
+        <w:t>"</w:t>
+      </w:r>
+    </w:p>
+    <w:p>
+      <w:pPr>
+        <w:shd w:val="clear" w:color="auto" w:fill="1F1F1F"/>
+        <w:spacing w:line="285" w:lineRule="atLeast"/>
+        <w:rPr>
+          <w:rFonts w:ascii="Consolas" w:eastAsia="Times New Roman" w:hAnsi="Consolas" w:cs="Times New Roman"/>
+          <w:color w:val="CCCCCC"/>
+          <w:sz w:val="21"/>
+          <w:szCs w:val="21"/>
+          <w:lang w:val="en-US"/>
+        </w:rPr>
+      </w:pPr>
+      <w:r>
+        <w:rPr>
+          <w:rFonts w:ascii="Consolas" w:eastAsia="Times New Roman" w:hAnsi="Consolas" w:cs="Times New Roman"/>
+          <w:color w:val="D4D4D4"/>
+          <w:sz w:val="21"/>
+          <w:szCs w:val="21"/>
+          <w:lang w:val="en-US"/>
+        </w:rPr>
+        <w:t xml:space="preserve">process = </w:t>
+      </w:r>
+      <w:proofErr w:type="spellStart"/>
+      <w:proofErr w:type="gramStart"/>
+      <w:r>
+        <w:rPr>
+          <w:rFonts w:ascii="Consolas" w:eastAsia="Times New Roman" w:hAnsi="Consolas" w:cs="Times New Roman"/>
+          <w:color w:val="D4D4D4"/>
+          <w:sz w:val="21"/>
+          <w:szCs w:val="21"/>
+          <w:lang w:val="en-US"/>
+        </w:rPr>
+        <w:t>subprocess.Popen</w:t>
+      </w:r>
+      <w:proofErr w:type="spellEnd"/>
+      <w:proofErr w:type="gramEnd"/>
+      <w:r>
+        <w:rPr>
+          <w:rFonts w:ascii="Consolas" w:eastAsia="Times New Roman" w:hAnsi="Consolas" w:cs="Times New Roman"/>
+          <w:color w:val="D4D4D4"/>
+          <w:sz w:val="21"/>
+          <w:szCs w:val="21"/>
+          <w:lang w:val="en-US"/>
+        </w:rPr>
+        <w:t>(</w:t>
+      </w:r>
+      <w:proofErr w:type="spellStart"/>
+      <w:r>
+        <w:rPr>
+          <w:rFonts w:ascii="Consolas" w:eastAsia="Times New Roman" w:hAnsi="Consolas" w:cs="Times New Roman"/>
+          <w:color w:val="D4D4D4"/>
+          <w:sz w:val="21"/>
+          <w:szCs w:val="21"/>
+          <w:lang w:val="en-US"/>
+        </w:rPr>
+        <w:t>cmd</w:t>
+      </w:r>
+      <w:proofErr w:type="spellEnd"/>
+      <w:r>
+        <w:rPr>
+          <w:rFonts w:ascii="Consolas" w:eastAsia="Times New Roman" w:hAnsi="Consolas" w:cs="Times New Roman"/>
+          <w:color w:val="D4D4D4"/>
+          <w:sz w:val="21"/>
+          <w:szCs w:val="21"/>
+          <w:lang w:val="en-US"/>
+        </w:rPr>
+        <w:t xml:space="preserve">, </w:t>
+      </w:r>
+      <w:r>
+        <w:rPr>
+          <w:rFonts w:ascii="Consolas" w:eastAsia="Times New Roman" w:hAnsi="Consolas" w:cs="Times New Roman"/>
+          <w:color w:val="9CDCFE"/>
+          <w:sz w:val="21"/>
+          <w:szCs w:val="21"/>
+          <w:lang w:val="en-US"/>
+        </w:rPr>
+        <w:t>shell</w:t>
+      </w:r>
+      <w:r>
+        <w:rPr>
+          <w:rFonts w:ascii="Consolas" w:eastAsia="Times New Roman" w:hAnsi="Consolas" w:cs="Times New Roman"/>
+          <w:color w:val="D4D4D4"/>
+          <w:sz w:val="21"/>
+          <w:szCs w:val="21"/>
+          <w:lang w:val="en-US"/>
+        </w:rPr>
+        <w:t>=</w:t>
+      </w:r>
+      <w:r>
+        <w:rPr>
+          <w:rFonts w:ascii="Consolas" w:eastAsia="Times New Roman" w:hAnsi="Consolas" w:cs="Times New Roman"/>
+          <w:color w:val="569CD6"/>
+          <w:sz w:val="21"/>
+          <w:szCs w:val="21"/>
+          <w:lang w:val="en-US"/>
+        </w:rPr>
+        <w:t>True</w:t>
+      </w:r>
+      <w:r>
+        <w:rPr>
+          <w:rFonts w:ascii="Consolas" w:eastAsia="Times New Roman" w:hAnsi="Consolas" w:cs="Times New Roman"/>
+          <w:color w:val="D4D4D4"/>
+          <w:sz w:val="21"/>
+          <w:szCs w:val="21"/>
+          <w:lang w:val="en-US"/>
+        </w:rPr>
+        <w:t xml:space="preserve">, </w:t>
+      </w:r>
+      <w:proofErr w:type="spellStart"/>
+      <w:r>
+        <w:rPr>
+          <w:rFonts w:ascii="Consolas" w:eastAsia="Times New Roman" w:hAnsi="Consolas" w:cs="Times New Roman"/>
+          <w:color w:val="9CDCFE"/>
+          <w:sz w:val="21"/>
+          <w:szCs w:val="21"/>
+          <w:lang w:val="en-US"/>
+        </w:rPr>
+        <w:t>stdout</w:t>
+      </w:r>
+      <w:proofErr w:type="spellEnd"/>
+      <w:r>
+        <w:rPr>
+          <w:rFonts w:ascii="Consolas" w:eastAsia="Times New Roman" w:hAnsi="Consolas" w:cs="Times New Roman"/>
+          <w:color w:val="D4D4D4"/>
+          <w:sz w:val="21"/>
+          <w:szCs w:val="21"/>
+          <w:lang w:val="en-US"/>
+        </w:rPr>
+        <w:t>=</w:t>
+      </w:r>
+      <w:proofErr w:type="spellStart"/>
+      <w:r>
+        <w:rPr>
+          <w:rFonts w:ascii="Consolas" w:eastAsia="Times New Roman" w:hAnsi="Consolas" w:cs="Times New Roman"/>
+          <w:color w:val="D4D4D4"/>
+          <w:sz w:val="21"/>
+          <w:szCs w:val="21"/>
+          <w:lang w:val="en-US"/>
+        </w:rPr>
+        <w:t>f_log</w:t>
+      </w:r>
+      <w:proofErr w:type="spellEnd"/>
+      <w:r>
+        <w:rPr>
+          <w:rFonts w:ascii="Consolas" w:eastAsia="Times New Roman" w:hAnsi="Consolas" w:cs="Times New Roman"/>
+          <w:color w:val="D4D4D4"/>
+          <w:sz w:val="21"/>
+          <w:szCs w:val="21"/>
+          <w:lang w:val="en-US"/>
+        </w:rPr>
+        <w:t xml:space="preserve">, </w:t>
+      </w:r>
+      <w:r>
+        <w:rPr>
+          <w:rFonts w:ascii="Consolas" w:eastAsia="Times New Roman" w:hAnsi="Consolas" w:cs="Times New Roman"/>
+          <w:color w:val="9CDCFE"/>
+          <w:sz w:val="21"/>
+          <w:szCs w:val="21"/>
+          <w:lang w:val="en-US"/>
+        </w:rPr>
+        <w:t>stderr</w:t>
+      </w:r>
+      <w:r>
+        <w:rPr>
+          <w:rFonts w:ascii="Consolas" w:eastAsia="Times New Roman" w:hAnsi="Consolas" w:cs="Times New Roman"/>
+          <w:color w:val="D4D4D4"/>
+          <w:sz w:val="21"/>
+          <w:szCs w:val="21"/>
+          <w:lang w:val="en-US"/>
+        </w:rPr>
+        <w:t>=</w:t>
+      </w:r>
+      <w:proofErr w:type="spellStart"/>
+      <w:proofErr w:type="gramStart"/>
+      <w:r>
+        <w:rPr>
+          <w:rFonts w:ascii="Consolas" w:eastAsia="Times New Roman" w:hAnsi="Consolas" w:cs="Times New Roman"/>
+          <w:color w:val="D4D4D4"/>
+          <w:sz w:val="21"/>
+          <w:szCs w:val="21"/>
+          <w:lang w:val="en-US"/>
+        </w:rPr>
+        <w:t>subprocess.STDOUT</w:t>
+      </w:r>
+      <w:proofErr w:type="spellEnd"/>
+      <w:proofErr w:type="gramEnd"/>
+      <w:r>
+        <w:rPr>
+          <w:rFonts w:ascii="Consolas" w:eastAsia="Times New Roman" w:hAnsi="Consolas" w:cs="Times New Roman"/>
+          <w:color w:val="D4D4D4"/>
+          <w:sz w:val="21"/>
+          <w:szCs w:val="21"/>
+          <w:lang w:val="en-US"/>
+        </w:rPr>
+        <w:t>)</w:t>
+      </w:r>
+    </w:p>
+    <w:p>
+      <w:pPr>
+        <w:rPr>
+          <w:rFonts w:ascii="Times New Roman" w:hAnsi="Times New Roman" w:cs="Times New Roman"/>
+          <w:sz w:val="20"/>
+          <w:szCs w:val="20"/>
+        </w:rPr>
+      </w:pPr>
+      <w:r>
+        <w:rPr>
+          <w:rFonts w:ascii="Times New Roman" w:hAnsi="Times New Roman" w:cs="Times New Roman"/>
+          <w:sz w:val="20"/>
+          <w:szCs w:val="20"/>
+        </w:rPr>
+        <w:t>2. Automatyzacji Treningu (Trigger &amp; Retraining): Mechanizmu, który po zebraniu kompletnego zestawu ewaluacyjnego uruchamia proces douczania.</w:t>
+      </w:r>
+    </w:p>
+    <w:p>
+      <w:pPr>
+        <w:rPr>
+          <w:rFonts w:ascii="Times New Roman" w:hAnsi="Times New Roman" w:cs="Times New Roman"/>
+          <w:sz w:val="20"/>
+          <w:szCs w:val="20"/>
+        </w:rPr>
+      </w:pPr>
+      <w:r>
+        <w:rPr>
+          <w:rFonts w:ascii="Times New Roman" w:hAnsi="Times New Roman" w:cs="Times New Roman"/>
+          <w:sz w:val="20"/>
+          <w:szCs w:val="20"/>
+        </w:rPr>
+        <w:t>3. Decyzji o Wdrożeniu: Logiki, która po zakończeniu automatycznego benchmarku zwraca wyniki do eksperta, zapalając odpowiednie wskaźniki w interfejsie graficznym. Interfejs podświetla na zielono lub czerwono kluczowe metryki, ułatwiając podjęcie decyzji. Ekspert zachowuje jednak pełną kontrolę – może zatwierdzić wdrożenie (Hot-Swap) modelu na produkcję poprzez kliknięcie przycisku "Wdroż", nawet jeśli wyniki numeryczne uległy pogorszeniu, jeśli np. uzna, że nowa wersja lepiej radzi sobie z najcięższymi przypadkami brzegowymi.</w:t>
+      </w:r>
+    </w:p>
+    <w:p>
+      <w:pPr>
+        <w:rPr>
+          <w:rFonts w:ascii="Times New Roman" w:hAnsi="Times New Roman" w:cs="Times New Roman"/>
+          <w:sz w:val="20"/>
+          <w:szCs w:val="20"/>
+        </w:rPr>
+      </w:pPr>
+    </w:p>
+    <w:p>
+      <w:pPr>
+        <w:rPr>
+          <w:rFonts w:ascii="Times New Roman" w:hAnsi="Times New Roman" w:cs="Times New Roman"/>
+          <w:sz w:val="20"/>
+          <w:szCs w:val="20"/>
+        </w:rPr>
+      </w:pPr>
+      <w:r>
+        <w:rPr>
+          <w:rFonts w:ascii="Times New Roman" w:hAnsi="Times New Roman" w:cs="Times New Roman"/>
+          <w:sz w:val="20"/>
+          <w:szCs w:val="20"/>
+        </w:rPr>
+        <w:t>Algorytm procesu iteracyjnego douczania (Retraining Loop):</w:t>
+      </w:r>
+    </w:p>
+    <w:p>
+      <w:pPr>
+        <w:rPr>
+          <w:rFonts w:ascii="Times New Roman" w:hAnsi="Times New Roman" w:cs="Times New Roman"/>
+          <w:sz w:val="20"/>
+          <w:szCs w:val="20"/>
+        </w:rPr>
+      </w:pPr>
+      <w:r>
+        <w:rPr>
+          <w:rFonts w:ascii="Times New Roman" w:hAnsi="Times New Roman" w:cs="Times New Roman"/>
+          <w:sz w:val="20"/>
+          <w:szCs w:val="20"/>
+        </w:rPr>
+        <w:t>1. Odbierz nowy, kompletny zbiór danych treningowych przesłany przez eksperta przez interfejs.</w:t>
+      </w:r>
+    </w:p>
+    <w:p>
+      <w:pPr>
+        <w:rPr>
+          <w:rFonts w:ascii="Times New Roman" w:hAnsi="Times New Roman" w:cs="Times New Roman"/>
+          <w:sz w:val="20"/>
+          <w:szCs w:val="20"/>
+        </w:rPr>
+      </w:pPr>
+      <w:r>
+        <w:rPr>
+          <w:rFonts w:ascii="Times New Roman" w:hAnsi="Times New Roman" w:cs="Times New Roman"/>
+          <w:sz w:val="20"/>
+          <w:szCs w:val="20"/>
+        </w:rPr>
+        <w:t>2. Inicjuj proces treningowy (adapter LoRA) we wskazanym środowisku wykonawczym (WSL).</w:t>
+      </w:r>
+    </w:p>
+    <w:p>
+      <w:pPr>
+        <w:rPr>
+          <w:rFonts w:ascii="Times New Roman" w:hAnsi="Times New Roman" w:cs="Times New Roman"/>
+          <w:sz w:val="20"/>
+          <w:szCs w:val="20"/>
+        </w:rPr>
+      </w:pPr>
+      <w:r>
+        <w:rPr>
+          <w:rFonts w:ascii="Times New Roman" w:hAnsi="Times New Roman" w:cs="Times New Roman"/>
+          <w:sz w:val="20"/>
+          <w:szCs w:val="20"/>
+        </w:rPr>
+        <w:t>3. Po zakończeniu, uruchom automatyczną ewaluację modelu (Benchmark) na wydzielonym zbiorze testowym.</w:t>
+      </w:r>
+    </w:p>
+    <w:p>
+      <w:pPr>
+        <w:rPr>
+          <w:rFonts w:ascii="Times New Roman" w:hAnsi="Times New Roman" w:cs="Times New Roman"/>
+          <w:sz w:val="20"/>
+          <w:szCs w:val="20"/>
+        </w:rPr>
+      </w:pPr>
+      <w:r>
+        <w:rPr>
+          <w:rFonts w:ascii="Times New Roman" w:hAnsi="Times New Roman" w:cs="Times New Roman"/>
+          <w:sz w:val="20"/>
+          <w:szCs w:val="20"/>
+        </w:rPr>
+        <w:t>4. Pobierz wyniki ewaluacji (F1 Score, Exact Match).</w:t>
+      </w:r>
+    </w:p>
+    <w:p>
+      <w:pPr>
+        <w:rPr>
+          <w:rFonts w:ascii="Times New Roman" w:hAnsi="Times New Roman" w:cs="Times New Roman"/>
+          <w:sz w:val="20"/>
+          <w:szCs w:val="20"/>
+        </w:rPr>
+      </w:pPr>
+      <w:r>
+        <w:rPr>
+          <w:rFonts w:ascii="Times New Roman" w:hAnsi="Times New Roman" w:cs="Times New Roman"/>
+          <w:sz w:val="20"/>
+          <w:szCs w:val="20"/>
+        </w:rPr>
+        <w:t>5. Wyświetl wyniki w panelu wraz z kolorystyczną sugestią wdrożenia (czerwony/zielony).</w:t>
+      </w:r>
+    </w:p>
+    <w:p>
+      <w:pPr>
+        <w:rPr>
+          <w:rFonts w:ascii="Times New Roman" w:hAnsi="Times New Roman" w:cs="Times New Roman"/>
+          <w:sz w:val="20"/>
+          <w:szCs w:val="20"/>
+        </w:rPr>
+      </w:pPr>
+      <w:r>
+        <w:rPr>
+          <w:rFonts w:ascii="Times New Roman" w:hAnsi="Times New Roman" w:cs="Times New Roman"/>
+          <w:sz w:val="20"/>
+          <w:szCs w:val="20"/>
+        </w:rPr>
+        <w:t>6. Oczekuj na manualną akceptację przez eksperta (przycisk "Wdroż" staje się aktywny).</w:t>
+      </w:r>
+    </w:p>
+    <w:p>
+      <w:pPr>
+        <w:rPr>
+          <w:rFonts w:ascii="Times New Roman" w:hAnsi="Times New Roman" w:cs="Times New Roman"/>
+          <w:sz w:val="20"/>
+          <w:szCs w:val="20"/>
+        </w:rPr>
+      </w:pPr>
+      <w:r>
+        <w:rPr>
+          <w:rFonts w:ascii="Times New Roman" w:hAnsi="Times New Roman" w:cs="Times New Roman"/>
+          <w:sz w:val="20"/>
+          <w:szCs w:val="20"/>
+        </w:rPr>
+        <w:t xml:space="preserve">7. </w:t>
+      </w:r>
+      <w:r>
+        <w:rPr>
+          <w:rFonts w:ascii="Times New Roman" w:hAnsi="Times New Roman" w:cs="Times New Roman"/>
+          <w:sz w:val="20"/>
+          <w:szCs w:val="20"/>
+        </w:rPr>
+        <w:t>W przypadku zatwierdzenia, skompiluj adapter do formatu GGUF (z wykorzystaniem narzędzi llama.cpp; Gerganov, 2023) i podmień aktualny model produkcyjny w serwerze Ollama.</w:t>
+      </w:r>
+    </w:p>
+    <w:p>
+      <w:pPr>
+        <w:rPr>
+          <w:rFonts w:ascii="Times New Roman" w:hAnsi="Times New Roman" w:cs="Times New Roman"/>
+          <w:sz w:val="20"/>
+          <w:szCs w:val="20"/>
+        </w:rPr>
+      </w:pPr>
+    </w:p>
+    <w:p>
+      <w:pPr>
+        <w:rPr>
+          <w:rFonts w:ascii="Times New Roman" w:hAnsi="Times New Roman" w:cs="Times New Roman"/>
+          <w:sz w:val="20"/>
+          <w:szCs w:val="20"/>
+        </w:rPr>
+      </w:pPr>
+      <w:r>
+        <w:rPr>
+          <w:rFonts w:ascii="Times New Roman" w:hAnsi="Times New Roman" w:cs="Times New Roman"/>
+          <w:sz w:val="20"/>
+          <w:szCs w:val="20"/>
+        </w:rPr>
+        <w:lastRenderedPageBreak/>
         <w:t>2.7. Ograniczenia projektu</w:t>
       </w:r>
     </w:p>
@@ -3480,6 +5053,49 @@
     </w:p>
     <w:p>
       <w:pPr>
+        <w:tabs>
+          <w:tab w:val="left" w:pos="2724"/>
+        </w:tabs>
+        <w:rPr>
+          <w:rFonts w:ascii="Times New Roman" w:hAnsi="Times New Roman" w:cs="Times New Roman"/>
+          <w:sz w:val="20"/>
+          <w:szCs w:val="20"/>
+        </w:rPr>
+      </w:pPr>
+    </w:p>
+    <w:p>
+      <w:pPr>
+        <w:tabs>
+          <w:tab w:val="left" w:pos="2724"/>
+        </w:tabs>
+        <w:rPr>
+          <w:rFonts w:ascii="Times New Roman" w:hAnsi="Times New Roman" w:cs="Times New Roman"/>
+          <w:sz w:val="20"/>
+          <w:szCs w:val="20"/>
+        </w:rPr>
+      </w:pPr>
+      <w:r>
+        <w:rPr>
+          <w:rFonts w:ascii="Times New Roman" w:hAnsi="Times New Roman" w:cs="Times New Roman"/>
+          <w:sz w:val="20"/>
+          <w:szCs w:val="20"/>
+        </w:rPr>
+        <w:t>Złożoność obliczeniowa i parametry czasowe systemu (czas treningu i inferencji) są ściśle uzależnione od wykorzystanej infrastruktury sprzętowej oraz rozmiaru przetwarzanego zbioru. Należy rozróżnić dwa scenariusze użycia. Po pierwsze, ze względu na zapotrzebowanie na zasoby, pełne cykle dostrajania (SFT) i wyczerpująca ewaluacja głównych wariantów modelu (Tabela 1) zostały przeprowadzone w środowisku Google Colab (T4 GPU) na pełnym zbiorze danych. Po drugie, w przypadku lokalnego modułu iteracyjnego douczania (Retraining Loop), działającego na stacji roboczej z użyciem zredukowanego zbioru zgłoszeń dezinformacyjnych, szacunkowy czas jednego cyklu douczania (16 kroków) wynosi około 2 minuty. Czas lokalnej inferencji (generowania analizy w czasie rzeczywistym) dla pojedynczego zgłoszenia wynosi od 2 do 5 sekund na konsumenckiej karcie graficznej.</w:t>
+      </w:r>
+      <w:r>
+        <w:rPr>
+          <w:rFonts w:ascii="Times New Roman" w:hAnsi="Times New Roman" w:cs="Times New Roman"/>
+          <w:sz w:val="20"/>
+          <w:szCs w:val="20"/>
+        </w:rPr>
+        <w:tab/>
+      </w:r>
+    </w:p>
+    <w:p>
+      <w:pPr>
+        <w:tabs>
+          <w:tab w:val="left" w:pos="2724"/>
+        </w:tabs>
         <w:rPr>
           <w:rFonts w:ascii="Times New Roman" w:hAnsi="Times New Roman" w:cs="Times New Roman"/>
           <w:sz w:val="20"/>
@@ -4025,6 +5641,7 @@
           <w:sz w:val="20"/>
           <w:szCs w:val="20"/>
         </w:rPr>
+        <w:lastRenderedPageBreak/>
         <w:t>* Wpływ dostrajania: Model bazowy ("No Adapter") wykazuje krytycznie niską zdolność do formowania poprawnego wyjścia JSON (PSR 20%), co dyskwalifikuje go z zastosowań produkcyjnych. Dostrajanie (Adaptery) podnosi stabilność formatu do poziomu &gt;96%.</w:t>
       </w:r>
     </w:p>
@@ -4043,6 +5660,59 @@
           <w:szCs w:val="20"/>
         </w:rPr>
         <w:t>* Wpływ jakości generowanych wyjaśnień (XAI): Teoretycznie integracja warstwy wyjaśnialności powinna wspierać precyzję klasyfikacji poprzez wymuszenie głębszej analizy tekstu. Obserwowany spadek skuteczności wariantu "XAI" (F1 0.28 vs 0.49) wskazuje jednak na wpływ jakości danych trenujących w zakresie wyjaśnień (NLE). Jak wskazano w sekcji ograniczeń ("Brak formalnej walidacji jakości wyjaśnień"), model "Nauczyciela" mógł generować halucynacje lub błędne uzasadnienia, które model "Ucznia" następnie powielił, co paradoksalnie zaburzyło proces decyzyjny zamiast go wspomóc. Potwierdza to kluczową rolę weryfikacji jakości danych w procesie destylacji wiedzy.</w:t>
+      </w:r>
+    </w:p>
+    <w:p>
+      <w:pPr>
+        <w:rPr>
+          <w:rFonts w:ascii="Times New Roman" w:hAnsi="Times New Roman" w:cs="Times New Roman"/>
+          <w:sz w:val="20"/>
+          <w:szCs w:val="20"/>
+        </w:rPr>
+      </w:pPr>
+      <w:r>
+        <w:rPr>
+          <w:rFonts w:ascii="Times New Roman" w:hAnsi="Times New Roman" w:cs="Times New Roman"/>
+          <w:sz w:val="20"/>
+          <w:szCs w:val="20"/>
+        </w:rPr>
+        <w:t xml:space="preserve">* Odniesienie do literatury (External Baseline): Uzyskane wyniki dla wariantu </w:t>
+      </w:r>
+      <w:r>
+        <w:rPr>
+          <w:rFonts w:ascii="Times New Roman" w:hAnsi="Times New Roman" w:cs="Times New Roman"/>
+          <w:i/>
+          <w:iCs/>
+          <w:sz w:val="20"/>
+          <w:szCs w:val="20"/>
+        </w:rPr>
+        <w:t>Prototype Adapter</w:t>
+      </w:r>
+      <w:r>
+        <w:rPr>
+          <w:rFonts w:ascii="Times New Roman" w:hAnsi="Times New Roman" w:cs="Times New Roman"/>
+          <w:sz w:val="20"/>
+          <w:szCs w:val="20"/>
+        </w:rPr>
+        <w:t xml:space="preserve"> (F1 = 0.49) przewyższają bazowe wyniki raportowane w literaturze dla zbioru MIPD (Modzelewski et al., 2024), gdzie modele PL-RoBERTa-Large osiągały ważone F1 na poziomie ok. 0.47 (±0.003). Potwierdza to wysoką skuteczność procesu dostrajania modelu Bielik-4.5B w zadaniu czystej klasyfikacji. Warto jednak zauważyć, że wariant </w:t>
+      </w:r>
+      <w:r>
+        <w:rPr>
+          <w:rFonts w:ascii="Times New Roman" w:hAnsi="Times New Roman" w:cs="Times New Roman"/>
+          <w:i/>
+          <w:iCs/>
+          <w:sz w:val="20"/>
+          <w:szCs w:val="20"/>
+        </w:rPr>
+        <w:t>XAI Adapter</w:t>
+      </w:r>
+      <w:r>
+        <w:rPr>
+          <w:rFonts w:ascii="Times New Roman" w:hAnsi="Times New Roman" w:cs="Times New Roman"/>
+          <w:sz w:val="20"/>
+          <w:szCs w:val="20"/>
+        </w:rPr>
+        <w:t>, wprowadzający warstwę wyjaśnialności, uzyskuje obecnie wyniki niższe od literatury (F1 = 0.28). Wskazuje to na istotne wyzwanie inżynierskie: wprowadzenie wyjaśnialności (NLE) wiąże się obecnie z tzw. podatkiem od wydajności (performance tax). Optymalizacja jakości danych syntetycznych oraz procesu destylacji wiedzy, mająca na celu zbliżenie skuteczności wariantu XAI do poziomu Prototype, stanowi jeden z głównych kierunków dalszych prac.</w:t>
       </w:r>
     </w:p>
     <w:p>
@@ -4485,6 +6155,9 @@
         <w:keepNext/>
       </w:pPr>
       <w:r>
+        <w:rPr>
+          <w:noProof/>
+        </w:rPr>
         <w:lastRenderedPageBreak/>
         <w:drawing>
           <wp:inline distT="0" distB="0" distL="0" distR="0" wp14:anchorId="56F8EEE4" wp14:editId="0A9BE396">
@@ -4600,6 +6273,9 @@
     </w:p>
     <w:p>
       <w:r>
+        <w:rPr>
+          <w:noProof/>
+        </w:rPr>
         <w:lastRenderedPageBreak/>
         <w:drawing>
           <wp:inline distT="0" distB="0" distL="0" distR="0" wp14:anchorId="1FBCEC11" wp14:editId="2FA75102">
@@ -4670,6 +6346,9 @@
         <w:keepNext/>
       </w:pPr>
       <w:r>
+        <w:rPr>
+          <w:noProof/>
+        </w:rPr>
         <w:drawing>
           <wp:inline distT="0" distB="0" distL="0" distR="0" wp14:anchorId="0CE64EC1" wp14:editId="158FD48B">
             <wp:extent cx="5755640" cy="2722880"/>
@@ -4736,6 +6415,9 @@
         <w:keepNext/>
       </w:pPr>
       <w:r>
+        <w:rPr>
+          <w:noProof/>
+        </w:rPr>
         <w:lastRenderedPageBreak/>
         <w:drawing>
           <wp:inline distT="0" distB="0" distL="0" distR="0" wp14:anchorId="53FA9972" wp14:editId="0E4F4359">
@@ -4867,6 +6549,9 @@
         </mc:AlternateContent>
       </w:r>
       <w:r>
+        <w:rPr>
+          <w:noProof/>
+        </w:rPr>
         <w:drawing>
           <wp:anchor distT="0" distB="0" distL="114300" distR="114300" simplePos="0" relativeHeight="251661312" behindDoc="1" locked="0" layoutInCell="1" allowOverlap="1" wp14:anchorId="0F7835D4" wp14:editId="3E0691F7">
             <wp:simplePos x="0" y="0"/>
@@ -5932,8 +7617,93 @@
           <w:szCs w:val="20"/>
           <w:lang w:val="en-US"/>
         </w:rPr>
-        <w:t xml:space="preserve"> preprint arXiv:2412.15115. https://doi.org/10.48550/arXiv.2412.15115</w:t>
-      </w:r>
+        <w:t xml:space="preserve"> preprint arXiv:2412.15115. </w:t>
+      </w:r>
+      <w:hyperlink r:id="rId21" w:history="1">
+        <w:r>
+          <w:rPr>
+            <w:rStyle w:val="Hyperlink"/>
+            <w:rFonts w:ascii="Times New Roman" w:hAnsi="Times New Roman" w:cs="Times New Roman"/>
+            <w:sz w:val="20"/>
+            <w:szCs w:val="20"/>
+            <w:lang w:val="en-US"/>
+          </w:rPr>
+          <w:t>https://doi.org/10.48550/arXiv.2412.15115</w:t>
+        </w:r>
+      </w:hyperlink>
+    </w:p>
+    <w:p>
+      <w:pPr>
+        <w:rPr>
+          <w:rFonts w:ascii="Times New Roman" w:hAnsi="Times New Roman" w:cs="Times New Roman"/>
+          <w:sz w:val="20"/>
+          <w:szCs w:val="20"/>
+          <w:lang w:val="en-US"/>
+        </w:rPr>
+      </w:pPr>
+      <w:r>
+        <w:rPr>
+          <w:rFonts w:ascii="Times New Roman" w:hAnsi="Times New Roman" w:cs="Times New Roman"/>
+          <w:sz w:val="20"/>
+          <w:szCs w:val="20"/>
+          <w:lang w:val="en-US"/>
+        </w:rPr>
+        <w:t xml:space="preserve">11. Gerganov, G. (2023). </w:t>
+      </w:r>
+      <w:r>
+        <w:rPr>
+          <w:rFonts w:ascii="Times New Roman" w:hAnsi="Times New Roman" w:cs="Times New Roman"/>
+          <w:i/>
+          <w:iCs/>
+          <w:sz w:val="20"/>
+          <w:szCs w:val="20"/>
+          <w:lang w:val="en-US"/>
+        </w:rPr>
+        <w:t xml:space="preserve">*llama.cpp: Inference of </w:t>
+      </w:r>
+      <w:proofErr w:type="spellStart"/>
+      <w:r>
+        <w:rPr>
+          <w:rFonts w:ascii="Times New Roman" w:hAnsi="Times New Roman" w:cs="Times New Roman"/>
+          <w:i/>
+          <w:iCs/>
+          <w:sz w:val="20"/>
+          <w:szCs w:val="20"/>
+          <w:lang w:val="en-US"/>
+        </w:rPr>
+        <w:t>LLaMA</w:t>
+      </w:r>
+      <w:proofErr w:type="spellEnd"/>
+      <w:r>
+        <w:rPr>
+          <w:rFonts w:ascii="Times New Roman" w:hAnsi="Times New Roman" w:cs="Times New Roman"/>
+          <w:i/>
+          <w:iCs/>
+          <w:sz w:val="20"/>
+          <w:szCs w:val="20"/>
+          <w:lang w:val="en-US"/>
+        </w:rPr>
+        <w:t xml:space="preserve"> model in pure C/C++*</w:t>
+      </w:r>
+      <w:r>
+        <w:rPr>
+          <w:rFonts w:ascii="Times New Roman" w:hAnsi="Times New Roman" w:cs="Times New Roman"/>
+          <w:sz w:val="20"/>
+          <w:szCs w:val="20"/>
+          <w:lang w:val="en-US"/>
+        </w:rPr>
+        <w:t>. GitHub. https://github.com/ggerganov/llama.cpp</w:t>
+      </w:r>
+    </w:p>
+    <w:p>
+      <w:pPr>
+        <w:rPr>
+          <w:rFonts w:ascii="Times New Roman" w:hAnsi="Times New Roman" w:cs="Times New Roman"/>
+          <w:sz w:val="20"/>
+          <w:szCs w:val="20"/>
+          <w:lang w:val="en-US"/>
+        </w:rPr>
+      </w:pPr>
     </w:p>
     <w:p>
       <w:pPr>
@@ -5992,7 +7762,7 @@
       </w:pPr>
     </w:p>
     <w:sectPr>
-      <w:headerReference w:type="first" r:id="rId21"/>
+      <w:headerReference w:type="first" r:id="rId22"/>
       <w:pgSz w:w="11900" w:h="16840" w:code="9"/>
       <w:pgMar w:top="1418" w:right="1418" w:bottom="1418" w:left="1418" w:header="709" w:footer="709" w:gutter="0"/>
       <w:cols w:space="708"/>
@@ -9967,15 +11737,6 @@
 </file>
 
 <file path=customXml/item2.xml><?xml version="1.0" encoding="utf-8"?>
-<?mso-contentType ?>
-<FormTemplates xmlns="http://schemas.microsoft.com/sharepoint/v3/contenttype/forms">
-  <Display>DocumentLibraryForm</Display>
-  <Edit>DocumentLibraryForm</Edit>
-  <New>DocumentLibraryForm</New>
-</FormTemplates>
-</file>
-
-<file path=customXml/item3.xml><?xml version="1.0" encoding="utf-8"?>
 <ct:contentTypeSchema xmlns:ct="http://schemas.microsoft.com/office/2006/metadata/contentType" xmlns:ma="http://schemas.microsoft.com/office/2006/metadata/properties/metaAttributes" ct:_="" ma:_="" ma:contentTypeName="Dokument" ma:contentTypeID="0x010100C7B3477DA0B97842A4AB3CAC2FC7CCA9" ma:contentTypeVersion="3" ma:contentTypeDescription="Utwórz nowy dokument." ma:contentTypeScope="" ma:versionID="08acbf4e69e1c417c0654eb506165124">
   <xsd:schema xmlns:xsd="http://www.w3.org/2001/XMLSchema" xmlns:xs="http://www.w3.org/2001/XMLSchema" xmlns:p="http://schemas.microsoft.com/office/2006/metadata/properties" xmlns:ns2="90ad895e-3eee-4c0f-8ee5-203ad6452046" targetNamespace="http://schemas.microsoft.com/office/2006/metadata/properties" ma:root="true" ma:fieldsID="0612b0a3dcdc06ca4f4ab8731dc57d64" ns2:_="">
     <xsd:import namespace="90ad895e-3eee-4c0f-8ee5-203ad6452046"/>
@@ -10113,6 +11874,15 @@
 </ct:contentTypeSchema>
 </file>
 
+<file path=customXml/item3.xml><?xml version="1.0" encoding="utf-8"?>
+<?mso-contentType ?>
+<FormTemplates xmlns="http://schemas.microsoft.com/sharepoint/v3/contenttype/forms">
+  <Display>DocumentLibraryForm</Display>
+  <Edit>DocumentLibraryForm</Edit>
+  <New>DocumentLibraryForm</New>
+</FormTemplates>
+</file>
+
 <file path=customXml/itemProps1.xml><?xml version="1.0" encoding="utf-8"?>
 <ds:datastoreItem xmlns:ds="http://schemas.openxmlformats.org/officeDocument/2006/customXml" ds:itemID="{9A4B9707-3390-4BAA-9D3A-F1BCEDCBE263}">
   <ds:schemaRefs>
@@ -10123,14 +11893,6 @@
 </file>
 
 <file path=customXml/itemProps2.xml><?xml version="1.0" encoding="utf-8"?>
-<ds:datastoreItem xmlns:ds="http://schemas.openxmlformats.org/officeDocument/2006/customXml" ds:itemID="{C7ED8927-B6BE-4A5E-8E7E-ABB33AB171D8}">
-  <ds:schemaRefs>
-    <ds:schemaRef ds:uri="http://schemas.microsoft.com/sharepoint/v3/contenttype/forms"/>
-  </ds:schemaRefs>
-</ds:datastoreItem>
-</file>
-
-<file path=customXml/itemProps3.xml><?xml version="1.0" encoding="utf-8"?>
 <ds:datastoreItem xmlns:ds="http://schemas.openxmlformats.org/officeDocument/2006/customXml" ds:itemID="{8B32E23D-F441-40B0-8BD3-500F27940F29}">
   <ds:schemaRefs>
     <ds:schemaRef ds:uri="http://schemas.microsoft.com/office/2006/metadata/contentType"/>
@@ -10146,4 +11908,12 @@
     <ds:schemaRef ds:uri="http://schemas.microsoft.com/internal/obd"/>
   </ds:schemaRefs>
 </ds:datastoreItem>
+</file>
+
+<file path=customXml/itemProps3.xml><?xml version="1.0" encoding="utf-8"?>
+<ds:datastoreItem xmlns:ds="http://schemas.openxmlformats.org/officeDocument/2006/customXml" ds:itemID="{C7ED8927-B6BE-4A5E-8E7E-ABB33AB171D8}">
+  <ds:schemaRefs>
+    <ds:schemaRef ds:uri="http://schemas.microsoft.com/sharepoint/v3/contenttype/forms"/>
+  </ds:schemaRefs>
+</ds:datastoreItem>
 </file>
</xml_diff>

<commit_message>
chore: migrate bat→cmd, add setup script, fix hardcoded paths, rewrite README
Replace .bat launchers with .cmd equivalents adding port checks and
dependency guards. Add setup.cmd for one-command project initialization.
Fix reset_state.py hardcoded adapter path to use relative os.path.join.
Rewrite README with clearer structure, model file layout, and setup
instructions. Update CLAUDE.md launcher reference. Add *.zip to
gitignore. Add two-layer data storage paragraph to thesis doc.
</commit_message>
<xml_diff>
--- a/documentation/Projekt_43995.docx
+++ b/documentation/Projekt_43995.docx
@@ -2812,6 +2812,12 @@
       </w:r>
     </w:p>
     <w:p/>
+    <w:p>
+      <w:pPr/>
+      <w:r>
+        <w:t>System korzysta z dwuwarstwowego modelu przechowywania danych. Baza SQLite (disinfo_system.db) rejestruje metadane przebiegów treningowych w tabeli TrainingRun (identyfikator, ramy czasowe, wyniki F1 przed i po douczaniu, status, ścieżka adaptera). Warstwa plików systemowych przechowuje: zbiór referencyjny do ewaluacji (model/dataset/mipd_test.jsonl — stały zbiór testowy z adnotacjami gold-label), checkpointy adapterów LoRA (katalog model/latest/) oraz raporty benchmarkowe z podziałem na warianty (model/benchmark-reports/). Gorąca wymiana modelu produkcyjnego polega na konwersji adaptera do formatu GGUF i przeładowaniu serwera Ollama.</w:t>
+      </w:r>
+    </w:p>
     <w:p>
       <w:r>
         <w:t>2.7. Ograniczenia projektu</w:t>

</xml_diff>

<commit_message>
docs: update thesis document, simplify architecture diagrams, add presentation variant
- Add Table 1 (11 manipulation technique classes) to thesis docx
- Add methodology note on F1 metric non-equivalence with literature
- Add rationale for manual deployment approval in MLOps pipeline
- Remove redundant section numbering and duplicate screenshot captions
- Split architecture-diagram.md into inference, MLOps, and data generation
- Add presentation-diagram.md for slide-deck use (horizontal, minimal)
- Fix missing diacritic (ladowanie→ładowanie) in thesis
- Fix Modelfile ADAPTER path to use Windows backslashes
- Remove stale HF_TOKEN requirement from CLAUDE.md
- Add WSL2 install link and Google Drive model download link to README
</commit_message>
<xml_diff>
--- a/documentation/Projekt_43995.docx
+++ b/documentation/Projekt_43995.docx
@@ -434,27 +434,6 @@
         <w:lastRenderedPageBreak/>
         <w:t>Podstawowe informacje</w:t>
       </w:r>
-      <w:r>
-        <w:t xml:space="preserve"> (mak</w:t>
-      </w:r>
-      <w:r>
-        <w:t>s.</w:t>
-      </w:r>
-      <w:r>
-        <w:t xml:space="preserve"> </w:t>
-      </w:r>
-      <w:r>
-        <w:t>4</w:t>
-      </w:r>
-      <w:r>
-        <w:t xml:space="preserve"> stron</w:t>
-      </w:r>
-      <w:r>
-        <w:t>y</w:t>
-      </w:r>
-      <w:r>
-        <w:t>)</w:t>
-      </w:r>
     </w:p>
     <w:p>
       <w:pPr>
@@ -618,7 +597,7 @@
         <w:t xml:space="preserve"> Pozwala na</w:t>
       </w:r>
       <w:r>
-        <w:t xml:space="preserve"> ladowanie nowych danych treningowych</w:t>
+        <w:t xml:space="preserve"> ładowanie nowych danych treningowych</w:t>
       </w:r>
       <w:r>
         <w:t xml:space="preserve"> oraz uruchomienie procesu </w:t>
@@ -635,6 +614,439 @@
       </w:r>
     </w:p>
     <w:p>
+      <w:r>
+        <w:t xml:space="preserve">Tabela 1. </w:t>
+      </w:r>
+      <w:r>
+        <w:t>Klasy manipulacji, które wykrywa system.</w:t>
+      </w:r>
+    </w:p>
+    <w:tbl>
+      <w:tblPr>
+        <w:tblStyle w:val="TableGrid"/>
+        <w:tblW w:w="0" w:type="auto"/>
+        <w:tblLook w:val="04A0" w:firstRow="1" w:lastRow="0" w:firstColumn="1" w:lastColumn="0" w:noHBand="0" w:noVBand="1"/>
+      </w:tblPr>
+      <w:tblGrid>
+        <w:gridCol w:w="4527"/>
+        <w:gridCol w:w="4527"/>
+      </w:tblGrid>
+      <w:tr>
+        <w:tc>
+          <w:tcPr>
+            <w:tcW w:w="4527" w:type="dxa"/>
+            <w:tcBorders>
+              <w:top w:val="single" w:sz="4" w:space="0" w:color="auto"/>
+              <w:left w:val="single" w:sz="4" w:space="0" w:color="auto"/>
+              <w:bottom w:val="single" w:sz="4" w:space="0" w:color="auto"/>
+              <w:right w:val="single" w:sz="4" w:space="0" w:color="auto"/>
+            </w:tcBorders>
+            <w:hideMark/>
+          </w:tcPr>
+          <w:p>
+            <w:r>
+              <w:t>Tag</w:t>
+            </w:r>
+          </w:p>
+        </w:tc>
+        <w:tc>
+          <w:tcPr>
+            <w:tcW w:w="4527" w:type="dxa"/>
+            <w:tcBorders>
+              <w:top w:val="single" w:sz="4" w:space="0" w:color="auto"/>
+              <w:left w:val="single" w:sz="4" w:space="0" w:color="auto"/>
+              <w:bottom w:val="single" w:sz="4" w:space="0" w:color="auto"/>
+              <w:right w:val="single" w:sz="4" w:space="0" w:color="auto"/>
+            </w:tcBorders>
+            <w:hideMark/>
+          </w:tcPr>
+          <w:p>
+            <w:r>
+              <w:t>Opis</w:t>
+            </w:r>
+          </w:p>
+        </w:tc>
+      </w:tr>
+      <w:tr>
+        <w:tc>
+          <w:tcPr>
+            <w:tcW w:w="4527" w:type="dxa"/>
+            <w:tcBorders>
+              <w:top w:val="single" w:sz="4" w:space="0" w:color="auto"/>
+              <w:left w:val="single" w:sz="4" w:space="0" w:color="auto"/>
+              <w:bottom w:val="single" w:sz="4" w:space="0" w:color="auto"/>
+              <w:right w:val="single" w:sz="4" w:space="0" w:color="auto"/>
+            </w:tcBorders>
+            <w:hideMark/>
+          </w:tcPr>
+          <w:p>
+            <w:r>
+              <w:t>REFERENCE_ERROR</w:t>
+            </w:r>
+          </w:p>
+        </w:tc>
+        <w:tc>
+          <w:tcPr>
+            <w:tcW w:w="4527" w:type="dxa"/>
+            <w:tcBorders>
+              <w:top w:val="single" w:sz="4" w:space="0" w:color="auto"/>
+              <w:left w:val="single" w:sz="4" w:space="0" w:color="auto"/>
+              <w:bottom w:val="single" w:sz="4" w:space="0" w:color="auto"/>
+              <w:right w:val="single" w:sz="4" w:space="0" w:color="auto"/>
+            </w:tcBorders>
+          </w:tcPr>
+          <w:p>
+            <w:r>
+              <w:t>Powoływanie się na niewiarygodne lub fałszywe źródła.</w:t>
+            </w:r>
+          </w:p>
+        </w:tc>
+      </w:tr>
+      <w:tr>
+        <w:tc>
+          <w:tcPr>
+            <w:tcW w:w="4527" w:type="dxa"/>
+            <w:tcBorders>
+              <w:top w:val="single" w:sz="4" w:space="0" w:color="auto"/>
+              <w:left w:val="single" w:sz="4" w:space="0" w:color="auto"/>
+              <w:bottom w:val="single" w:sz="4" w:space="0" w:color="auto"/>
+              <w:right w:val="single" w:sz="4" w:space="0" w:color="auto"/>
+            </w:tcBorders>
+            <w:hideMark/>
+          </w:tcPr>
+          <w:p>
+            <w:r>
+              <w:t>WHATABOUTISM</w:t>
+            </w:r>
+          </w:p>
+        </w:tc>
+        <w:tc>
+          <w:tcPr>
+            <w:tcW w:w="4527" w:type="dxa"/>
+            <w:tcBorders>
+              <w:top w:val="single" w:sz="4" w:space="0" w:color="auto"/>
+              <w:left w:val="single" w:sz="4" w:space="0" w:color="auto"/>
+              <w:bottom w:val="single" w:sz="4" w:space="0" w:color="auto"/>
+              <w:right w:val="single" w:sz="4" w:space="0" w:color="auto"/>
+            </w:tcBorders>
+          </w:tcPr>
+          <w:p>
+            <w:r>
+              <w:t>Odchodzenie od tematu poprzez wprowadzenie niezwiązanego argumentu.</w:t>
+            </w:r>
+          </w:p>
+        </w:tc>
+      </w:tr>
+      <w:tr>
+        <w:tc>
+          <w:tcPr>
+            <w:tcW w:w="4527" w:type="dxa"/>
+            <w:tcBorders>
+              <w:top w:val="single" w:sz="4" w:space="0" w:color="auto"/>
+              <w:left w:val="single" w:sz="4" w:space="0" w:color="auto"/>
+              <w:bottom w:val="single" w:sz="4" w:space="0" w:color="auto"/>
+              <w:right w:val="single" w:sz="4" w:space="0" w:color="auto"/>
+            </w:tcBorders>
+          </w:tcPr>
+          <w:p>
+            <w:r>
+              <w:t>STRAWMAN</w:t>
+            </w:r>
+          </w:p>
+        </w:tc>
+        <w:tc>
+          <w:tcPr>
+            <w:tcW w:w="4527" w:type="dxa"/>
+            <w:tcBorders>
+              <w:top w:val="single" w:sz="4" w:space="0" w:color="auto"/>
+              <w:left w:val="single" w:sz="4" w:space="0" w:color="auto"/>
+              <w:bottom w:val="single" w:sz="4" w:space="0" w:color="auto"/>
+              <w:right w:val="single" w:sz="4" w:space="0" w:color="auto"/>
+            </w:tcBorders>
+          </w:tcPr>
+          <w:p>
+            <w:r>
+              <w:t xml:space="preserve">Przeinaczanie argumentu w celu ułatwienia ataku. </w:t>
+            </w:r>
+          </w:p>
+        </w:tc>
+      </w:tr>
+      <w:tr>
+        <w:tc>
+          <w:tcPr>
+            <w:tcW w:w="4527" w:type="dxa"/>
+            <w:tcBorders>
+              <w:top w:val="single" w:sz="4" w:space="0" w:color="auto"/>
+              <w:left w:val="single" w:sz="4" w:space="0" w:color="auto"/>
+              <w:bottom w:val="single" w:sz="4" w:space="0" w:color="auto"/>
+              <w:right w:val="single" w:sz="4" w:space="0" w:color="auto"/>
+            </w:tcBorders>
+          </w:tcPr>
+          <w:p>
+            <w:r>
+              <w:lastRenderedPageBreak/>
+              <w:t>EMOTIONAL_CONTENT</w:t>
+            </w:r>
+          </w:p>
+        </w:tc>
+        <w:tc>
+          <w:tcPr>
+            <w:tcW w:w="4527" w:type="dxa"/>
+            <w:tcBorders>
+              <w:top w:val="single" w:sz="4" w:space="0" w:color="auto"/>
+              <w:left w:val="single" w:sz="4" w:space="0" w:color="auto"/>
+              <w:bottom w:val="single" w:sz="4" w:space="0" w:color="auto"/>
+              <w:right w:val="single" w:sz="4" w:space="0" w:color="auto"/>
+            </w:tcBorders>
+          </w:tcPr>
+          <w:p>
+            <w:r>
+              <w:t>Manipulowanie emocjami czytelnika w celu zmiany opinii.</w:t>
+            </w:r>
+          </w:p>
+        </w:tc>
+      </w:tr>
+      <w:tr>
+        <w:tc>
+          <w:tcPr>
+            <w:tcW w:w="4527" w:type="dxa"/>
+            <w:tcBorders>
+              <w:top w:val="single" w:sz="4" w:space="0" w:color="auto"/>
+              <w:left w:val="single" w:sz="4" w:space="0" w:color="auto"/>
+              <w:bottom w:val="single" w:sz="4" w:space="0" w:color="auto"/>
+              <w:right w:val="single" w:sz="4" w:space="0" w:color="auto"/>
+            </w:tcBorders>
+          </w:tcPr>
+          <w:p>
+            <w:r>
+              <w:t>CHERRY_PICKING</w:t>
+            </w:r>
+          </w:p>
+        </w:tc>
+        <w:tc>
+          <w:tcPr>
+            <w:tcW w:w="4527" w:type="dxa"/>
+            <w:tcBorders>
+              <w:top w:val="single" w:sz="4" w:space="0" w:color="auto"/>
+              <w:left w:val="single" w:sz="4" w:space="0" w:color="auto"/>
+              <w:bottom w:val="single" w:sz="4" w:space="0" w:color="auto"/>
+              <w:right w:val="single" w:sz="4" w:space="0" w:color="auto"/>
+            </w:tcBorders>
+          </w:tcPr>
+          <w:p>
+            <w:r>
+              <w:t>Selektywne prezentowanie danych w celu poparcia konkretnego argumentu.</w:t>
+            </w:r>
+          </w:p>
+        </w:tc>
+      </w:tr>
+      <w:tr>
+        <w:tc>
+          <w:tcPr>
+            <w:tcW w:w="4527" w:type="dxa"/>
+            <w:tcBorders>
+              <w:top w:val="single" w:sz="4" w:space="0" w:color="auto"/>
+              <w:left w:val="single" w:sz="4" w:space="0" w:color="auto"/>
+              <w:bottom w:val="single" w:sz="4" w:space="0" w:color="auto"/>
+              <w:right w:val="single" w:sz="4" w:space="0" w:color="auto"/>
+            </w:tcBorders>
+          </w:tcPr>
+          <w:p>
+            <w:r>
+              <w:t>FALSE_CAUSE</w:t>
+            </w:r>
+          </w:p>
+        </w:tc>
+        <w:tc>
+          <w:tcPr>
+            <w:tcW w:w="4527" w:type="dxa"/>
+            <w:tcBorders>
+              <w:top w:val="single" w:sz="4" w:space="0" w:color="auto"/>
+              <w:left w:val="single" w:sz="4" w:space="0" w:color="auto"/>
+              <w:bottom w:val="single" w:sz="4" w:space="0" w:color="auto"/>
+              <w:right w:val="single" w:sz="4" w:space="0" w:color="auto"/>
+            </w:tcBorders>
+          </w:tcPr>
+          <w:p>
+            <w:r>
+              <w:t>Zakładanie związku przyczynowo-skutkowego na podstawie samej korelacji.</w:t>
+            </w:r>
+          </w:p>
+        </w:tc>
+      </w:tr>
+      <w:tr>
+        <w:tc>
+          <w:tcPr>
+            <w:tcW w:w="4527" w:type="dxa"/>
+            <w:tcBorders>
+              <w:top w:val="single" w:sz="4" w:space="0" w:color="auto"/>
+              <w:left w:val="single" w:sz="4" w:space="0" w:color="auto"/>
+              <w:bottom w:val="single" w:sz="4" w:space="0" w:color="auto"/>
+              <w:right w:val="single" w:sz="4" w:space="0" w:color="auto"/>
+            </w:tcBorders>
+          </w:tcPr>
+          <w:p>
+            <w:r>
+              <w:t>MISLEADING_CLICKBAIT</w:t>
+            </w:r>
+          </w:p>
+        </w:tc>
+        <w:tc>
+          <w:tcPr>
+            <w:tcW w:w="4527" w:type="dxa"/>
+            <w:tcBorders>
+              <w:top w:val="single" w:sz="4" w:space="0" w:color="auto"/>
+              <w:left w:val="single" w:sz="4" w:space="0" w:color="auto"/>
+              <w:bottom w:val="single" w:sz="4" w:space="0" w:color="auto"/>
+              <w:right w:val="single" w:sz="4" w:space="0" w:color="auto"/>
+            </w:tcBorders>
+          </w:tcPr>
+          <w:p>
+            <w:r>
+              <w:t>Tworzenie mylącego lub sensacyjnego nagłówka, który jest sprzeczny z treścią artykułu.</w:t>
+            </w:r>
+          </w:p>
+        </w:tc>
+      </w:tr>
+      <w:tr>
+        <w:tc>
+          <w:tcPr>
+            <w:tcW w:w="4527" w:type="dxa"/>
+            <w:tcBorders>
+              <w:top w:val="single" w:sz="4" w:space="0" w:color="auto"/>
+              <w:left w:val="single" w:sz="4" w:space="0" w:color="auto"/>
+              <w:bottom w:val="single" w:sz="4" w:space="0" w:color="auto"/>
+              <w:right w:val="single" w:sz="4" w:space="0" w:color="auto"/>
+            </w:tcBorders>
+          </w:tcPr>
+          <w:p>
+            <w:r>
+              <w:t>ANECDOTE</w:t>
+            </w:r>
+          </w:p>
+        </w:tc>
+        <w:tc>
+          <w:tcPr>
+            <w:tcW w:w="4527" w:type="dxa"/>
+            <w:tcBorders>
+              <w:top w:val="single" w:sz="4" w:space="0" w:color="auto"/>
+              <w:left w:val="single" w:sz="4" w:space="0" w:color="auto"/>
+              <w:bottom w:val="single" w:sz="4" w:space="0" w:color="auto"/>
+              <w:right w:val="single" w:sz="4" w:space="0" w:color="auto"/>
+            </w:tcBorders>
+          </w:tcPr>
+          <w:p>
+            <w:r>
+              <w:t>Wykorzystywanie osobistych historii do podważania danych statystycznych.</w:t>
+            </w:r>
+          </w:p>
+        </w:tc>
+      </w:tr>
+      <w:tr>
+        <w:tc>
+          <w:tcPr>
+            <w:tcW w:w="4527" w:type="dxa"/>
+            <w:tcBorders>
+              <w:top w:val="single" w:sz="4" w:space="0" w:color="auto"/>
+              <w:left w:val="single" w:sz="4" w:space="0" w:color="auto"/>
+              <w:bottom w:val="single" w:sz="4" w:space="0" w:color="auto"/>
+              <w:right w:val="single" w:sz="4" w:space="0" w:color="auto"/>
+            </w:tcBorders>
+          </w:tcPr>
+          <w:p>
+            <w:r>
+              <w:t>LEADING_QUESTIONS</w:t>
+            </w:r>
+          </w:p>
+        </w:tc>
+        <w:tc>
+          <w:tcPr>
+            <w:tcW w:w="4527" w:type="dxa"/>
+            <w:tcBorders>
+              <w:top w:val="single" w:sz="4" w:space="0" w:color="auto"/>
+              <w:left w:val="single" w:sz="4" w:space="0" w:color="auto"/>
+              <w:bottom w:val="single" w:sz="4" w:space="0" w:color="auto"/>
+              <w:right w:val="single" w:sz="4" w:space="0" w:color="auto"/>
+            </w:tcBorders>
+          </w:tcPr>
+          <w:p>
+            <w:r>
+              <w:t>Stawianie pytań w sposób sugerujący z góry ustalony wniosek.</w:t>
+            </w:r>
+          </w:p>
+        </w:tc>
+      </w:tr>
+      <w:tr>
+        <w:tc>
+          <w:tcPr>
+            <w:tcW w:w="4527" w:type="dxa"/>
+            <w:tcBorders>
+              <w:top w:val="single" w:sz="4" w:space="0" w:color="auto"/>
+              <w:left w:val="single" w:sz="4" w:space="0" w:color="auto"/>
+              <w:bottom w:val="single" w:sz="4" w:space="0" w:color="auto"/>
+              <w:right w:val="single" w:sz="4" w:space="0" w:color="auto"/>
+            </w:tcBorders>
+          </w:tcPr>
+          <w:p>
+            <w:r>
+              <w:t>EXAGGERATION</w:t>
+            </w:r>
+          </w:p>
+        </w:tc>
+        <w:tc>
+          <w:tcPr>
+            <w:tcW w:w="4527" w:type="dxa"/>
+            <w:tcBorders>
+              <w:top w:val="single" w:sz="4" w:space="0" w:color="auto"/>
+              <w:left w:val="single" w:sz="4" w:space="0" w:color="auto"/>
+              <w:bottom w:val="single" w:sz="4" w:space="0" w:color="auto"/>
+              <w:right w:val="single" w:sz="4" w:space="0" w:color="auto"/>
+            </w:tcBorders>
+          </w:tcPr>
+          <w:p>
+            <w:r>
+              <w:t>Wyolbrzymianie lub niedocenianie faktów.</w:t>
+            </w:r>
+          </w:p>
+        </w:tc>
+      </w:tr>
+      <w:tr>
+        <w:tc>
+          <w:tcPr>
+            <w:tcW w:w="4527" w:type="dxa"/>
+            <w:tcBorders>
+              <w:top w:val="single" w:sz="4" w:space="0" w:color="auto"/>
+              <w:left w:val="single" w:sz="4" w:space="0" w:color="auto"/>
+              <w:bottom w:val="single" w:sz="4" w:space="0" w:color="auto"/>
+              <w:right w:val="single" w:sz="4" w:space="0" w:color="auto"/>
+            </w:tcBorders>
+          </w:tcPr>
+          <w:p>
+            <w:r>
+              <w:t>QUOTE_MINING</w:t>
+            </w:r>
+          </w:p>
+        </w:tc>
+        <w:tc>
+          <w:tcPr>
+            <w:tcW w:w="4527" w:type="dxa"/>
+            <w:tcBorders>
+              <w:top w:val="single" w:sz="4" w:space="0" w:color="auto"/>
+              <w:left w:val="single" w:sz="4" w:space="0" w:color="auto"/>
+              <w:bottom w:val="single" w:sz="4" w:space="0" w:color="auto"/>
+              <w:right w:val="single" w:sz="4" w:space="0" w:color="auto"/>
+            </w:tcBorders>
+          </w:tcPr>
+          <w:p>
+            <w:r>
+              <w:t>Zniekształcanie czyichś wypowiedzi poprzez wykorzystywanie wybranych fragmentów.</w:t>
+            </w:r>
+          </w:p>
+        </w:tc>
+      </w:tr>
+    </w:tbl>
+    <w:p/>
+    <w:p>
       <w:pPr>
         <w:pStyle w:val="Heading2"/>
       </w:pPr>
@@ -659,11 +1071,7 @@
         <w:t>komercyjne modele językowe ogólnego przeznaczenia</w:t>
       </w:r>
       <w:r>
-        <w:t xml:space="preserve">, takie jak GPT-4 czy Gemini. Choć oferują one wysoki poziom wnioskowania, ich stosowanie w systemach bezpieczeństwa informacyjnego obarczone jest poważnymi ryzykami. Są to rozwiązania typu "zamkniętego" (API), co rodzi problemy z prywatnością analizowanych </w:t>
-      </w:r>
-      <w:r>
-        <w:lastRenderedPageBreak/>
-        <w:t>danych oraz kosztami eksploatacji. Co istotne, modele te posiadają wbudowane restrykcyjne filtry bezpieczeństwa (tzw. over-refusal), przez co często odmawiają analizy kontrowersyjnych tekstów politycznych, które są głównym nośnikiem dezinformacji. Ponadto, jako modele globalne, często niepoprawnie interpretują lokalny kontekst kulturowy (np. polską ironię polityczną), traktując ją dosłownie.</w:t>
+        <w:t>, takie jak GPT-4 czy Gemini. Choć oferują one wysoki poziom wnioskowania, ich stosowanie w systemach bezpieczeństwa informacyjnego obarczone jest poważnymi ryzykami. Są to rozwiązania typu "zamkniętego" (API), co rodzi problemy z prywatnością analizowanych danych oraz kosztami eksploatacji. Co istotne, modele te posiadają wbudowane restrykcyjne filtry bezpieczeństwa (tzw. over-refusal), przez co często odmawiają analizy kontrowersyjnych tekstów politycznych, które są głównym nośnikiem dezinformacji. Ponadto, jako modele globalne, często niepoprawnie interpretują lokalny kontekst kulturowy (np. polską ironię polityczną), traktując ją dosłownie.</w:t>
       </w:r>
     </w:p>
     <w:p>
@@ -725,7 +1133,11 @@
         <w:t>lokalny i uncenzurowany</w:t>
       </w:r>
       <w:r>
-        <w:t xml:space="preserve">, zdolny do analizy dowolnych treści bez ograniczeń korporacyjnych i kosztów API. Po trzecie, unikalny </w:t>
+        <w:t xml:space="preserve">, zdolny do analizy dowolnych treści bez ograniczeń </w:t>
+      </w:r>
+      <w:r>
+        <w:lastRenderedPageBreak/>
+        <w:t xml:space="preserve">korporacyjnych i kosztów API. Po trzecie, unikalny </w:t>
       </w:r>
       <w:r>
         <w:rPr>
@@ -889,7 +1301,6 @@
     </w:p>
     <w:p>
       <w:r>
-        <w:lastRenderedPageBreak/>
         <w:t>Rola: Lokalny serwer udostępniający model poprzez REST API.</w:t>
       </w:r>
     </w:p>
@@ -940,28 +1351,21 @@
         <w:t>Kluczowe zagadnienia związane z realizacją projektu</w:t>
       </w:r>
     </w:p>
-    <w:p>
-      <w:pPr>
-        <w:rPr>
-          <w:rFonts w:ascii="Times New Roman" w:hAnsi="Times New Roman" w:cs="Times New Roman"/>
-          <w:sz w:val="20"/>
-          <w:szCs w:val="20"/>
-        </w:rPr>
-      </w:pPr>
-    </w:p>
-    <w:p>
-      <w:r>
-        <w:t>2. Kluczowe zagadnienia związane z realizacją projektu</w:t>
-      </w:r>
-    </w:p>
     <w:p/>
     <w:p>
       <w:r>
-        <w:t>Realizacja systemu detekcji dezinformacji wymagała rozwiązania szeregu problemów inżynieryjnych z zakresu przetwarzania języka naturalnego (NLP), optymalizacji modeli głębokiego uczenia oraz architektury systemów rozproszonych. Poniżej przedstawiono kluczowe aspekty implementacyjne z podziałem na etapy wytwarzania oprogramowania, uwzględniające rzeczywiste parametry i wyniki uzyskane w toku prac.</w:t>
+        <w:t xml:space="preserve">Realizacja systemu detekcji dezinformacji wymagała rozwiązania szeregu problemów inżynieryjnych z zakresu przetwarzania języka naturalnego (NLP), optymalizacji modeli głębokiego uczenia oraz architektury systemów rozproszonych. Poniżej przedstawiono </w:t>
+      </w:r>
+      <w:r>
+        <w:lastRenderedPageBreak/>
+        <w:t>kluczowe aspekty implementacyjne z podziałem na etapy wytwarzania oprogramowania, uwzględniające rzeczywiste parametry i wyniki uzyskane w toku prac.</w:t>
       </w:r>
     </w:p>
     <w:p/>
     <w:p>
+      <w:pPr>
+        <w:pStyle w:val="Heading2"/>
+      </w:pPr>
       <w:r>
         <w:t>2.1. Cele i charakterystyka inżynierska projektu</w:t>
       </w:r>
@@ -1007,6 +1411,9 @@
     </w:p>
     <w:p/>
     <w:p>
+      <w:pPr>
+        <w:pStyle w:val="Heading2"/>
+      </w:pPr>
       <w:r>
         <w:t>2.2. Implementacja procesu generowania danych syntetycznych (NLE i generowanie uzasadnień – Rationale Generation)</w:t>
       </w:r>
@@ -1025,7 +1432,11 @@
     </w:p>
     <w:p>
       <w:r>
-        <w:t>Konieczność wygenerowania tysięcy wysokiej jakości uzasadnień dla zbioru MIPD (Modzelewski et al., 2024) (ponad 10 000 próbek) przy konieczności zachowania spójności formatu JSON. Istotnym aspektem było tzw. generowanie uzasadnień (Lei et al., 2016), czyli proces ekstrakcji fragmentów tekstu źródłowego, które bezpośrednio uzasadniają predykcję.</w:t>
+        <w:t xml:space="preserve">Konieczność wygenerowania tysięcy wysokiej jakości uzasadnień dla zbioru MIPD (Modzelewski et al., 2024) (ponad 10 000 próbek) przy konieczności zachowania spójności </w:t>
+      </w:r>
+      <w:r>
+        <w:lastRenderedPageBreak/>
+        <w:t>formatu JSON. Istotnym aspektem było tzw. generowanie uzasadnień (Lei et al., 2016), czyli proces ekstrakcji fragmentów tekstu źródłowego, które bezpośrednio uzasadniają predykcję.</w:t>
       </w:r>
     </w:p>
     <w:p/>
@@ -1057,18 +1468,16 @@
     </w:p>
     <w:p>
       <w:r>
-        <w:t xml:space="preserve">Separacja logiki: Model generował treść wyjaśnienia, a struktura JSON była składana programowo, co eliminowało błędy składniowe. W docelowym systemie (XAI Adapter) </w:t>
-      </w:r>
-      <w:r>
-        <w:lastRenderedPageBreak/>
-        <w:t>model jest trenowany, aby na wyjściu zwracać spójną strukturę zawierającą listę zidentyfikowanych technik oraz pole uzasadnienia:</w:t>
+        <w:t>Separacja logiki: Model generował treść wyjaśnienia, a struktura JSON była składana programowo, co eliminowało błędy składniowe. W docelowym systemie (XAI Adapter) model jest trenowany, aby na wyjściu zwracać spójną strukturę zawierającą listę zidentyfikowanych technik oraz pole uzasadnienia:</w:t>
       </w:r>
     </w:p>
     <w:p/>
     <w:p>
       <w:pPr>
-        <w:rPr>
-          <w:rFonts w:ascii="Consolas" w:eastAsia="Times New Roman" w:hAnsi="Consolas"/>
+        <w:shd w:val="clear" w:color="auto" w:fill="1F1F1F"/>
+        <w:spacing w:line="285" w:lineRule="atLeast"/>
+        <w:rPr>
+          <w:rFonts w:ascii="Consolas" w:eastAsia="Times New Roman" w:hAnsi="Consolas" w:cs="Times New Roman"/>
           <w:color w:val="CCCCCC"/>
           <w:sz w:val="21"/>
           <w:szCs w:val="21"/>
@@ -1076,7 +1485,7 @@
       </w:pPr>
       <w:r>
         <w:rPr>
-          <w:rFonts w:ascii="Consolas" w:eastAsia="Times New Roman" w:hAnsi="Consolas"/>
+          <w:rFonts w:ascii="Consolas" w:eastAsia="Times New Roman" w:hAnsi="Consolas" w:cs="Times New Roman"/>
           <w:color w:val="D4D4D4"/>
           <w:sz w:val="21"/>
           <w:szCs w:val="21"/>
@@ -1086,8 +1495,10 @@
     </w:p>
     <w:p>
       <w:pPr>
-        <w:rPr>
-          <w:rFonts w:ascii="Consolas" w:eastAsia="Times New Roman" w:hAnsi="Consolas"/>
+        <w:shd w:val="clear" w:color="auto" w:fill="1F1F1F"/>
+        <w:spacing w:line="285" w:lineRule="atLeast"/>
+        <w:rPr>
+          <w:rFonts w:ascii="Consolas" w:eastAsia="Times New Roman" w:hAnsi="Consolas" w:cs="Times New Roman"/>
           <w:color w:val="CCCCCC"/>
           <w:sz w:val="21"/>
           <w:szCs w:val="21"/>
@@ -1095,7 +1506,7 @@
       </w:pPr>
       <w:r>
         <w:rPr>
-          <w:rFonts w:ascii="Consolas" w:eastAsia="Times New Roman" w:hAnsi="Consolas"/>
+          <w:rFonts w:ascii="Consolas" w:eastAsia="Times New Roman" w:hAnsi="Consolas" w:cs="Times New Roman"/>
           <w:color w:val="D4D4D4"/>
           <w:sz w:val="21"/>
           <w:szCs w:val="21"/>
@@ -1104,7 +1515,7 @@
       </w:r>
       <w:r>
         <w:rPr>
-          <w:rFonts w:ascii="Consolas" w:eastAsia="Times New Roman" w:hAnsi="Consolas"/>
+          <w:rFonts w:ascii="Consolas" w:eastAsia="Times New Roman" w:hAnsi="Consolas" w:cs="Times New Roman"/>
           <w:color w:val="9CDCFE"/>
           <w:sz w:val="21"/>
           <w:szCs w:val="21"/>
@@ -1113,7 +1524,7 @@
       </w:r>
       <w:r>
         <w:rPr>
-          <w:rFonts w:ascii="Consolas" w:eastAsia="Times New Roman" w:hAnsi="Consolas"/>
+          <w:rFonts w:ascii="Consolas" w:eastAsia="Times New Roman" w:hAnsi="Consolas" w:cs="Times New Roman"/>
           <w:color w:val="D4D4D4"/>
           <w:sz w:val="21"/>
           <w:szCs w:val="21"/>
@@ -1122,7 +1533,7 @@
       </w:r>
       <w:r>
         <w:rPr>
-          <w:rFonts w:ascii="Consolas" w:eastAsia="Times New Roman" w:hAnsi="Consolas"/>
+          <w:rFonts w:ascii="Consolas" w:eastAsia="Times New Roman" w:hAnsi="Consolas" w:cs="Times New Roman"/>
           <w:color w:val="CE9178"/>
           <w:sz w:val="21"/>
           <w:szCs w:val="21"/>
@@ -1131,7 +1542,7 @@
       </w:r>
       <w:r>
         <w:rPr>
-          <w:rFonts w:ascii="Consolas" w:eastAsia="Times New Roman" w:hAnsi="Consolas"/>
+          <w:rFonts w:ascii="Consolas" w:eastAsia="Times New Roman" w:hAnsi="Consolas" w:cs="Times New Roman"/>
           <w:color w:val="D4D4D4"/>
           <w:sz w:val="21"/>
           <w:szCs w:val="21"/>
@@ -1141,8 +1552,10 @@
     </w:p>
     <w:p>
       <w:pPr>
-        <w:rPr>
-          <w:rFonts w:ascii="Consolas" w:eastAsia="Times New Roman" w:hAnsi="Consolas"/>
+        <w:shd w:val="clear" w:color="auto" w:fill="1F1F1F"/>
+        <w:spacing w:line="285" w:lineRule="atLeast"/>
+        <w:rPr>
+          <w:rFonts w:ascii="Consolas" w:eastAsia="Times New Roman" w:hAnsi="Consolas" w:cs="Times New Roman"/>
           <w:color w:val="CCCCCC"/>
           <w:sz w:val="21"/>
           <w:szCs w:val="21"/>
@@ -1151,7 +1564,7 @@
       </w:pPr>
       <w:r>
         <w:rPr>
-          <w:rFonts w:ascii="Consolas" w:eastAsia="Times New Roman" w:hAnsi="Consolas"/>
+          <w:rFonts w:ascii="Consolas" w:eastAsia="Times New Roman" w:hAnsi="Consolas" w:cs="Times New Roman"/>
           <w:color w:val="D4D4D4"/>
           <w:sz w:val="21"/>
           <w:szCs w:val="21"/>
@@ -1160,7 +1573,7 @@
       </w:r>
       <w:r>
         <w:rPr>
-          <w:rFonts w:ascii="Consolas" w:eastAsia="Times New Roman" w:hAnsi="Consolas"/>
+          <w:rFonts w:ascii="Consolas" w:eastAsia="Times New Roman" w:hAnsi="Consolas" w:cs="Times New Roman"/>
           <w:color w:val="9CDCFE"/>
           <w:sz w:val="21"/>
           <w:szCs w:val="21"/>
@@ -1172,7 +1585,7 @@
       <w:proofErr w:type="gramStart"/>
       <w:r>
         <w:rPr>
-          <w:rFonts w:ascii="Consolas" w:eastAsia="Times New Roman" w:hAnsi="Consolas"/>
+          <w:rFonts w:ascii="Consolas" w:eastAsia="Times New Roman" w:hAnsi="Consolas" w:cs="Times New Roman"/>
           <w:color w:val="9CDCFE"/>
           <w:sz w:val="21"/>
           <w:szCs w:val="21"/>
@@ -1183,7 +1596,7 @@
       <w:proofErr w:type="gramEnd"/>
       <w:r>
         <w:rPr>
-          <w:rFonts w:ascii="Consolas" w:eastAsia="Times New Roman" w:hAnsi="Consolas"/>
+          <w:rFonts w:ascii="Consolas" w:eastAsia="Times New Roman" w:hAnsi="Consolas" w:cs="Times New Roman"/>
           <w:color w:val="9CDCFE"/>
           <w:sz w:val="21"/>
           <w:szCs w:val="21"/>
@@ -1194,7 +1607,7 @@
       <w:proofErr w:type="spellEnd"/>
       <w:r>
         <w:rPr>
-          <w:rFonts w:ascii="Consolas" w:eastAsia="Times New Roman" w:hAnsi="Consolas"/>
+          <w:rFonts w:ascii="Consolas" w:eastAsia="Times New Roman" w:hAnsi="Consolas" w:cs="Times New Roman"/>
           <w:color w:val="9CDCFE"/>
           <w:sz w:val="21"/>
           <w:szCs w:val="21"/>
@@ -1204,7 +1617,7 @@
       </w:r>
       <w:r>
         <w:rPr>
-          <w:rFonts w:ascii="Consolas" w:eastAsia="Times New Roman" w:hAnsi="Consolas"/>
+          <w:rFonts w:ascii="Consolas" w:eastAsia="Times New Roman" w:hAnsi="Consolas" w:cs="Times New Roman"/>
           <w:color w:val="D4D4D4"/>
           <w:sz w:val="21"/>
           <w:szCs w:val="21"/>
@@ -1214,7 +1627,7 @@
       </w:r>
       <w:r>
         <w:rPr>
-          <w:rFonts w:ascii="Consolas" w:eastAsia="Times New Roman" w:hAnsi="Consolas"/>
+          <w:rFonts w:ascii="Consolas" w:eastAsia="Times New Roman" w:hAnsi="Consolas" w:cs="Times New Roman"/>
           <w:color w:val="CE9178"/>
           <w:sz w:val="21"/>
           <w:szCs w:val="21"/>
@@ -1224,7 +1637,7 @@
       </w:r>
       <w:r>
         <w:rPr>
-          <w:rFonts w:ascii="Consolas" w:eastAsia="Times New Roman" w:hAnsi="Consolas"/>
+          <w:rFonts w:ascii="Consolas" w:eastAsia="Times New Roman" w:hAnsi="Consolas" w:cs="Times New Roman"/>
           <w:color w:val="D4D4D4"/>
           <w:sz w:val="21"/>
           <w:szCs w:val="21"/>
@@ -1234,7 +1647,7 @@
       </w:r>
       <w:r>
         <w:rPr>
-          <w:rFonts w:ascii="Consolas" w:eastAsia="Times New Roman" w:hAnsi="Consolas"/>
+          <w:rFonts w:ascii="Consolas" w:eastAsia="Times New Roman" w:hAnsi="Consolas" w:cs="Times New Roman"/>
           <w:color w:val="CE9178"/>
           <w:sz w:val="21"/>
           <w:szCs w:val="21"/>
@@ -1244,7 +1657,7 @@
       </w:r>
       <w:r>
         <w:rPr>
-          <w:rFonts w:ascii="Consolas" w:eastAsia="Times New Roman" w:hAnsi="Consolas"/>
+          <w:rFonts w:ascii="Consolas" w:eastAsia="Times New Roman" w:hAnsi="Consolas" w:cs="Times New Roman"/>
           <w:color w:val="D4D4D4"/>
           <w:sz w:val="21"/>
           <w:szCs w:val="21"/>
@@ -1255,8 +1668,10 @@
     </w:p>
     <w:p>
       <w:pPr>
-        <w:rPr>
-          <w:rFonts w:ascii="Consolas" w:eastAsia="Times New Roman" w:hAnsi="Consolas"/>
+        <w:shd w:val="clear" w:color="auto" w:fill="1F1F1F"/>
+        <w:spacing w:line="285" w:lineRule="atLeast"/>
+        <w:rPr>
+          <w:rFonts w:ascii="Consolas" w:eastAsia="Times New Roman" w:hAnsi="Consolas" w:cs="Times New Roman"/>
           <w:color w:val="CCCCCC"/>
           <w:sz w:val="21"/>
           <w:szCs w:val="21"/>
@@ -1264,7 +1679,7 @@
       </w:pPr>
       <w:r>
         <w:rPr>
-          <w:rFonts w:ascii="Consolas" w:eastAsia="Times New Roman" w:hAnsi="Consolas"/>
+          <w:rFonts w:ascii="Consolas" w:eastAsia="Times New Roman" w:hAnsi="Consolas" w:cs="Times New Roman"/>
           <w:color w:val="D4D4D4"/>
           <w:sz w:val="21"/>
           <w:szCs w:val="21"/>
@@ -1274,6 +1689,9 @@
     </w:p>
     <w:p/>
     <w:p>
+      <w:pPr>
+        <w:pStyle w:val="Heading2"/>
+      </w:pPr>
       <w:r>
         <w:t>2.3. Metodyka dostrajania modelu (nadzorowane dostrajanie – Supervised Fine-Tuning)</w:t>
       </w:r>
@@ -1303,13 +1721,16 @@
     </w:p>
     <w:p>
       <w:r>
+        <w:lastRenderedPageBreak/>
         <w:t>Zastosowano technikę QLoRA (Dettmers et al., 2023) z wykorzystaniem biblioteki Unsloth. Pozwoliło to na zamrożenie głównych wag modelu (zapisanych w formacie 4-bitowym NF4) i trenowanie jedynie niewielkich macierzy adapterów (Hu et al., 2021). Proces konfiguracji warstwy adaptacyjnej (LoRA) przedstawia poniższy fragment kodu (plik `trainer.py`):</w:t>
       </w:r>
     </w:p>
     <w:p>
       <w:pPr>
-        <w:rPr>
-          <w:rFonts w:ascii="Consolas" w:eastAsia="Times New Roman" w:hAnsi="Consolas"/>
+        <w:shd w:val="clear" w:color="auto" w:fill="1F1F1F"/>
+        <w:spacing w:line="285" w:lineRule="atLeast"/>
+        <w:rPr>
+          <w:rFonts w:ascii="Consolas" w:eastAsia="Times New Roman" w:hAnsi="Consolas" w:cs="Times New Roman"/>
           <w:color w:val="CCCCCC"/>
           <w:sz w:val="21"/>
           <w:szCs w:val="21"/>
@@ -1318,7 +1739,7 @@
       </w:pPr>
       <w:r>
         <w:rPr>
-          <w:rFonts w:ascii="Consolas" w:eastAsia="Times New Roman" w:hAnsi="Consolas"/>
+          <w:rFonts w:ascii="Consolas" w:eastAsia="Times New Roman" w:hAnsi="Consolas" w:cs="Times New Roman"/>
           <w:color w:val="D4D4D4"/>
           <w:sz w:val="21"/>
           <w:szCs w:val="21"/>
@@ -1329,7 +1750,7 @@
       <w:proofErr w:type="spellStart"/>
       <w:r>
         <w:rPr>
-          <w:rFonts w:ascii="Consolas" w:eastAsia="Times New Roman" w:hAnsi="Consolas"/>
+          <w:rFonts w:ascii="Consolas" w:eastAsia="Times New Roman" w:hAnsi="Consolas" w:cs="Times New Roman"/>
           <w:color w:val="D4D4D4"/>
           <w:sz w:val="21"/>
           <w:szCs w:val="21"/>
@@ -1340,7 +1761,7 @@
       <w:proofErr w:type="gramStart"/>
       <w:r>
         <w:rPr>
-          <w:rFonts w:ascii="Consolas" w:eastAsia="Times New Roman" w:hAnsi="Consolas"/>
+          <w:rFonts w:ascii="Consolas" w:eastAsia="Times New Roman" w:hAnsi="Consolas" w:cs="Times New Roman"/>
           <w:color w:val="D4D4D4"/>
           <w:sz w:val="21"/>
           <w:szCs w:val="21"/>
@@ -1351,7 +1772,7 @@
       <w:proofErr w:type="spellEnd"/>
       <w:r>
         <w:rPr>
-          <w:rFonts w:ascii="Consolas" w:eastAsia="Times New Roman" w:hAnsi="Consolas"/>
+          <w:rFonts w:ascii="Consolas" w:eastAsia="Times New Roman" w:hAnsi="Consolas" w:cs="Times New Roman"/>
           <w:color w:val="D4D4D4"/>
           <w:sz w:val="21"/>
           <w:szCs w:val="21"/>
@@ -1363,8 +1784,10 @@
     </w:p>
     <w:p>
       <w:pPr>
-        <w:rPr>
-          <w:rFonts w:ascii="Consolas" w:eastAsia="Times New Roman" w:hAnsi="Consolas"/>
+        <w:shd w:val="clear" w:color="auto" w:fill="1F1F1F"/>
+        <w:spacing w:line="285" w:lineRule="atLeast"/>
+        <w:rPr>
+          <w:rFonts w:ascii="Consolas" w:eastAsia="Times New Roman" w:hAnsi="Consolas" w:cs="Times New Roman"/>
           <w:color w:val="CCCCCC"/>
           <w:sz w:val="21"/>
           <w:szCs w:val="21"/>
@@ -1373,7 +1796,7 @@
       </w:pPr>
       <w:r>
         <w:rPr>
-          <w:rFonts w:ascii="Consolas" w:eastAsia="Times New Roman" w:hAnsi="Consolas"/>
+          <w:rFonts w:ascii="Consolas" w:eastAsia="Times New Roman" w:hAnsi="Consolas" w:cs="Times New Roman"/>
           <w:color w:val="D4D4D4"/>
           <w:sz w:val="21"/>
           <w:szCs w:val="21"/>
@@ -1384,8 +1807,10 @@
     </w:p>
     <w:p>
       <w:pPr>
-        <w:rPr>
-          <w:rFonts w:ascii="Consolas" w:eastAsia="Times New Roman" w:hAnsi="Consolas"/>
+        <w:shd w:val="clear" w:color="auto" w:fill="1F1F1F"/>
+        <w:spacing w:line="285" w:lineRule="atLeast"/>
+        <w:rPr>
+          <w:rFonts w:ascii="Consolas" w:eastAsia="Times New Roman" w:hAnsi="Consolas" w:cs="Times New Roman"/>
           <w:color w:val="CCCCCC"/>
           <w:sz w:val="21"/>
           <w:szCs w:val="21"/>
@@ -1394,7 +1819,7 @@
       </w:pPr>
       <w:r>
         <w:rPr>
-          <w:rFonts w:ascii="Consolas" w:eastAsia="Times New Roman" w:hAnsi="Consolas"/>
+          <w:rFonts w:ascii="Consolas" w:eastAsia="Times New Roman" w:hAnsi="Consolas" w:cs="Times New Roman"/>
           <w:color w:val="D4D4D4"/>
           <w:sz w:val="21"/>
           <w:szCs w:val="21"/>
@@ -1404,7 +1829,7 @@
       </w:r>
       <w:r>
         <w:rPr>
-          <w:rFonts w:ascii="Consolas" w:eastAsia="Times New Roman" w:hAnsi="Consolas"/>
+          <w:rFonts w:ascii="Consolas" w:eastAsia="Times New Roman" w:hAnsi="Consolas" w:cs="Times New Roman"/>
           <w:color w:val="9CDCFE"/>
           <w:sz w:val="21"/>
           <w:szCs w:val="21"/>
@@ -1414,7 +1839,7 @@
       </w:r>
       <w:r>
         <w:rPr>
-          <w:rFonts w:ascii="Consolas" w:eastAsia="Times New Roman" w:hAnsi="Consolas"/>
+          <w:rFonts w:ascii="Consolas" w:eastAsia="Times New Roman" w:hAnsi="Consolas" w:cs="Times New Roman"/>
           <w:color w:val="D4D4D4"/>
           <w:sz w:val="21"/>
           <w:szCs w:val="21"/>
@@ -1424,7 +1849,7 @@
       </w:r>
       <w:r>
         <w:rPr>
-          <w:rFonts w:ascii="Consolas" w:eastAsia="Times New Roman" w:hAnsi="Consolas"/>
+          <w:rFonts w:ascii="Consolas" w:eastAsia="Times New Roman" w:hAnsi="Consolas" w:cs="Times New Roman"/>
           <w:color w:val="B5CEA8"/>
           <w:sz w:val="21"/>
           <w:szCs w:val="21"/>
@@ -1434,7 +1859,7 @@
       </w:r>
       <w:r>
         <w:rPr>
-          <w:rFonts w:ascii="Consolas" w:eastAsia="Times New Roman" w:hAnsi="Consolas"/>
+          <w:rFonts w:ascii="Consolas" w:eastAsia="Times New Roman" w:hAnsi="Consolas" w:cs="Times New Roman"/>
           <w:color w:val="D4D4D4"/>
           <w:sz w:val="21"/>
           <w:szCs w:val="21"/>
@@ -1444,7 +1869,7 @@
       </w:r>
       <w:r>
         <w:rPr>
-          <w:rFonts w:ascii="Consolas" w:eastAsia="Times New Roman" w:hAnsi="Consolas"/>
+          <w:rFonts w:ascii="Consolas" w:eastAsia="Times New Roman" w:hAnsi="Consolas" w:cs="Times New Roman"/>
           <w:color w:val="6A9955"/>
           <w:sz w:val="21"/>
           <w:szCs w:val="21"/>
@@ -1455,7 +1880,7 @@
       <w:proofErr w:type="spellStart"/>
       <w:r>
         <w:rPr>
-          <w:rFonts w:ascii="Consolas" w:eastAsia="Times New Roman" w:hAnsi="Consolas"/>
+          <w:rFonts w:ascii="Consolas" w:eastAsia="Times New Roman" w:hAnsi="Consolas" w:cs="Times New Roman"/>
           <w:color w:val="6A9955"/>
           <w:sz w:val="21"/>
           <w:szCs w:val="21"/>
@@ -1466,7 +1891,7 @@
       <w:proofErr w:type="spellEnd"/>
       <w:r>
         <w:rPr>
-          <w:rFonts w:ascii="Consolas" w:eastAsia="Times New Roman" w:hAnsi="Consolas"/>
+          <w:rFonts w:ascii="Consolas" w:eastAsia="Times New Roman" w:hAnsi="Consolas" w:cs="Times New Roman"/>
           <w:color w:val="6A9955"/>
           <w:sz w:val="21"/>
           <w:szCs w:val="21"/>
@@ -1477,7 +1902,7 @@
       <w:proofErr w:type="spellStart"/>
       <w:r>
         <w:rPr>
-          <w:rFonts w:ascii="Consolas" w:eastAsia="Times New Roman" w:hAnsi="Consolas"/>
+          <w:rFonts w:ascii="Consolas" w:eastAsia="Times New Roman" w:hAnsi="Consolas" w:cs="Times New Roman"/>
           <w:color w:val="6A9955"/>
           <w:sz w:val="21"/>
           <w:szCs w:val="21"/>
@@ -1489,8 +1914,10 @@
     </w:p>
     <w:p>
       <w:pPr>
-        <w:rPr>
-          <w:rFonts w:ascii="Consolas" w:eastAsia="Times New Roman" w:hAnsi="Consolas"/>
+        <w:shd w:val="clear" w:color="auto" w:fill="1F1F1F"/>
+        <w:spacing w:line="285" w:lineRule="atLeast"/>
+        <w:rPr>
+          <w:rFonts w:ascii="Consolas" w:eastAsia="Times New Roman" w:hAnsi="Consolas" w:cs="Times New Roman"/>
           <w:color w:val="CCCCCC"/>
           <w:sz w:val="21"/>
           <w:szCs w:val="21"/>
@@ -1499,7 +1926,7 @@
       </w:pPr>
       <w:r>
         <w:rPr>
-          <w:rFonts w:ascii="Consolas" w:eastAsia="Times New Roman" w:hAnsi="Consolas"/>
+          <w:rFonts w:ascii="Consolas" w:eastAsia="Times New Roman" w:hAnsi="Consolas" w:cs="Times New Roman"/>
           <w:color w:val="D4D4D4"/>
           <w:sz w:val="21"/>
           <w:szCs w:val="21"/>
@@ -1510,7 +1937,7 @@
       <w:proofErr w:type="spellStart"/>
       <w:r>
         <w:rPr>
-          <w:rFonts w:ascii="Consolas" w:eastAsia="Times New Roman" w:hAnsi="Consolas"/>
+          <w:rFonts w:ascii="Consolas" w:eastAsia="Times New Roman" w:hAnsi="Consolas" w:cs="Times New Roman"/>
           <w:color w:val="9CDCFE"/>
           <w:sz w:val="21"/>
           <w:szCs w:val="21"/>
@@ -1521,7 +1948,7 @@
       <w:proofErr w:type="spellEnd"/>
       <w:r>
         <w:rPr>
-          <w:rFonts w:ascii="Consolas" w:eastAsia="Times New Roman" w:hAnsi="Consolas"/>
+          <w:rFonts w:ascii="Consolas" w:eastAsia="Times New Roman" w:hAnsi="Consolas" w:cs="Times New Roman"/>
           <w:color w:val="D4D4D4"/>
           <w:sz w:val="21"/>
           <w:szCs w:val="21"/>
@@ -1531,7 +1958,7 @@
       </w:r>
       <w:r>
         <w:rPr>
-          <w:rFonts w:ascii="Consolas" w:eastAsia="Times New Roman" w:hAnsi="Consolas"/>
+          <w:rFonts w:ascii="Consolas" w:eastAsia="Times New Roman" w:hAnsi="Consolas" w:cs="Times New Roman"/>
           <w:color w:val="CE9178"/>
           <w:sz w:val="21"/>
           <w:szCs w:val="21"/>
@@ -1542,7 +1969,7 @@
       <w:proofErr w:type="spellStart"/>
       <w:r>
         <w:rPr>
-          <w:rFonts w:ascii="Consolas" w:eastAsia="Times New Roman" w:hAnsi="Consolas"/>
+          <w:rFonts w:ascii="Consolas" w:eastAsia="Times New Roman" w:hAnsi="Consolas" w:cs="Times New Roman"/>
           <w:color w:val="CE9178"/>
           <w:sz w:val="21"/>
           <w:szCs w:val="21"/>
@@ -1553,7 +1980,7 @@
       <w:proofErr w:type="spellEnd"/>
       <w:r>
         <w:rPr>
-          <w:rFonts w:ascii="Consolas" w:eastAsia="Times New Roman" w:hAnsi="Consolas"/>
+          <w:rFonts w:ascii="Consolas" w:eastAsia="Times New Roman" w:hAnsi="Consolas" w:cs="Times New Roman"/>
           <w:color w:val="CE9178"/>
           <w:sz w:val="21"/>
           <w:szCs w:val="21"/>
@@ -1563,7 +1990,7 @@
       </w:r>
       <w:r>
         <w:rPr>
-          <w:rFonts w:ascii="Consolas" w:eastAsia="Times New Roman" w:hAnsi="Consolas"/>
+          <w:rFonts w:ascii="Consolas" w:eastAsia="Times New Roman" w:hAnsi="Consolas" w:cs="Times New Roman"/>
           <w:color w:val="D4D4D4"/>
           <w:sz w:val="21"/>
           <w:szCs w:val="21"/>
@@ -1573,7 +2000,7 @@
       </w:r>
       <w:r>
         <w:rPr>
-          <w:rFonts w:ascii="Consolas" w:eastAsia="Times New Roman" w:hAnsi="Consolas"/>
+          <w:rFonts w:ascii="Consolas" w:eastAsia="Times New Roman" w:hAnsi="Consolas" w:cs="Times New Roman"/>
           <w:color w:val="CE9178"/>
           <w:sz w:val="21"/>
           <w:szCs w:val="21"/>
@@ -1584,7 +2011,7 @@
       <w:proofErr w:type="spellStart"/>
       <w:r>
         <w:rPr>
-          <w:rFonts w:ascii="Consolas" w:eastAsia="Times New Roman" w:hAnsi="Consolas"/>
+          <w:rFonts w:ascii="Consolas" w:eastAsia="Times New Roman" w:hAnsi="Consolas" w:cs="Times New Roman"/>
           <w:color w:val="CE9178"/>
           <w:sz w:val="21"/>
           <w:szCs w:val="21"/>
@@ -1595,7 +2022,7 @@
       <w:proofErr w:type="spellEnd"/>
       <w:r>
         <w:rPr>
-          <w:rFonts w:ascii="Consolas" w:eastAsia="Times New Roman" w:hAnsi="Consolas"/>
+          <w:rFonts w:ascii="Consolas" w:eastAsia="Times New Roman" w:hAnsi="Consolas" w:cs="Times New Roman"/>
           <w:color w:val="CE9178"/>
           <w:sz w:val="21"/>
           <w:szCs w:val="21"/>
@@ -1605,7 +2032,7 @@
       </w:r>
       <w:r>
         <w:rPr>
-          <w:rFonts w:ascii="Consolas" w:eastAsia="Times New Roman" w:hAnsi="Consolas"/>
+          <w:rFonts w:ascii="Consolas" w:eastAsia="Times New Roman" w:hAnsi="Consolas" w:cs="Times New Roman"/>
           <w:color w:val="D4D4D4"/>
           <w:sz w:val="21"/>
           <w:szCs w:val="21"/>
@@ -1615,7 +2042,7 @@
       </w:r>
       <w:r>
         <w:rPr>
-          <w:rFonts w:ascii="Consolas" w:eastAsia="Times New Roman" w:hAnsi="Consolas"/>
+          <w:rFonts w:ascii="Consolas" w:eastAsia="Times New Roman" w:hAnsi="Consolas" w:cs="Times New Roman"/>
           <w:color w:val="CE9178"/>
           <w:sz w:val="21"/>
           <w:szCs w:val="21"/>
@@ -1626,7 +2053,7 @@
       <w:proofErr w:type="spellStart"/>
       <w:r>
         <w:rPr>
-          <w:rFonts w:ascii="Consolas" w:eastAsia="Times New Roman" w:hAnsi="Consolas"/>
+          <w:rFonts w:ascii="Consolas" w:eastAsia="Times New Roman" w:hAnsi="Consolas" w:cs="Times New Roman"/>
           <w:color w:val="CE9178"/>
           <w:sz w:val="21"/>
           <w:szCs w:val="21"/>
@@ -1637,7 +2064,7 @@
       <w:proofErr w:type="spellEnd"/>
       <w:r>
         <w:rPr>
-          <w:rFonts w:ascii="Consolas" w:eastAsia="Times New Roman" w:hAnsi="Consolas"/>
+          <w:rFonts w:ascii="Consolas" w:eastAsia="Times New Roman" w:hAnsi="Consolas" w:cs="Times New Roman"/>
           <w:color w:val="CE9178"/>
           <w:sz w:val="21"/>
           <w:szCs w:val="21"/>
@@ -1647,7 +2074,7 @@
       </w:r>
       <w:r>
         <w:rPr>
-          <w:rFonts w:ascii="Consolas" w:eastAsia="Times New Roman" w:hAnsi="Consolas"/>
+          <w:rFonts w:ascii="Consolas" w:eastAsia="Times New Roman" w:hAnsi="Consolas" w:cs="Times New Roman"/>
           <w:color w:val="D4D4D4"/>
           <w:sz w:val="21"/>
           <w:szCs w:val="21"/>
@@ -1657,7 +2084,7 @@
       </w:r>
       <w:r>
         <w:rPr>
-          <w:rFonts w:ascii="Consolas" w:eastAsia="Times New Roman" w:hAnsi="Consolas"/>
+          <w:rFonts w:ascii="Consolas" w:eastAsia="Times New Roman" w:hAnsi="Consolas" w:cs="Times New Roman"/>
           <w:color w:val="CE9178"/>
           <w:sz w:val="21"/>
           <w:szCs w:val="21"/>
@@ -1668,7 +2095,7 @@
       <w:proofErr w:type="spellStart"/>
       <w:r>
         <w:rPr>
-          <w:rFonts w:ascii="Consolas" w:eastAsia="Times New Roman" w:hAnsi="Consolas"/>
+          <w:rFonts w:ascii="Consolas" w:eastAsia="Times New Roman" w:hAnsi="Consolas" w:cs="Times New Roman"/>
           <w:color w:val="CE9178"/>
           <w:sz w:val="21"/>
           <w:szCs w:val="21"/>
@@ -1679,7 +2106,7 @@
       <w:proofErr w:type="spellEnd"/>
       <w:r>
         <w:rPr>
-          <w:rFonts w:ascii="Consolas" w:eastAsia="Times New Roman" w:hAnsi="Consolas"/>
+          <w:rFonts w:ascii="Consolas" w:eastAsia="Times New Roman" w:hAnsi="Consolas" w:cs="Times New Roman"/>
           <w:color w:val="CE9178"/>
           <w:sz w:val="21"/>
           <w:szCs w:val="21"/>
@@ -1689,7 +2116,7 @@
       </w:r>
       <w:r>
         <w:rPr>
-          <w:rFonts w:ascii="Consolas" w:eastAsia="Times New Roman" w:hAnsi="Consolas"/>
+          <w:rFonts w:ascii="Consolas" w:eastAsia="Times New Roman" w:hAnsi="Consolas" w:cs="Times New Roman"/>
           <w:color w:val="D4D4D4"/>
           <w:sz w:val="21"/>
           <w:szCs w:val="21"/>
@@ -1699,7 +2126,7 @@
       </w:r>
       <w:r>
         <w:rPr>
-          <w:rFonts w:ascii="Consolas" w:eastAsia="Times New Roman" w:hAnsi="Consolas"/>
+          <w:rFonts w:ascii="Consolas" w:eastAsia="Times New Roman" w:hAnsi="Consolas" w:cs="Times New Roman"/>
           <w:color w:val="CE9178"/>
           <w:sz w:val="21"/>
           <w:szCs w:val="21"/>
@@ -1710,7 +2137,7 @@
       <w:proofErr w:type="spellStart"/>
       <w:r>
         <w:rPr>
-          <w:rFonts w:ascii="Consolas" w:eastAsia="Times New Roman" w:hAnsi="Consolas"/>
+          <w:rFonts w:ascii="Consolas" w:eastAsia="Times New Roman" w:hAnsi="Consolas" w:cs="Times New Roman"/>
           <w:color w:val="CE9178"/>
           <w:sz w:val="21"/>
           <w:szCs w:val="21"/>
@@ -1721,7 +2148,7 @@
       <w:proofErr w:type="spellEnd"/>
       <w:r>
         <w:rPr>
-          <w:rFonts w:ascii="Consolas" w:eastAsia="Times New Roman" w:hAnsi="Consolas"/>
+          <w:rFonts w:ascii="Consolas" w:eastAsia="Times New Roman" w:hAnsi="Consolas" w:cs="Times New Roman"/>
           <w:color w:val="CE9178"/>
           <w:sz w:val="21"/>
           <w:szCs w:val="21"/>
@@ -1731,7 +2158,7 @@
       </w:r>
       <w:r>
         <w:rPr>
-          <w:rFonts w:ascii="Consolas" w:eastAsia="Times New Roman" w:hAnsi="Consolas"/>
+          <w:rFonts w:ascii="Consolas" w:eastAsia="Times New Roman" w:hAnsi="Consolas" w:cs="Times New Roman"/>
           <w:color w:val="D4D4D4"/>
           <w:sz w:val="21"/>
           <w:szCs w:val="21"/>
@@ -1741,7 +2168,7 @@
       </w:r>
       <w:r>
         <w:rPr>
-          <w:rFonts w:ascii="Consolas" w:eastAsia="Times New Roman" w:hAnsi="Consolas"/>
+          <w:rFonts w:ascii="Consolas" w:eastAsia="Times New Roman" w:hAnsi="Consolas" w:cs="Times New Roman"/>
           <w:color w:val="CE9178"/>
           <w:sz w:val="21"/>
           <w:szCs w:val="21"/>
@@ -1752,7 +2179,7 @@
       <w:proofErr w:type="spellStart"/>
       <w:r>
         <w:rPr>
-          <w:rFonts w:ascii="Consolas" w:eastAsia="Times New Roman" w:hAnsi="Consolas"/>
+          <w:rFonts w:ascii="Consolas" w:eastAsia="Times New Roman" w:hAnsi="Consolas" w:cs="Times New Roman"/>
           <w:color w:val="CE9178"/>
           <w:sz w:val="21"/>
           <w:szCs w:val="21"/>
@@ -1763,7 +2190,7 @@
       <w:proofErr w:type="spellEnd"/>
       <w:r>
         <w:rPr>
-          <w:rFonts w:ascii="Consolas" w:eastAsia="Times New Roman" w:hAnsi="Consolas"/>
+          <w:rFonts w:ascii="Consolas" w:eastAsia="Times New Roman" w:hAnsi="Consolas" w:cs="Times New Roman"/>
           <w:color w:val="CE9178"/>
           <w:sz w:val="21"/>
           <w:szCs w:val="21"/>
@@ -1773,7 +2200,7 @@
       </w:r>
       <w:r>
         <w:rPr>
-          <w:rFonts w:ascii="Consolas" w:eastAsia="Times New Roman" w:hAnsi="Consolas"/>
+          <w:rFonts w:ascii="Consolas" w:eastAsia="Times New Roman" w:hAnsi="Consolas" w:cs="Times New Roman"/>
           <w:color w:val="D4D4D4"/>
           <w:sz w:val="21"/>
           <w:szCs w:val="21"/>
@@ -1783,7 +2210,7 @@
       </w:r>
       <w:r>
         <w:rPr>
-          <w:rFonts w:ascii="Consolas" w:eastAsia="Times New Roman" w:hAnsi="Consolas"/>
+          <w:rFonts w:ascii="Consolas" w:eastAsia="Times New Roman" w:hAnsi="Consolas" w:cs="Times New Roman"/>
           <w:color w:val="CE9178"/>
           <w:sz w:val="21"/>
           <w:szCs w:val="21"/>
@@ -1794,7 +2221,7 @@
       <w:proofErr w:type="spellStart"/>
       <w:r>
         <w:rPr>
-          <w:rFonts w:ascii="Consolas" w:eastAsia="Times New Roman" w:hAnsi="Consolas"/>
+          <w:rFonts w:ascii="Consolas" w:eastAsia="Times New Roman" w:hAnsi="Consolas" w:cs="Times New Roman"/>
           <w:color w:val="CE9178"/>
           <w:sz w:val="21"/>
           <w:szCs w:val="21"/>
@@ -1805,7 +2232,7 @@
       <w:proofErr w:type="spellEnd"/>
       <w:r>
         <w:rPr>
-          <w:rFonts w:ascii="Consolas" w:eastAsia="Times New Roman" w:hAnsi="Consolas"/>
+          <w:rFonts w:ascii="Consolas" w:eastAsia="Times New Roman" w:hAnsi="Consolas" w:cs="Times New Roman"/>
           <w:color w:val="CE9178"/>
           <w:sz w:val="21"/>
           <w:szCs w:val="21"/>
@@ -1815,7 +2242,7 @@
       </w:r>
       <w:r>
         <w:rPr>
-          <w:rFonts w:ascii="Consolas" w:eastAsia="Times New Roman" w:hAnsi="Consolas"/>
+          <w:rFonts w:ascii="Consolas" w:eastAsia="Times New Roman" w:hAnsi="Consolas" w:cs="Times New Roman"/>
           <w:color w:val="D4D4D4"/>
           <w:sz w:val="21"/>
           <w:szCs w:val="21"/>
@@ -1826,8 +2253,10 @@
     </w:p>
     <w:p>
       <w:pPr>
-        <w:rPr>
-          <w:rFonts w:ascii="Consolas" w:eastAsia="Times New Roman" w:hAnsi="Consolas"/>
+        <w:shd w:val="clear" w:color="auto" w:fill="1F1F1F"/>
+        <w:spacing w:line="285" w:lineRule="atLeast"/>
+        <w:rPr>
+          <w:rFonts w:ascii="Consolas" w:eastAsia="Times New Roman" w:hAnsi="Consolas" w:cs="Times New Roman"/>
           <w:color w:val="CCCCCC"/>
           <w:sz w:val="21"/>
           <w:szCs w:val="21"/>
@@ -1836,7 +2265,7 @@
       </w:pPr>
       <w:r>
         <w:rPr>
-          <w:rFonts w:ascii="Consolas" w:eastAsia="Times New Roman" w:hAnsi="Consolas"/>
+          <w:rFonts w:ascii="Consolas" w:eastAsia="Times New Roman" w:hAnsi="Consolas" w:cs="Times New Roman"/>
           <w:color w:val="D4D4D4"/>
           <w:sz w:val="21"/>
           <w:szCs w:val="21"/>
@@ -1847,7 +2276,7 @@
       <w:proofErr w:type="spellStart"/>
       <w:r>
         <w:rPr>
-          <w:rFonts w:ascii="Consolas" w:eastAsia="Times New Roman" w:hAnsi="Consolas"/>
+          <w:rFonts w:ascii="Consolas" w:eastAsia="Times New Roman" w:hAnsi="Consolas" w:cs="Times New Roman"/>
           <w:color w:val="9CDCFE"/>
           <w:sz w:val="21"/>
           <w:szCs w:val="21"/>
@@ -1858,7 +2287,7 @@
       <w:proofErr w:type="spellEnd"/>
       <w:r>
         <w:rPr>
-          <w:rFonts w:ascii="Consolas" w:eastAsia="Times New Roman" w:hAnsi="Consolas"/>
+          <w:rFonts w:ascii="Consolas" w:eastAsia="Times New Roman" w:hAnsi="Consolas" w:cs="Times New Roman"/>
           <w:color w:val="D4D4D4"/>
           <w:sz w:val="21"/>
           <w:szCs w:val="21"/>
@@ -1868,7 +2297,7 @@
       </w:r>
       <w:r>
         <w:rPr>
-          <w:rFonts w:ascii="Consolas" w:eastAsia="Times New Roman" w:hAnsi="Consolas"/>
+          <w:rFonts w:ascii="Consolas" w:eastAsia="Times New Roman" w:hAnsi="Consolas" w:cs="Times New Roman"/>
           <w:color w:val="B5CEA8"/>
           <w:sz w:val="21"/>
           <w:szCs w:val="21"/>
@@ -1878,7 +2307,7 @@
       </w:r>
       <w:r>
         <w:rPr>
-          <w:rFonts w:ascii="Consolas" w:eastAsia="Times New Roman" w:hAnsi="Consolas"/>
+          <w:rFonts w:ascii="Consolas" w:eastAsia="Times New Roman" w:hAnsi="Consolas" w:cs="Times New Roman"/>
           <w:color w:val="D4D4D4"/>
           <w:sz w:val="21"/>
           <w:szCs w:val="21"/>
@@ -1889,8 +2318,10 @@
     </w:p>
     <w:p>
       <w:pPr>
-        <w:rPr>
-          <w:rFonts w:ascii="Consolas" w:eastAsia="Times New Roman" w:hAnsi="Consolas"/>
+        <w:shd w:val="clear" w:color="auto" w:fill="1F1F1F"/>
+        <w:spacing w:line="285" w:lineRule="atLeast"/>
+        <w:rPr>
+          <w:rFonts w:ascii="Consolas" w:eastAsia="Times New Roman" w:hAnsi="Consolas" w:cs="Times New Roman"/>
           <w:color w:val="CCCCCC"/>
           <w:sz w:val="21"/>
           <w:szCs w:val="21"/>
@@ -1899,7 +2330,7 @@
       </w:pPr>
       <w:r>
         <w:rPr>
-          <w:rFonts w:ascii="Consolas" w:eastAsia="Times New Roman" w:hAnsi="Consolas"/>
+          <w:rFonts w:ascii="Consolas" w:eastAsia="Times New Roman" w:hAnsi="Consolas" w:cs="Times New Roman"/>
           <w:color w:val="D4D4D4"/>
           <w:sz w:val="21"/>
           <w:szCs w:val="21"/>
@@ -1910,7 +2341,7 @@
       <w:proofErr w:type="spellStart"/>
       <w:r>
         <w:rPr>
-          <w:rFonts w:ascii="Consolas" w:eastAsia="Times New Roman" w:hAnsi="Consolas"/>
+          <w:rFonts w:ascii="Consolas" w:eastAsia="Times New Roman" w:hAnsi="Consolas" w:cs="Times New Roman"/>
           <w:color w:val="9CDCFE"/>
           <w:sz w:val="21"/>
           <w:szCs w:val="21"/>
@@ -1921,7 +2352,7 @@
       <w:proofErr w:type="spellEnd"/>
       <w:r>
         <w:rPr>
-          <w:rFonts w:ascii="Consolas" w:eastAsia="Times New Roman" w:hAnsi="Consolas"/>
+          <w:rFonts w:ascii="Consolas" w:eastAsia="Times New Roman" w:hAnsi="Consolas" w:cs="Times New Roman"/>
           <w:color w:val="D4D4D4"/>
           <w:sz w:val="21"/>
           <w:szCs w:val="21"/>
@@ -1931,7 +2362,7 @@
       </w:r>
       <w:r>
         <w:rPr>
-          <w:rFonts w:ascii="Consolas" w:eastAsia="Times New Roman" w:hAnsi="Consolas"/>
+          <w:rFonts w:ascii="Consolas" w:eastAsia="Times New Roman" w:hAnsi="Consolas" w:cs="Times New Roman"/>
           <w:color w:val="B5CEA8"/>
           <w:sz w:val="21"/>
           <w:szCs w:val="21"/>
@@ -1941,7 +2372,7 @@
       </w:r>
       <w:r>
         <w:rPr>
-          <w:rFonts w:ascii="Consolas" w:eastAsia="Times New Roman" w:hAnsi="Consolas"/>
+          <w:rFonts w:ascii="Consolas" w:eastAsia="Times New Roman" w:hAnsi="Consolas" w:cs="Times New Roman"/>
           <w:color w:val="D4D4D4"/>
           <w:sz w:val="21"/>
           <w:szCs w:val="21"/>
@@ -1952,8 +2383,10 @@
     </w:p>
     <w:p>
       <w:pPr>
-        <w:rPr>
-          <w:rFonts w:ascii="Consolas" w:eastAsia="Times New Roman" w:hAnsi="Consolas"/>
+        <w:shd w:val="clear" w:color="auto" w:fill="1F1F1F"/>
+        <w:spacing w:line="285" w:lineRule="atLeast"/>
+        <w:rPr>
+          <w:rFonts w:ascii="Consolas" w:eastAsia="Times New Roman" w:hAnsi="Consolas" w:cs="Times New Roman"/>
           <w:color w:val="CCCCCC"/>
           <w:sz w:val="21"/>
           <w:szCs w:val="21"/>
@@ -1962,7 +2395,7 @@
       </w:pPr>
       <w:r>
         <w:rPr>
-          <w:rFonts w:ascii="Consolas" w:eastAsia="Times New Roman" w:hAnsi="Consolas"/>
+          <w:rFonts w:ascii="Consolas" w:eastAsia="Times New Roman" w:hAnsi="Consolas" w:cs="Times New Roman"/>
           <w:color w:val="D4D4D4"/>
           <w:sz w:val="21"/>
           <w:szCs w:val="21"/>
@@ -1972,7 +2405,7 @@
       </w:r>
       <w:r>
         <w:rPr>
-          <w:rFonts w:ascii="Consolas" w:eastAsia="Times New Roman" w:hAnsi="Consolas"/>
+          <w:rFonts w:ascii="Consolas" w:eastAsia="Times New Roman" w:hAnsi="Consolas" w:cs="Times New Roman"/>
           <w:color w:val="9CDCFE"/>
           <w:sz w:val="21"/>
           <w:szCs w:val="21"/>
@@ -1982,7 +2415,7 @@
       </w:r>
       <w:r>
         <w:rPr>
-          <w:rFonts w:ascii="Consolas" w:eastAsia="Times New Roman" w:hAnsi="Consolas"/>
+          <w:rFonts w:ascii="Consolas" w:eastAsia="Times New Roman" w:hAnsi="Consolas" w:cs="Times New Roman"/>
           <w:color w:val="D4D4D4"/>
           <w:sz w:val="21"/>
           <w:szCs w:val="21"/>
@@ -1992,7 +2425,7 @@
       </w:r>
       <w:r>
         <w:rPr>
-          <w:rFonts w:ascii="Consolas" w:eastAsia="Times New Roman" w:hAnsi="Consolas"/>
+          <w:rFonts w:ascii="Consolas" w:eastAsia="Times New Roman" w:hAnsi="Consolas" w:cs="Times New Roman"/>
           <w:color w:val="CE9178"/>
           <w:sz w:val="21"/>
           <w:szCs w:val="21"/>
@@ -2002,7 +2435,7 @@
       </w:r>
       <w:r>
         <w:rPr>
-          <w:rFonts w:ascii="Consolas" w:eastAsia="Times New Roman" w:hAnsi="Consolas"/>
+          <w:rFonts w:ascii="Consolas" w:eastAsia="Times New Roman" w:hAnsi="Consolas" w:cs="Times New Roman"/>
           <w:color w:val="D4D4D4"/>
           <w:sz w:val="21"/>
           <w:szCs w:val="21"/>
@@ -2013,8 +2446,10 @@
     </w:p>
     <w:p>
       <w:pPr>
-        <w:rPr>
-          <w:rFonts w:ascii="Consolas" w:eastAsia="Times New Roman" w:hAnsi="Consolas"/>
+        <w:shd w:val="clear" w:color="auto" w:fill="1F1F1F"/>
+        <w:spacing w:line="285" w:lineRule="atLeast"/>
+        <w:rPr>
+          <w:rFonts w:ascii="Consolas" w:eastAsia="Times New Roman" w:hAnsi="Consolas" w:cs="Times New Roman"/>
           <w:color w:val="CCCCCC"/>
           <w:sz w:val="21"/>
           <w:szCs w:val="21"/>
@@ -2023,7 +2458,7 @@
       </w:pPr>
       <w:r>
         <w:rPr>
-          <w:rFonts w:ascii="Consolas" w:eastAsia="Times New Roman" w:hAnsi="Consolas"/>
+          <w:rFonts w:ascii="Consolas" w:eastAsia="Times New Roman" w:hAnsi="Consolas" w:cs="Times New Roman"/>
           <w:color w:val="D4D4D4"/>
           <w:sz w:val="21"/>
           <w:szCs w:val="21"/>
@@ -2034,7 +2469,7 @@
       <w:proofErr w:type="spellStart"/>
       <w:r>
         <w:rPr>
-          <w:rFonts w:ascii="Consolas" w:eastAsia="Times New Roman" w:hAnsi="Consolas"/>
+          <w:rFonts w:ascii="Consolas" w:eastAsia="Times New Roman" w:hAnsi="Consolas" w:cs="Times New Roman"/>
           <w:color w:val="9CDCFE"/>
           <w:sz w:val="21"/>
           <w:szCs w:val="21"/>
@@ -2045,7 +2480,7 @@
       <w:proofErr w:type="spellEnd"/>
       <w:r>
         <w:rPr>
-          <w:rFonts w:ascii="Consolas" w:eastAsia="Times New Roman" w:hAnsi="Consolas"/>
+          <w:rFonts w:ascii="Consolas" w:eastAsia="Times New Roman" w:hAnsi="Consolas" w:cs="Times New Roman"/>
           <w:color w:val="D4D4D4"/>
           <w:sz w:val="21"/>
           <w:szCs w:val="21"/>
@@ -2055,7 +2490,7 @@
       </w:r>
       <w:r>
         <w:rPr>
-          <w:rFonts w:ascii="Consolas" w:eastAsia="Times New Roman" w:hAnsi="Consolas"/>
+          <w:rFonts w:ascii="Consolas" w:eastAsia="Times New Roman" w:hAnsi="Consolas" w:cs="Times New Roman"/>
           <w:color w:val="CE9178"/>
           <w:sz w:val="21"/>
           <w:szCs w:val="21"/>
@@ -2066,7 +2501,7 @@
       <w:proofErr w:type="spellStart"/>
       <w:r>
         <w:rPr>
-          <w:rFonts w:ascii="Consolas" w:eastAsia="Times New Roman" w:hAnsi="Consolas"/>
+          <w:rFonts w:ascii="Consolas" w:eastAsia="Times New Roman" w:hAnsi="Consolas" w:cs="Times New Roman"/>
           <w:color w:val="CE9178"/>
           <w:sz w:val="21"/>
           <w:szCs w:val="21"/>
@@ -2077,7 +2512,7 @@
       <w:proofErr w:type="spellEnd"/>
       <w:r>
         <w:rPr>
-          <w:rFonts w:ascii="Consolas" w:eastAsia="Times New Roman" w:hAnsi="Consolas"/>
+          <w:rFonts w:ascii="Consolas" w:eastAsia="Times New Roman" w:hAnsi="Consolas" w:cs="Times New Roman"/>
           <w:color w:val="CE9178"/>
           <w:sz w:val="21"/>
           <w:szCs w:val="21"/>
@@ -2087,7 +2522,7 @@
       </w:r>
       <w:r>
         <w:rPr>
-          <w:rFonts w:ascii="Consolas" w:eastAsia="Times New Roman" w:hAnsi="Consolas"/>
+          <w:rFonts w:ascii="Consolas" w:eastAsia="Times New Roman" w:hAnsi="Consolas" w:cs="Times New Roman"/>
           <w:color w:val="D4D4D4"/>
           <w:sz w:val="21"/>
           <w:szCs w:val="21"/>
@@ -2098,8 +2533,10 @@
     </w:p>
     <w:p>
       <w:pPr>
-        <w:rPr>
-          <w:rFonts w:ascii="Consolas" w:eastAsia="Times New Roman" w:hAnsi="Consolas"/>
+        <w:shd w:val="clear" w:color="auto" w:fill="1F1F1F"/>
+        <w:spacing w:line="285" w:lineRule="atLeast"/>
+        <w:rPr>
+          <w:rFonts w:ascii="Consolas" w:eastAsia="Times New Roman" w:hAnsi="Consolas" w:cs="Times New Roman"/>
           <w:color w:val="CCCCCC"/>
           <w:sz w:val="21"/>
           <w:szCs w:val="21"/>
@@ -2108,7 +2545,7 @@
       </w:pPr>
       <w:r>
         <w:rPr>
-          <w:rFonts w:ascii="Consolas" w:eastAsia="Times New Roman" w:hAnsi="Consolas"/>
+          <w:rFonts w:ascii="Consolas" w:eastAsia="Times New Roman" w:hAnsi="Consolas" w:cs="Times New Roman"/>
           <w:color w:val="D4D4D4"/>
           <w:sz w:val="21"/>
           <w:szCs w:val="21"/>
@@ -2248,6 +2685,9 @@
       </w:r>
     </w:p>
     <w:p>
+      <w:pPr>
+        <w:pStyle w:val="Heading2"/>
+      </w:pPr>
       <w:r>
         <w:t>2.4. Architektura inferencji i konwersja modelu</w:t>
       </w:r>
@@ -2255,7 +2695,6 @@
     <w:p/>
     <w:p>
       <w:r>
-        <w:lastRenderedPageBreak/>
         <w:t>Kluczowym wymaganiem projektowym była optymalizacja procesu inferencji, aby umożliwić działanie modelu w środowisku o ograniczonych zasobach, przy jednoczesnym zachowaniu akceptowalnego czasu odpowiedzi.</w:t>
       </w:r>
     </w:p>
@@ -2283,6 +2722,9 @@
     </w:p>
     <w:p/>
     <w:p>
+      <w:pPr>
+        <w:pStyle w:val="Heading2"/>
+      </w:pPr>
       <w:r>
         <w:t>2.5. Implementacja systemu automatycznej ewaluacji (Auto-Benchmark)</w:t>
       </w:r>
@@ -2322,6 +2764,9 @@
     </w:p>
     <w:p/>
     <w:p>
+      <w:pPr>
+        <w:pStyle w:val="Heading2"/>
+      </w:pPr>
       <w:r>
         <w:t>2.6. Projekt i architektura Systemu Inżynierskiego (MLOps Loop)</w:t>
       </w:r>
@@ -2340,8 +2785,10 @@
     </w:p>
     <w:p>
       <w:pPr>
-        <w:rPr>
-          <w:rFonts w:ascii="Consolas" w:eastAsia="Times New Roman" w:hAnsi="Consolas"/>
+        <w:shd w:val="clear" w:color="auto" w:fill="1F1F1F"/>
+        <w:spacing w:line="285" w:lineRule="atLeast"/>
+        <w:rPr>
+          <w:rFonts w:ascii="Consolas" w:eastAsia="Times New Roman" w:hAnsi="Consolas" w:cs="Times New Roman"/>
           <w:color w:val="CCCCCC"/>
           <w:sz w:val="21"/>
           <w:szCs w:val="21"/>
@@ -2349,7 +2796,7 @@
       </w:pPr>
       <w:r>
         <w:rPr>
-          <w:rFonts w:ascii="Consolas" w:eastAsia="Times New Roman" w:hAnsi="Consolas"/>
+          <w:rFonts w:ascii="Consolas" w:eastAsia="Times New Roman" w:hAnsi="Consolas" w:cs="Times New Roman"/>
           <w:color w:val="6A9955"/>
           <w:sz w:val="21"/>
           <w:szCs w:val="21"/>
@@ -2359,8 +2806,10 @@
     </w:p>
     <w:p>
       <w:pPr>
-        <w:rPr>
-          <w:rFonts w:ascii="Consolas" w:eastAsia="Times New Roman" w:hAnsi="Consolas"/>
+        <w:shd w:val="clear" w:color="auto" w:fill="1F1F1F"/>
+        <w:spacing w:line="285" w:lineRule="atLeast"/>
+        <w:rPr>
+          <w:rFonts w:ascii="Consolas" w:eastAsia="Times New Roman" w:hAnsi="Consolas" w:cs="Times New Roman"/>
           <w:color w:val="CCCCCC"/>
           <w:sz w:val="21"/>
           <w:szCs w:val="21"/>
@@ -2370,7 +2819,7 @@
       <w:proofErr w:type="spellStart"/>
       <w:r>
         <w:rPr>
-          <w:rFonts w:ascii="Consolas" w:eastAsia="Times New Roman" w:hAnsi="Consolas"/>
+          <w:rFonts w:ascii="Consolas" w:eastAsia="Times New Roman" w:hAnsi="Consolas" w:cs="Times New Roman"/>
           <w:color w:val="D4D4D4"/>
           <w:sz w:val="21"/>
           <w:szCs w:val="21"/>
@@ -2381,7 +2830,7 @@
       <w:proofErr w:type="spellEnd"/>
       <w:r>
         <w:rPr>
-          <w:rFonts w:ascii="Consolas" w:eastAsia="Times New Roman" w:hAnsi="Consolas"/>
+          <w:rFonts w:ascii="Consolas" w:eastAsia="Times New Roman" w:hAnsi="Consolas" w:cs="Times New Roman"/>
           <w:color w:val="D4D4D4"/>
           <w:sz w:val="21"/>
           <w:szCs w:val="21"/>
@@ -2392,7 +2841,7 @@
       <w:proofErr w:type="spellStart"/>
       <w:r>
         <w:rPr>
-          <w:rFonts w:ascii="Consolas" w:eastAsia="Times New Roman" w:hAnsi="Consolas"/>
+          <w:rFonts w:ascii="Consolas" w:eastAsia="Times New Roman" w:hAnsi="Consolas" w:cs="Times New Roman"/>
           <w:color w:val="569CD6"/>
           <w:sz w:val="21"/>
           <w:szCs w:val="21"/>
@@ -2402,7 +2851,7 @@
       </w:r>
       <w:r>
         <w:rPr>
-          <w:rFonts w:ascii="Consolas" w:eastAsia="Times New Roman" w:hAnsi="Consolas"/>
+          <w:rFonts w:ascii="Consolas" w:eastAsia="Times New Roman" w:hAnsi="Consolas" w:cs="Times New Roman"/>
           <w:color w:val="CE9178"/>
           <w:sz w:val="21"/>
           <w:szCs w:val="21"/>
@@ -2413,7 +2862,7 @@
       <w:proofErr w:type="spellEnd"/>
       <w:r>
         <w:rPr>
-          <w:rFonts w:ascii="Consolas" w:eastAsia="Times New Roman" w:hAnsi="Consolas"/>
+          <w:rFonts w:ascii="Consolas" w:eastAsia="Times New Roman" w:hAnsi="Consolas" w:cs="Times New Roman"/>
           <w:color w:val="CE9178"/>
           <w:sz w:val="21"/>
           <w:szCs w:val="21"/>
@@ -2425,7 +2874,7 @@
       <w:proofErr w:type="gramStart"/>
       <w:r>
         <w:rPr>
-          <w:rFonts w:ascii="Consolas" w:eastAsia="Times New Roman" w:hAnsi="Consolas"/>
+          <w:rFonts w:ascii="Consolas" w:eastAsia="Times New Roman" w:hAnsi="Consolas" w:cs="Times New Roman"/>
           <w:color w:val="CE9178"/>
           <w:sz w:val="21"/>
           <w:szCs w:val="21"/>
@@ -2436,7 +2885,7 @@
       <w:proofErr w:type="gramEnd"/>
       <w:r>
         <w:rPr>
-          <w:rFonts w:ascii="Consolas" w:eastAsia="Times New Roman" w:hAnsi="Consolas"/>
+          <w:rFonts w:ascii="Consolas" w:eastAsia="Times New Roman" w:hAnsi="Consolas" w:cs="Times New Roman"/>
           <w:color w:val="CE9178"/>
           <w:sz w:val="21"/>
           <w:szCs w:val="21"/>
@@ -2447,7 +2896,7 @@
       <w:proofErr w:type="spellEnd"/>
       <w:r>
         <w:rPr>
-          <w:rFonts w:ascii="Consolas" w:eastAsia="Times New Roman" w:hAnsi="Consolas"/>
+          <w:rFonts w:ascii="Consolas" w:eastAsia="Times New Roman" w:hAnsi="Consolas" w:cs="Times New Roman"/>
           <w:color w:val="CE9178"/>
           <w:sz w:val="21"/>
           <w:szCs w:val="21"/>
@@ -2457,7 +2906,7 @@
       </w:r>
       <w:r>
         <w:rPr>
-          <w:rFonts w:ascii="Consolas" w:eastAsia="Times New Roman" w:hAnsi="Consolas"/>
+          <w:rFonts w:ascii="Consolas" w:eastAsia="Times New Roman" w:hAnsi="Consolas" w:cs="Times New Roman"/>
           <w:color w:val="569CD6"/>
           <w:sz w:val="21"/>
           <w:szCs w:val="21"/>
@@ -2468,7 +2917,7 @@
       <w:proofErr w:type="spellStart"/>
       <w:r>
         <w:rPr>
-          <w:rFonts w:ascii="Consolas" w:eastAsia="Times New Roman" w:hAnsi="Consolas"/>
+          <w:rFonts w:ascii="Consolas" w:eastAsia="Times New Roman" w:hAnsi="Consolas" w:cs="Times New Roman"/>
           <w:color w:val="D4D4D4"/>
           <w:sz w:val="21"/>
           <w:szCs w:val="21"/>
@@ -2479,7 +2928,7 @@
       <w:proofErr w:type="spellEnd"/>
       <w:r>
         <w:rPr>
-          <w:rFonts w:ascii="Consolas" w:eastAsia="Times New Roman" w:hAnsi="Consolas"/>
+          <w:rFonts w:ascii="Consolas" w:eastAsia="Times New Roman" w:hAnsi="Consolas" w:cs="Times New Roman"/>
           <w:color w:val="569CD6"/>
           <w:sz w:val="21"/>
           <w:szCs w:val="21"/>
@@ -2489,7 +2938,7 @@
       </w:r>
       <w:r>
         <w:rPr>
-          <w:rFonts w:ascii="Consolas" w:eastAsia="Times New Roman" w:hAnsi="Consolas"/>
+          <w:rFonts w:ascii="Consolas" w:eastAsia="Times New Roman" w:hAnsi="Consolas" w:cs="Times New Roman"/>
           <w:color w:val="CE9178"/>
           <w:sz w:val="21"/>
           <w:szCs w:val="21"/>
@@ -2500,7 +2949,7 @@
       <w:proofErr w:type="gramStart"/>
       <w:r>
         <w:rPr>
-          <w:rFonts w:ascii="Consolas" w:eastAsia="Times New Roman" w:hAnsi="Consolas"/>
+          <w:rFonts w:ascii="Consolas" w:eastAsia="Times New Roman" w:hAnsi="Consolas" w:cs="Times New Roman"/>
           <w:color w:val="CE9178"/>
           <w:sz w:val="21"/>
           <w:szCs w:val="21"/>
@@ -2511,7 +2960,7 @@
       <w:proofErr w:type="gramEnd"/>
       <w:r>
         <w:rPr>
-          <w:rFonts w:ascii="Consolas" w:eastAsia="Times New Roman" w:hAnsi="Consolas"/>
+          <w:rFonts w:ascii="Consolas" w:eastAsia="Times New Roman" w:hAnsi="Consolas" w:cs="Times New Roman"/>
           <w:color w:val="CE9178"/>
           <w:sz w:val="21"/>
           <w:szCs w:val="21"/>
@@ -2521,7 +2970,7 @@
       </w:r>
       <w:r>
         <w:rPr>
-          <w:rFonts w:ascii="Consolas" w:eastAsia="Times New Roman" w:hAnsi="Consolas"/>
+          <w:rFonts w:ascii="Consolas" w:eastAsia="Times New Roman" w:hAnsi="Consolas" w:cs="Times New Roman"/>
           <w:color w:val="569CD6"/>
           <w:sz w:val="21"/>
           <w:szCs w:val="21"/>
@@ -2532,7 +2981,7 @@
       <w:proofErr w:type="spellStart"/>
       <w:r>
         <w:rPr>
-          <w:rFonts w:ascii="Consolas" w:eastAsia="Times New Roman" w:hAnsi="Consolas"/>
+          <w:rFonts w:ascii="Consolas" w:eastAsia="Times New Roman" w:hAnsi="Consolas" w:cs="Times New Roman"/>
           <w:color w:val="D4D4D4"/>
           <w:sz w:val="21"/>
           <w:szCs w:val="21"/>
@@ -2543,7 +2992,7 @@
       <w:proofErr w:type="spellEnd"/>
       <w:r>
         <w:rPr>
-          <w:rFonts w:ascii="Consolas" w:eastAsia="Times New Roman" w:hAnsi="Consolas"/>
+          <w:rFonts w:ascii="Consolas" w:eastAsia="Times New Roman" w:hAnsi="Consolas" w:cs="Times New Roman"/>
           <w:color w:val="569CD6"/>
           <w:sz w:val="21"/>
           <w:szCs w:val="21"/>
@@ -2553,7 +3002,7 @@
       </w:r>
       <w:r>
         <w:rPr>
-          <w:rFonts w:ascii="Consolas" w:eastAsia="Times New Roman" w:hAnsi="Consolas"/>
+          <w:rFonts w:ascii="Consolas" w:eastAsia="Times New Roman" w:hAnsi="Consolas" w:cs="Times New Roman"/>
           <w:color w:val="CE9178"/>
           <w:sz w:val="21"/>
           <w:szCs w:val="21"/>
@@ -2564,8 +3013,10 @@
     </w:p>
     <w:p>
       <w:pPr>
-        <w:rPr>
-          <w:rFonts w:ascii="Consolas" w:eastAsia="Times New Roman" w:hAnsi="Consolas"/>
+        <w:shd w:val="clear" w:color="auto" w:fill="1F1F1F"/>
+        <w:spacing w:line="285" w:lineRule="atLeast"/>
+        <w:rPr>
+          <w:rFonts w:ascii="Consolas" w:eastAsia="Times New Roman" w:hAnsi="Consolas" w:cs="Times New Roman"/>
           <w:color w:val="CCCCCC"/>
           <w:sz w:val="21"/>
           <w:szCs w:val="21"/>
@@ -2574,7 +3025,7 @@
       </w:pPr>
       <w:r>
         <w:rPr>
-          <w:rFonts w:ascii="Consolas" w:eastAsia="Times New Roman" w:hAnsi="Consolas"/>
+          <w:rFonts w:ascii="Consolas" w:eastAsia="Times New Roman" w:hAnsi="Consolas" w:cs="Times New Roman"/>
           <w:color w:val="D4D4D4"/>
           <w:sz w:val="21"/>
           <w:szCs w:val="21"/>
@@ -2586,7 +3037,7 @@
       <w:proofErr w:type="gramStart"/>
       <w:r>
         <w:rPr>
-          <w:rFonts w:ascii="Consolas" w:eastAsia="Times New Roman" w:hAnsi="Consolas"/>
+          <w:rFonts w:ascii="Consolas" w:eastAsia="Times New Roman" w:hAnsi="Consolas" w:cs="Times New Roman"/>
           <w:color w:val="D4D4D4"/>
           <w:sz w:val="21"/>
           <w:szCs w:val="21"/>
@@ -2598,7 +3049,7 @@
       <w:proofErr w:type="gramEnd"/>
       <w:r>
         <w:rPr>
-          <w:rFonts w:ascii="Consolas" w:eastAsia="Times New Roman" w:hAnsi="Consolas"/>
+          <w:rFonts w:ascii="Consolas" w:eastAsia="Times New Roman" w:hAnsi="Consolas" w:cs="Times New Roman"/>
           <w:color w:val="D4D4D4"/>
           <w:sz w:val="21"/>
           <w:szCs w:val="21"/>
@@ -2609,7 +3060,7 @@
       <w:proofErr w:type="spellStart"/>
       <w:r>
         <w:rPr>
-          <w:rFonts w:ascii="Consolas" w:eastAsia="Times New Roman" w:hAnsi="Consolas"/>
+          <w:rFonts w:ascii="Consolas" w:eastAsia="Times New Roman" w:hAnsi="Consolas" w:cs="Times New Roman"/>
           <w:color w:val="D4D4D4"/>
           <w:sz w:val="21"/>
           <w:szCs w:val="21"/>
@@ -2620,7 +3071,7 @@
       <w:proofErr w:type="spellEnd"/>
       <w:r>
         <w:rPr>
-          <w:rFonts w:ascii="Consolas" w:eastAsia="Times New Roman" w:hAnsi="Consolas"/>
+          <w:rFonts w:ascii="Consolas" w:eastAsia="Times New Roman" w:hAnsi="Consolas" w:cs="Times New Roman"/>
           <w:color w:val="D4D4D4"/>
           <w:sz w:val="21"/>
           <w:szCs w:val="21"/>
@@ -2630,7 +3081,7 @@
       </w:r>
       <w:r>
         <w:rPr>
-          <w:rFonts w:ascii="Consolas" w:eastAsia="Times New Roman" w:hAnsi="Consolas"/>
+          <w:rFonts w:ascii="Consolas" w:eastAsia="Times New Roman" w:hAnsi="Consolas" w:cs="Times New Roman"/>
           <w:color w:val="9CDCFE"/>
           <w:sz w:val="21"/>
           <w:szCs w:val="21"/>
@@ -2640,7 +3091,7 @@
       </w:r>
       <w:r>
         <w:rPr>
-          <w:rFonts w:ascii="Consolas" w:eastAsia="Times New Roman" w:hAnsi="Consolas"/>
+          <w:rFonts w:ascii="Consolas" w:eastAsia="Times New Roman" w:hAnsi="Consolas" w:cs="Times New Roman"/>
           <w:color w:val="D4D4D4"/>
           <w:sz w:val="21"/>
           <w:szCs w:val="21"/>
@@ -2650,7 +3101,7 @@
       </w:r>
       <w:r>
         <w:rPr>
-          <w:rFonts w:ascii="Consolas" w:eastAsia="Times New Roman" w:hAnsi="Consolas"/>
+          <w:rFonts w:ascii="Consolas" w:eastAsia="Times New Roman" w:hAnsi="Consolas" w:cs="Times New Roman"/>
           <w:color w:val="569CD6"/>
           <w:sz w:val="21"/>
           <w:szCs w:val="21"/>
@@ -2660,7 +3111,7 @@
       </w:r>
       <w:r>
         <w:rPr>
-          <w:rFonts w:ascii="Consolas" w:eastAsia="Times New Roman" w:hAnsi="Consolas"/>
+          <w:rFonts w:ascii="Consolas" w:eastAsia="Times New Roman" w:hAnsi="Consolas" w:cs="Times New Roman"/>
           <w:color w:val="D4D4D4"/>
           <w:sz w:val="21"/>
           <w:szCs w:val="21"/>
@@ -2671,7 +3122,7 @@
       <w:proofErr w:type="spellStart"/>
       <w:r>
         <w:rPr>
-          <w:rFonts w:ascii="Consolas" w:eastAsia="Times New Roman" w:hAnsi="Consolas"/>
+          <w:rFonts w:ascii="Consolas" w:eastAsia="Times New Roman" w:hAnsi="Consolas" w:cs="Times New Roman"/>
           <w:color w:val="9CDCFE"/>
           <w:sz w:val="21"/>
           <w:szCs w:val="21"/>
@@ -2682,7 +3133,7 @@
       <w:proofErr w:type="spellEnd"/>
       <w:r>
         <w:rPr>
-          <w:rFonts w:ascii="Consolas" w:eastAsia="Times New Roman" w:hAnsi="Consolas"/>
+          <w:rFonts w:ascii="Consolas" w:eastAsia="Times New Roman" w:hAnsi="Consolas" w:cs="Times New Roman"/>
           <w:color w:val="D4D4D4"/>
           <w:sz w:val="21"/>
           <w:szCs w:val="21"/>
@@ -2693,7 +3144,7 @@
       <w:proofErr w:type="spellStart"/>
       <w:r>
         <w:rPr>
-          <w:rFonts w:ascii="Consolas" w:eastAsia="Times New Roman" w:hAnsi="Consolas"/>
+          <w:rFonts w:ascii="Consolas" w:eastAsia="Times New Roman" w:hAnsi="Consolas" w:cs="Times New Roman"/>
           <w:color w:val="D4D4D4"/>
           <w:sz w:val="21"/>
           <w:szCs w:val="21"/>
@@ -2704,7 +3155,7 @@
       <w:proofErr w:type="spellEnd"/>
       <w:r>
         <w:rPr>
-          <w:rFonts w:ascii="Consolas" w:eastAsia="Times New Roman" w:hAnsi="Consolas"/>
+          <w:rFonts w:ascii="Consolas" w:eastAsia="Times New Roman" w:hAnsi="Consolas" w:cs="Times New Roman"/>
           <w:color w:val="D4D4D4"/>
           <w:sz w:val="21"/>
           <w:szCs w:val="21"/>
@@ -2714,7 +3165,7 @@
       </w:r>
       <w:r>
         <w:rPr>
-          <w:rFonts w:ascii="Consolas" w:eastAsia="Times New Roman" w:hAnsi="Consolas"/>
+          <w:rFonts w:ascii="Consolas" w:eastAsia="Times New Roman" w:hAnsi="Consolas" w:cs="Times New Roman"/>
           <w:color w:val="9CDCFE"/>
           <w:sz w:val="21"/>
           <w:szCs w:val="21"/>
@@ -2724,7 +3175,7 @@
       </w:r>
       <w:r>
         <w:rPr>
-          <w:rFonts w:ascii="Consolas" w:eastAsia="Times New Roman" w:hAnsi="Consolas"/>
+          <w:rFonts w:ascii="Consolas" w:eastAsia="Times New Roman" w:hAnsi="Consolas" w:cs="Times New Roman"/>
           <w:color w:val="D4D4D4"/>
           <w:sz w:val="21"/>
           <w:szCs w:val="21"/>
@@ -2736,7 +3187,7 @@
       <w:proofErr w:type="gramStart"/>
       <w:r>
         <w:rPr>
-          <w:rFonts w:ascii="Consolas" w:eastAsia="Times New Roman" w:hAnsi="Consolas"/>
+          <w:rFonts w:ascii="Consolas" w:eastAsia="Times New Roman" w:hAnsi="Consolas" w:cs="Times New Roman"/>
           <w:color w:val="D4D4D4"/>
           <w:sz w:val="21"/>
           <w:szCs w:val="21"/>
@@ -2748,7 +3199,7 @@
       <w:proofErr w:type="gramEnd"/>
       <w:r>
         <w:rPr>
-          <w:rFonts w:ascii="Consolas" w:eastAsia="Times New Roman" w:hAnsi="Consolas"/>
+          <w:rFonts w:ascii="Consolas" w:eastAsia="Times New Roman" w:hAnsi="Consolas" w:cs="Times New Roman"/>
           <w:color w:val="D4D4D4"/>
           <w:sz w:val="21"/>
           <w:szCs w:val="21"/>
@@ -2764,7 +3215,11 @@
     </w:p>
     <w:p>
       <w:r>
-        <w:t>3. Decyzji o Wdrożeniu: Logiki, która po zakończeniu automatycznego benchmarku zwraca wyniki do eksperta, zapalając odpowiednie wskaźniki w interfejsie graficznym. Interfejs podświetla na zielono lub czerwono kluczowe metryki, ułatwiając podjęcie decyzji. Ekspert zachowuje jednak pełną kontrolę – może zatwierdzić wdrożenie – dynamiczną wymianę modelu (tzw. Hot-Swap) na produkcję poprzez kliknięcie przycisku "Wdroż", nawet jeśli wyniki numeryczne uległy pogorszeniu, jeśli np. uzna, że nowa wersja lepiej radzi sobie z najcięższymi przypadkami brzegowymi.</w:t>
+        <w:t xml:space="preserve">3. Decyzji o Wdrożeniu: Logiki, która po zakończeniu automatycznego benchmarku zwraca wyniki do eksperta, zapalając odpowiednie wskaźniki w interfejsie graficznym. Interfejs podświetla na zielono lub czerwono kluczowe metryki, ułatwiając podjęcie decyzji. Ekspert zachowuje jednak pełną kontrolę – może zatwierdzić wdrożenie – dynamiczną wymianę </w:t>
+      </w:r>
+      <w:r>
+        <w:lastRenderedPageBreak/>
+        <w:t>modelu (tzw. Hot-Swap) na produkcję poprzez kliknięcie przycisku "Wdroż", nawet jeśli wyniki numeryczne uległy pogorszeniu, jeśli np. uzna, że nowa wersja lepiej radzi sobie z najcięższymi przypadkami brzegowymi.</w:t>
       </w:r>
     </w:p>
     <w:p/>
@@ -2811,14 +3266,21 @@
         <w:t>W przypadku zatwierdzenia, skompiluj adapter do formatu GGUF (z wykorzystaniem narzędzi llama.cpp; Gerganov, 2023) i podmień aktualny model produkcyjny w serwerze Ollama.</w:t>
       </w:r>
     </w:p>
+    <w:p>
+      <w:r>
+        <w:t>Świadomie zrezygnowano z pełnej automatyzacji wdrożeń, pozostawiając ostateczną decyzję ekspertowi, ponieważ metryki ilościowe nie zawsze odzwierciedlają jakość zachowania modelu w przypadkach brzegowych.</w:t>
+      </w:r>
+    </w:p>
     <w:p/>
     <w:p>
-      <w:pPr/>
       <w:r>
         <w:t>System korzysta z dwuwarstwowego modelu przechowywania danych. Baza SQLite (disinfo_system.db) rejestruje metadane przebiegów treningowych w tabeli TrainingRun (identyfikator, ramy czasowe, wyniki F1 przed i po douczaniu, status, ścieżka adaptera). Warstwa plików systemowych przechowuje: zbiór referencyjny do ewaluacji (model/dataset/mipd_test.jsonl — stały zbiór testowy z adnotacjami gold-label), checkpointy adapterów LoRA (katalog model/latest/) oraz raporty benchmarkowe z podziałem na warianty (model/benchmark-reports/). Gorąca wymiana modelu produkcyjnego polega na konwersji adaptera do formatu GGUF i przeładowaniu serwera Ollama.</w:t>
       </w:r>
     </w:p>
     <w:p>
+      <w:pPr>
+        <w:pStyle w:val="Heading2"/>
+      </w:pPr>
       <w:r>
         <w:t>2.7. Ograniczenia projektu</w:t>
       </w:r>
@@ -2837,17 +3299,17 @@
     </w:p>
     <w:p>
       <w:r>
+        <w:t>Niezbalansowanie zbioru danych: Zbiór treningowy charakteryzuje się znaczną nadreprezentacją próbek pustych (brak technik manipulacji), co wpływa na "konserwatywność" modelu – tendencję do nieoznaczania technik w przypadkach niejednoznacznych, aby zminimalizować liczbę fałszywych alarmów.</w:t>
+      </w:r>
+    </w:p>
+    <w:p>
+      <w:r>
+        <w:t>Uproszczona autoryzacja eksperta: Funkcjonalność logowania eksperta została zaimplementowana w formie uproszczonego przełącznika interfejsu (mock), pomijając zaawansowane mechanizmy uwierzytelniania (RBAC), co byłoby wymagane przy wdrożeniu komercyjnym.</w:t>
+      </w:r>
+    </w:p>
+    <w:p>
+      <w:r>
         <w:lastRenderedPageBreak/>
-        <w:t>Niezbalansowanie zbioru danych: Zbiór treningowy charakteryzuje się znaczną nadreprezentacją próbek pustych (brak technik manipulacji), co wpływa na "konserwatywność" modelu – tendencję do nieoznaczania technik w przypadkach niejednoznacznych, aby zminimalizować liczbę fałszywych alarmów.</w:t>
-      </w:r>
-    </w:p>
-    <w:p>
-      <w:r>
-        <w:t>Uproszczona autoryzacja eksperta: Funkcjonalność logowania eksperta została zaimplementowana w formie uproszczonego przełącznika interfejsu (mock), pomijając zaawansowane mechanizmy uwierzytelniania (RBAC), co byłoby wymagane przy wdrożeniu komercyjnym.</w:t>
-      </w:r>
-    </w:p>
-    <w:p>
-      <w:r>
         <w:t>Brak formalnej walidacji jakości wyjaśnień: Oceniono głównie poprawność klasyfikacji (wykrycie tagu). Jakość generowanych wyjaśnień (NLE) nie została poddana rygorystycznej ocenie z udziałem grupy sędziów kompetentnych (human evaluation), co jest standardem w pracach ściśle badawczych.</w:t>
       </w:r>
     </w:p>
@@ -2873,6 +3335,9 @@
     </w:p>
     <w:p/>
     <w:p>
+      <w:pPr>
+        <w:pStyle w:val="Heading2"/>
+      </w:pPr>
       <w:r>
         <w:t>2.8. Analiza wydajności i wyniki eksperymentalne</w:t>
       </w:r>
@@ -2894,7 +3359,6 @@
     </w:p>
     <w:p>
       <w:r>
-        <w:lastRenderedPageBreak/>
         <w:t>1. No Adapter: Model bazowy (Bielik-4.5B-Instruct) bez dostrajania.</w:t>
       </w:r>
     </w:p>
@@ -2911,7 +3375,13 @@
     <w:p/>
     <w:p>
       <w:r>
-        <w:t>Tabela 1. Zestawienie wyników ewaluacji (zbiór testowy N=1521).</w:t>
+        <w:t xml:space="preserve">Tabela </w:t>
+      </w:r>
+      <w:r>
+        <w:t>2</w:t>
+      </w:r>
+      <w:r>
+        <w:t>. Zestawienie wyników ewaluacji (zbiór testowy N=1521).</w:t>
       </w:r>
     </w:p>
     <w:tbl>
@@ -2975,6 +3445,7 @@
           </w:tcPr>
           <w:p>
             <w:r>
+              <w:lastRenderedPageBreak/>
               <w:t>Parsing Success Rate (Strict)</w:t>
             </w:r>
           </w:p>
@@ -3158,6 +3629,11 @@
         <w:t>, wprowadzający warstwę wyjaśnialności, uzyskuje obecnie wyniki niższe od literatury (F1 = 0.28). Wskazuje to na istotne wyzwanie inżynierskie: wprowadzenie wyjaśnialności (NLE) wiąże się obecnie z kosztem wydajnościowym (tzw. podatkiem od wyjaśnialności – performance tax). Optymalizacja jakości danych syntetycznych oraz procesu destylacji wiedzy, mająca na celu zbliżenie skuteczności wariantu XAI do poziomu Prototype, stanowi jeden z głównych kierunków dalszych prac.</w:t>
       </w:r>
     </w:p>
+    <w:p>
+      <w:r>
+        <w:t>Należy zauważyć, że metryki nie są w pełni równoważne metodologicznie, ponieważ literatura raportuje weighted F1 dla pełnego zbioru, podczas gdy w niniejszej pracy zastosowano Mean Document-Level F1 dla próbek niepustych.</w:t>
+      </w:r>
+    </w:p>
     <w:p/>
     <w:p>
       <w:r>
@@ -3617,20 +4093,36 @@
         <w:pStyle w:val="Caption"/>
       </w:pPr>
       <w:r>
-        <w:t>Panel ekspertski interfejs</w:t>
-      </w:r>
-    </w:p>
-    <w:p>
+        <w:t>Interfejs p</w:t>
+      </w:r>
+      <w:r>
+        <w:t>anel</w:t>
+      </w:r>
+      <w:r>
+        <w:t>u</w:t>
+      </w:r>
+      <w:r>
+        <w:t xml:space="preserve"> ekspertski</w:t>
+      </w:r>
+      <w:r>
+        <w:t>ego</w:t>
+      </w:r>
+    </w:p>
+    <w:p>
+      <w:pPr>
+        <w:pStyle w:val="Caption"/>
+        <w:keepNext/>
+      </w:pPr>
       <w:r>
         <w:rPr>
           <w:noProof/>
         </w:rPr>
         <w:lastRenderedPageBreak/>
         <w:drawing>
-          <wp:inline distT="0" distB="0" distL="0" distR="0" wp14:anchorId="1FBCEC11" wp14:editId="2FA75102">
+          <wp:inline distT="0" distB="0" distL="0" distR="0" wp14:anchorId="7B0B1212" wp14:editId="3B66C3EE">
             <wp:extent cx="5755640" cy="2720340"/>
             <wp:effectExtent l="0" t="0" r="0" b="3810"/>
-            <wp:docPr id="910981615" name="Picture 1"/>
+            <wp:docPr id="209158438" name="Picture 1"/>
             <wp:cNvGraphicFramePr>
               <a:graphicFrameLocks xmlns:a="http://schemas.openxmlformats.org/drawingml/2006/main" noChangeAspect="1"/>
             </wp:cNvGraphicFramePr>
@@ -3638,7 +4130,7 @@
               <a:graphicData uri="http://schemas.openxmlformats.org/drawingml/2006/picture">
                 <pic:pic xmlns:pic="http://schemas.openxmlformats.org/drawingml/2006/picture">
                   <pic:nvPicPr>
-                    <pic:cNvPr id="910981615" name=""/>
+                    <pic:cNvPr id="209158438" name=""/>
                     <pic:cNvPicPr/>
                   </pic:nvPicPr>
                   <pic:blipFill>
@@ -3666,43 +4158,26 @@
     <w:p>
       <w:pPr>
         <w:pStyle w:val="Caption"/>
-      </w:pPr>
-      <w:r>
-        <w:t>Panel ekspert</w:t>
-      </w:r>
-      <w:r>
-        <w:t>ski</w:t>
-      </w:r>
-      <w:r>
-        <w:t xml:space="preserve"> pokazuje postępy w </w:t>
-      </w:r>
-      <w:r>
-        <w:t>treningu</w:t>
-      </w:r>
-      <w:r>
-        <w:t xml:space="preserve"> i testowaniu po przesłaniu zestawu </w:t>
-      </w:r>
-      <w:r>
-        <w:t>treningowego</w:t>
-      </w:r>
-      <w:r>
-        <w:t xml:space="preserve">. </w:t>
-      </w:r>
-    </w:p>
-    <w:p>
-      <w:pPr>
-        <w:pStyle w:val="Caption"/>
         <w:keepNext/>
       </w:pPr>
       <w:r>
+        <w:t>Interfejs wdrożenia.</w:t>
+      </w:r>
+      <w:r>
         <w:rPr>
           <w:noProof/>
         </w:rPr>
+        <w:t xml:space="preserve"> </w:t>
+      </w:r>
+      <w:r>
+        <w:rPr>
+          <w:noProof/>
+        </w:rPr>
         <w:drawing>
-          <wp:inline distT="0" distB="0" distL="0" distR="0" wp14:anchorId="0CE64EC1" wp14:editId="158FD48B">
-            <wp:extent cx="5755640" cy="2722880"/>
-            <wp:effectExtent l="0" t="0" r="0" b="1270"/>
-            <wp:docPr id="542347481" name="Picture 1"/>
+          <wp:inline distT="0" distB="0" distL="0" distR="0" wp14:anchorId="1057CC3F" wp14:editId="0E65BC30">
+            <wp:extent cx="5096657" cy="5553075"/>
+            <wp:effectExtent l="0" t="0" r="8890" b="0"/>
+            <wp:docPr id="1211525326" name="Picture 2"/>
             <wp:cNvGraphicFramePr>
               <a:graphicFrameLocks xmlns:a="http://schemas.openxmlformats.org/drawingml/2006/main" noChangeAspect="1"/>
             </wp:cNvGraphicFramePr>
@@ -3710,290 +4185,13 @@
               <a:graphicData uri="http://schemas.openxmlformats.org/drawingml/2006/picture">
                 <pic:pic xmlns:pic="http://schemas.openxmlformats.org/drawingml/2006/picture">
                   <pic:nvPicPr>
-                    <pic:cNvPr id="542347481" name=""/>
-                    <pic:cNvPicPr/>
-                  </pic:nvPicPr>
-                  <pic:blipFill>
-                    <a:blip r:embed="rId17"/>
-                    <a:stretch>
-                      <a:fillRect/>
-                    </a:stretch>
-                  </pic:blipFill>
-                  <pic:spPr>
-                    <a:xfrm>
-                      <a:off x="0" y="0"/>
-                      <a:ext cx="5755640" cy="2722880"/>
-                    </a:xfrm>
-                    <a:prstGeom prst="rect">
-                      <a:avLst/>
-                    </a:prstGeom>
-                  </pic:spPr>
-                </pic:pic>
-              </a:graphicData>
-            </a:graphic>
-          </wp:inline>
-        </w:drawing>
-      </w:r>
-    </w:p>
-    <w:p>
-      <w:pPr>
-        <w:pStyle w:val="Caption"/>
-      </w:pPr>
-      <w:r>
-        <w:t>Po szkoleniu i benchmarkingu panel ekspert</w:t>
-      </w:r>
-      <w:r>
-        <w:t>a</w:t>
-      </w:r>
-      <w:r>
-        <w:t xml:space="preserve"> pokazuje wskaźniki, a przycisk wdroz </w:t>
-      </w:r>
-      <w:r>
-        <w:t>model</w:t>
-      </w:r>
-      <w:r>
-        <w:t xml:space="preserve"> </w:t>
-      </w:r>
-      <w:r>
-        <w:t>staje się aktywny.</w:t>
-      </w:r>
-    </w:p>
-    <w:p>
-      <w:pPr>
-        <w:pStyle w:val="Caption"/>
-        <w:keepNext/>
-      </w:pPr>
-      <w:r>
-        <w:rPr>
-          <w:noProof/>
-        </w:rPr>
-        <w:lastRenderedPageBreak/>
-        <w:drawing>
-          <wp:inline distT="0" distB="0" distL="0" distR="0" wp14:anchorId="53FA9972" wp14:editId="0E4F4359">
-            <wp:extent cx="5755640" cy="2722880"/>
-            <wp:effectExtent l="0" t="0" r="0" b="1270"/>
-            <wp:docPr id="118682826" name="Picture 1"/>
-            <wp:cNvGraphicFramePr>
-              <a:graphicFrameLocks xmlns:a="http://schemas.openxmlformats.org/drawingml/2006/main" noChangeAspect="1"/>
-            </wp:cNvGraphicFramePr>
-            <a:graphic xmlns:a="http://schemas.openxmlformats.org/drawingml/2006/main">
-              <a:graphicData uri="http://schemas.openxmlformats.org/drawingml/2006/picture">
-                <pic:pic xmlns:pic="http://schemas.openxmlformats.org/drawingml/2006/picture">
-                  <pic:nvPicPr>
-                    <pic:cNvPr id="118682826" name=""/>
-                    <pic:cNvPicPr/>
-                  </pic:nvPicPr>
-                  <pic:blipFill>
-                    <a:blip r:embed="rId18"/>
-                    <a:stretch>
-                      <a:fillRect/>
-                    </a:stretch>
-                  </pic:blipFill>
-                  <pic:spPr>
-                    <a:xfrm>
-                      <a:off x="0" y="0"/>
-                      <a:ext cx="5755640" cy="2722880"/>
-                    </a:xfrm>
-                    <a:prstGeom prst="rect">
-                      <a:avLst/>
-                    </a:prstGeom>
-                  </pic:spPr>
-                </pic:pic>
-              </a:graphicData>
-            </a:graphic>
-          </wp:inline>
-        </w:drawing>
-      </w:r>
-    </w:p>
-    <w:p>
-      <w:pPr>
-        <w:pStyle w:val="Caption"/>
-      </w:pPr>
-      <w:r>
-        <w:rPr>
-          <w:noProof/>
-        </w:rPr>
-        <mc:AlternateContent>
-          <mc:Choice Requires="wps">
-            <w:drawing>
-              <wp:anchor distT="0" distB="0" distL="114300" distR="114300" simplePos="0" relativeHeight="251663360" behindDoc="0" locked="0" layoutInCell="1" allowOverlap="1" wp14:anchorId="401B6BC3" wp14:editId="6984823A">
-                <wp:simplePos x="0" y="0"/>
-                <wp:positionH relativeFrom="column">
-                  <wp:posOffset>0</wp:posOffset>
-                </wp:positionH>
-                <wp:positionV relativeFrom="paragraph">
-                  <wp:posOffset>3083560</wp:posOffset>
-                </wp:positionV>
-                <wp:extent cx="5755640" cy="635"/>
-                <wp:effectExtent l="0" t="0" r="0" b="0"/>
-                <wp:wrapSquare wrapText="bothSides"/>
-                <wp:docPr id="694308024" name="Text Box 1"/>
-                <wp:cNvGraphicFramePr/>
-                <a:graphic xmlns:a="http://schemas.openxmlformats.org/drawingml/2006/main">
-                  <a:graphicData uri="http://schemas.microsoft.com/office/word/2010/wordprocessingShape">
-                    <wps:wsp>
-                      <wps:cNvSpPr txBox="1"/>
-                      <wps:spPr>
-                        <a:xfrm>
-                          <a:off x="0" y="0"/>
-                          <a:ext cx="5755640" cy="635"/>
-                        </a:xfrm>
-                        <a:prstGeom prst="rect">
-                          <a:avLst/>
-                        </a:prstGeom>
-                        <a:solidFill>
-                          <a:prstClr val="white"/>
-                        </a:solidFill>
-                        <a:ln>
-                          <a:noFill/>
-                        </a:ln>
-                      </wps:spPr>
-                      <wps:txbx>
-                        <w:txbxContent>
-                          <w:p>
-                            <w:pPr>
-                              <w:pStyle w:val="Caption"/>
-                            </w:pPr>
-                            <w:r>
-                              <w:t>Po zmianie koloru koła na zielony, podstawowe wskaźniki są aktualizowane, a nowy model może być używany za pośrednictwem interfejsu użytkownika.</w:t>
-                            </w:r>
-                          </w:p>
-                        </w:txbxContent>
-                      </wps:txbx>
-                      <wps:bodyPr rot="0" spcFirstLastPara="0" vertOverflow="overflow" horzOverflow="overflow" vert="horz" wrap="square" lIns="0" tIns="0" rIns="0" bIns="0" numCol="1" spcCol="0" rtlCol="0" fromWordArt="0" anchor="t" anchorCtr="0" forceAA="0" compatLnSpc="1">
-                        <a:prstTxWarp prst="textNoShape">
-                          <a:avLst/>
-                        </a:prstTxWarp>
-                        <a:spAutoFit/>
-                      </wps:bodyPr>
-                    </wps:wsp>
-                  </a:graphicData>
-                </a:graphic>
-              </wp:anchor>
-            </w:drawing>
-          </mc:Choice>
-          <mc:Fallback>
-            <w:pict>
-              <v:shapetype w14:anchorId="401B6BC3" id="_x0000_t202" coordsize="21600,21600" o:spt="202" path="m,l,21600r21600,l21600,xe">
-                <v:stroke joinstyle="miter"/>
-                <v:path gradientshapeok="t" o:connecttype="rect"/>
-              </v:shapetype>
-              <v:shape id="Text Box 1" o:spid="_x0000_s1026" type="#_x0000_t202" style="position:absolute;margin-left:0;margin-top:242.8pt;width:453.2pt;height:.05pt;z-index:251663360;visibility:visible;mso-wrap-style:square;mso-wrap-distance-left:9pt;mso-wrap-distance-top:0;mso-wrap-distance-right:9pt;mso-wrap-distance-bottom:0;mso-position-horizontal:absolute;mso-position-horizontal-relative:text;mso-position-vertical:absolute;mso-position-vertical-relative:text;v-text-anchor:top" o:gfxdata="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" stroked="f">
-                <v:textbox style="mso-fit-shape-to-text:t" inset="0,0,0,0">
-                  <w:txbxContent>
-                    <w:p>
-                      <w:pPr>
-                        <w:pStyle w:val="Caption"/>
-                      </w:pPr>
-                      <w:r>
-                        <w:t>Po zmianie koloru koła na zielony, podstawowe wskaźniki są aktualizowane, a nowy model może być używany za pośrednictwem interfejsu użytkownika.</w:t>
-                      </w:r>
-                    </w:p>
-                  </w:txbxContent>
-                </v:textbox>
-                <w10:wrap type="square"/>
-              </v:shape>
-            </w:pict>
-          </mc:Fallback>
-        </mc:AlternateContent>
-      </w:r>
-      <w:r>
-        <w:rPr>
-          <w:noProof/>
-        </w:rPr>
-        <w:drawing>
-          <wp:anchor distT="0" distB="0" distL="114300" distR="114300" simplePos="0" relativeHeight="251661312" behindDoc="1" locked="0" layoutInCell="1" allowOverlap="1" wp14:anchorId="0F7835D4" wp14:editId="3E0691F7">
-            <wp:simplePos x="0" y="0"/>
-            <wp:positionH relativeFrom="margin">
-              <wp:align>right</wp:align>
-            </wp:positionH>
-            <wp:positionV relativeFrom="margin">
-              <wp:posOffset>3157869</wp:posOffset>
-            </wp:positionV>
-            <wp:extent cx="5755640" cy="2719705"/>
-            <wp:effectExtent l="0" t="0" r="0" b="4445"/>
-            <wp:wrapSquare wrapText="bothSides"/>
-            <wp:docPr id="1678192666" name="Picture 1"/>
-            <wp:cNvGraphicFramePr>
-              <a:graphicFrameLocks xmlns:a="http://schemas.openxmlformats.org/drawingml/2006/main" noChangeAspect="1"/>
-            </wp:cNvGraphicFramePr>
-            <a:graphic xmlns:a="http://schemas.openxmlformats.org/drawingml/2006/main">
-              <a:graphicData uri="http://schemas.openxmlformats.org/drawingml/2006/picture">
-                <pic:pic xmlns:pic="http://schemas.openxmlformats.org/drawingml/2006/picture">
-                  <pic:nvPicPr>
-                    <pic:cNvPr id="1678192666" name=""/>
-                    <pic:cNvPicPr/>
-                  </pic:nvPicPr>
-                  <pic:blipFill>
-                    <a:blip r:embed="rId19" cstate="print">
-                      <a:extLst>
-                        <a:ext uri="{28A0092B-C50C-407E-A947-70E740481C1C}">
-                          <a14:useLocalDpi xmlns:a14="http://schemas.microsoft.com/office/drawing/2010/main" val="0"/>
-                        </a:ext>
-                      </a:extLst>
-                    </a:blip>
-                    <a:stretch>
-                      <a:fillRect/>
-                    </a:stretch>
-                  </pic:blipFill>
-                  <pic:spPr>
-                    <a:xfrm>
-                      <a:off x="0" y="0"/>
-                      <a:ext cx="5755640" cy="2719705"/>
-                    </a:xfrm>
-                    <a:prstGeom prst="rect">
-                      <a:avLst/>
-                    </a:prstGeom>
-                  </pic:spPr>
-                </pic:pic>
-              </a:graphicData>
-            </a:graphic>
-          </wp:anchor>
-        </w:drawing>
-      </w:r>
-      <w:r>
-        <w:t>Podczas wrdozeni</w:t>
-      </w:r>
-      <w:r>
-        <w:t>a</w:t>
-      </w:r>
-      <w:r>
-        <w:t xml:space="preserve"> koło świeci na żółto</w:t>
-      </w:r>
-    </w:p>
-    <w:p>
-      <w:r>
-        <w:br w:type="page"/>
-      </w:r>
-    </w:p>
-    <w:p>
-      <w:r>
-        <w:rPr>
-          <w:rFonts w:ascii="Times New Roman" w:hAnsi="Times New Roman" w:cs="Times New Roman"/>
-          <w:noProof/>
-          <w:color w:val="FF0000"/>
-          <w:sz w:val="20"/>
-        </w:rPr>
-        <w:lastRenderedPageBreak/>
-        <w:drawing>
-          <wp:inline distT="0" distB="0" distL="0" distR="0" wp14:anchorId="6575F318" wp14:editId="78FBD487">
-            <wp:extent cx="5610609" cy="8721306"/>
-            <wp:effectExtent l="0" t="0" r="9525" b="3810"/>
-            <wp:docPr id="1594061867" name="Picture 8"/>
-            <wp:cNvGraphicFramePr>
-              <a:graphicFrameLocks xmlns:a="http://schemas.openxmlformats.org/drawingml/2006/main" noChangeAspect="1"/>
-            </wp:cNvGraphicFramePr>
-            <a:graphic xmlns:a="http://schemas.openxmlformats.org/drawingml/2006/main">
-              <a:graphicData uri="http://schemas.openxmlformats.org/drawingml/2006/picture">
-                <pic:pic xmlns:pic="http://schemas.openxmlformats.org/drawingml/2006/picture">
-                  <pic:nvPicPr>
-                    <pic:cNvPr id="0" name="Picture 8"/>
+                    <pic:cNvPr id="0" name="Picture 2"/>
                     <pic:cNvPicPr>
                       <a:picLocks noChangeAspect="1" noChangeArrowheads="1"/>
                     </pic:cNvPicPr>
                   </pic:nvPicPr>
                   <pic:blipFill>
-                    <a:blip r:embed="rId20" cstate="print">
+                    <a:blip r:embed="rId17" cstate="print">
                       <a:extLst>
                         <a:ext uri="{28A0092B-C50C-407E-A947-70E740481C1C}">
                           <a14:useLocalDpi xmlns:a14="http://schemas.microsoft.com/office/drawing/2010/main" val="0"/>
@@ -4008,7 +4206,7 @@
                   <pic:spPr bwMode="auto">
                     <a:xfrm>
                       <a:off x="0" y="0"/>
-                      <a:ext cx="5614297" cy="8727039"/>
+                      <a:ext cx="5100180" cy="5556914"/>
                     </a:xfrm>
                     <a:prstGeom prst="rect">
                       <a:avLst/>
@@ -4028,20 +4226,85 @@
     <w:p>
       <w:pPr>
         <w:pStyle w:val="Caption"/>
+      </w:pPr>
+      <w:r>
+        <w:t xml:space="preserve">Diagram architektury </w:t>
+      </w:r>
+      <w:r>
+        <w:t>wnioskowania</w:t>
+      </w:r>
+    </w:p>
+    <w:p>
+      <w:pPr>
+        <w:keepNext/>
+      </w:pPr>
+      <w:r>
         <w:rPr>
           <w:rFonts w:ascii="Times New Roman" w:hAnsi="Times New Roman" w:cs="Times New Roman"/>
+          <w:noProof/>
           <w:color w:val="FF0000"/>
           <w:sz w:val="20"/>
         </w:rPr>
-      </w:pPr>
-      <w:r>
-        <w:t xml:space="preserve">Diagram </w:t>
-      </w:r>
-      <w:r>
-        <w:t xml:space="preserve">architektury </w:t>
-      </w:r>
-      <w:r>
-        <w:t>systemu</w:t>
+        <w:lastRenderedPageBreak/>
+        <w:drawing>
+          <wp:inline distT="0" distB="0" distL="0" distR="0" wp14:anchorId="795AAD49" wp14:editId="3352E69C">
+            <wp:extent cx="2811805" cy="8686800"/>
+            <wp:effectExtent l="0" t="0" r="7620" b="0"/>
+            <wp:docPr id="1281635905" name="Picture 1"/>
+            <wp:cNvGraphicFramePr>
+              <a:graphicFrameLocks xmlns:a="http://schemas.openxmlformats.org/drawingml/2006/main" noChangeAspect="1"/>
+            </wp:cNvGraphicFramePr>
+            <a:graphic xmlns:a="http://schemas.openxmlformats.org/drawingml/2006/main">
+              <a:graphicData uri="http://schemas.openxmlformats.org/drawingml/2006/picture">
+                <pic:pic xmlns:pic="http://schemas.openxmlformats.org/drawingml/2006/picture">
+                  <pic:nvPicPr>
+                    <pic:cNvPr id="0" name="Picture 1"/>
+                    <pic:cNvPicPr>
+                      <a:picLocks noChangeAspect="1" noChangeArrowheads="1"/>
+                    </pic:cNvPicPr>
+                  </pic:nvPicPr>
+                  <pic:blipFill>
+                    <a:blip r:embed="rId18" cstate="print">
+                      <a:extLst>
+                        <a:ext uri="{28A0092B-C50C-407E-A947-70E740481C1C}">
+                          <a14:useLocalDpi xmlns:a14="http://schemas.microsoft.com/office/drawing/2010/main" val="0"/>
+                        </a:ext>
+                      </a:extLst>
+                    </a:blip>
+                    <a:srcRect/>
+                    <a:stretch>
+                      <a:fillRect/>
+                    </a:stretch>
+                  </pic:blipFill>
+                  <pic:spPr bwMode="auto">
+                    <a:xfrm>
+                      <a:off x="0" y="0"/>
+                      <a:ext cx="2813993" cy="8693560"/>
+                    </a:xfrm>
+                    <a:prstGeom prst="rect">
+                      <a:avLst/>
+                    </a:prstGeom>
+                    <a:noFill/>
+                    <a:ln>
+                      <a:noFill/>
+                    </a:ln>
+                  </pic:spPr>
+                </pic:pic>
+              </a:graphicData>
+            </a:graphic>
+          </wp:inline>
+        </w:drawing>
+      </w:r>
+    </w:p>
+    <w:p>
+      <w:pPr>
+        <w:pStyle w:val="Caption"/>
+      </w:pPr>
+      <w:r>
+        <w:t xml:space="preserve">Diagram architektury </w:t>
+      </w:r>
+      <w:r>
+        <w:t>MLOps</w:t>
       </w:r>
     </w:p>
     <w:p>
@@ -4532,7 +4795,7 @@
         </w:rPr>
         <w:t xml:space="preserve"> preprint arXiv:2412.15115. </w:t>
       </w:r>
-      <w:hyperlink r:id="rId21" w:history="1">
+      <w:hyperlink r:id="rId19" w:history="1">
         <w:r>
           <w:rPr>
             <w:rStyle w:val="Hyperlink"/>
@@ -4590,71 +4853,8 @@
         <w:t>. GitHub. https://github.com/ggerganov/llama.cpp</w:t>
       </w:r>
     </w:p>
-    <w:p>
-      <w:pPr>
-        <w:rPr>
-          <w:lang w:val="en-US"/>
-        </w:rPr>
-      </w:pPr>
-    </w:p>
-    <w:p>
-      <w:pPr>
-        <w:rPr>
-          <w:rFonts w:ascii="Times New Roman" w:hAnsi="Times New Roman" w:cs="Times New Roman"/>
-          <w:lang w:val="en-US"/>
-        </w:rPr>
-      </w:pPr>
-    </w:p>
-    <w:p>
-      <w:pPr>
-        <w:rPr>
-          <w:rFonts w:ascii="Times New Roman" w:hAnsi="Times New Roman" w:cs="Times New Roman"/>
-          <w:lang w:val="en-US"/>
-        </w:rPr>
-      </w:pPr>
-    </w:p>
-    <w:p>
-      <w:pPr>
-        <w:rPr>
-          <w:rFonts w:ascii="Times New Roman" w:hAnsi="Times New Roman" w:cs="Times New Roman"/>
-          <w:lang w:val="en-US"/>
-        </w:rPr>
-      </w:pPr>
-    </w:p>
-    <w:p>
-      <w:pPr>
-        <w:rPr>
-          <w:rFonts w:ascii="Times New Roman" w:hAnsi="Times New Roman" w:cs="Times New Roman"/>
-          <w:lang w:val="en-US"/>
-        </w:rPr>
-      </w:pPr>
-    </w:p>
-    <w:p>
-      <w:pPr>
-        <w:rPr>
-          <w:rFonts w:ascii="Times New Roman" w:hAnsi="Times New Roman" w:cs="Times New Roman"/>
-          <w:lang w:val="en-US"/>
-        </w:rPr>
-      </w:pPr>
-    </w:p>
-    <w:p>
-      <w:pPr>
-        <w:rPr>
-          <w:rFonts w:ascii="Times New Roman" w:hAnsi="Times New Roman" w:cs="Times New Roman"/>
-          <w:lang w:val="en-US"/>
-        </w:rPr>
-      </w:pPr>
-    </w:p>
-    <w:p>
-      <w:pPr>
-        <w:rPr>
-          <w:rFonts w:ascii="Times New Roman" w:hAnsi="Times New Roman" w:cs="Times New Roman"/>
-          <w:lang w:val="en-US"/>
-        </w:rPr>
-      </w:pPr>
-    </w:p>
     <w:sectPr>
-      <w:headerReference w:type="first" r:id="rId22"/>
+      <w:headerReference w:type="first" r:id="rId20"/>
       <w:pgSz w:w="11900" w:h="16840" w:code="9"/>
       <w:pgMar w:top="1418" w:right="1418" w:bottom="1418" w:left="1418" w:header="709" w:footer="709" w:gutter="0"/>
       <w:cols w:space="708"/>
@@ -8139,7 +8339,6 @@
   <w:style w:type="character" w:default="1" w:styleId="DefaultParagraphFont">
     <w:name w:val="Default Paragraph Font"/>
     <w:uiPriority w:val="1"/>
-    <w:semiHidden/>
     <w:unhideWhenUsed/>
   </w:style>
   <w:style w:type="table" w:default="1" w:styleId="TableNormal">
@@ -8628,12 +8827,21 @@
 </file>
 
 <file path=customXml/item1.xml><?xml version="1.0" encoding="utf-8"?>
+<?mso-contentType ?>
+<FormTemplates xmlns="http://schemas.microsoft.com/sharepoint/v3/contenttype/forms">
+  <Display>DocumentLibraryForm</Display>
+  <Edit>DocumentLibraryForm</Edit>
+  <New>DocumentLibraryForm</New>
+</FormTemplates>
+</file>
+
+<file path=customXml/item2.xml><?xml version="1.0" encoding="utf-8"?>
 <p:properties xmlns:p="http://schemas.microsoft.com/office/2006/metadata/properties" xmlns:xsi="http://www.w3.org/2001/XMLSchema-instance" xmlns:pc="http://schemas.microsoft.com/office/infopath/2007/PartnerControls">
   <documentManagement/>
 </p:properties>
 </file>
 
-<file path=customXml/item2.xml><?xml version="1.0" encoding="utf-8"?>
+<file path=customXml/item3.xml><?xml version="1.0" encoding="utf-8"?>
 <ct:contentTypeSchema xmlns:ct="http://schemas.microsoft.com/office/2006/metadata/contentType" xmlns:ma="http://schemas.microsoft.com/office/2006/metadata/properties/metaAttributes" ct:_="" ma:_="" ma:contentTypeName="Dokument" ma:contentTypeID="0x010100C7B3477DA0B97842A4AB3CAC2FC7CCA9" ma:contentTypeVersion="3" ma:contentTypeDescription="Utwórz nowy dokument." ma:contentTypeScope="" ma:versionID="08acbf4e69e1c417c0654eb506165124">
   <xsd:schema xmlns:xsd="http://www.w3.org/2001/XMLSchema" xmlns:xs="http://www.w3.org/2001/XMLSchema" xmlns:p="http://schemas.microsoft.com/office/2006/metadata/properties" xmlns:ns2="90ad895e-3eee-4c0f-8ee5-203ad6452046" targetNamespace="http://schemas.microsoft.com/office/2006/metadata/properties" ma:root="true" ma:fieldsID="0612b0a3dcdc06ca4f4ab8731dc57d64" ns2:_="">
     <xsd:import namespace="90ad895e-3eee-4c0f-8ee5-203ad6452046"/>
@@ -8771,16 +8979,15 @@
 </ct:contentTypeSchema>
 </file>
 
-<file path=customXml/item3.xml><?xml version="1.0" encoding="utf-8"?>
-<?mso-contentType ?>
-<FormTemplates xmlns="http://schemas.microsoft.com/sharepoint/v3/contenttype/forms">
-  <Display>DocumentLibraryForm</Display>
-  <Edit>DocumentLibraryForm</Edit>
-  <New>DocumentLibraryForm</New>
-</FormTemplates>
+<file path=customXml/itemProps1.xml><?xml version="1.0" encoding="utf-8"?>
+<ds:datastoreItem xmlns:ds="http://schemas.openxmlformats.org/officeDocument/2006/customXml" ds:itemID="{C7ED8927-B6BE-4A5E-8E7E-ABB33AB171D8}">
+  <ds:schemaRefs>
+    <ds:schemaRef ds:uri="http://schemas.microsoft.com/sharepoint/v3/contenttype/forms"/>
+  </ds:schemaRefs>
+</ds:datastoreItem>
 </file>
 
-<file path=customXml/itemProps1.xml><?xml version="1.0" encoding="utf-8"?>
+<file path=customXml/itemProps2.xml><?xml version="1.0" encoding="utf-8"?>
 <ds:datastoreItem xmlns:ds="http://schemas.openxmlformats.org/officeDocument/2006/customXml" ds:itemID="{9A4B9707-3390-4BAA-9D3A-F1BCEDCBE263}">
   <ds:schemaRefs>
     <ds:schemaRef ds:uri="http://schemas.microsoft.com/office/2006/metadata/properties"/>
@@ -8789,7 +8996,7 @@
 </ds:datastoreItem>
 </file>
 
-<file path=customXml/itemProps2.xml><?xml version="1.0" encoding="utf-8"?>
+<file path=customXml/itemProps3.xml><?xml version="1.0" encoding="utf-8"?>
 <ds:datastoreItem xmlns:ds="http://schemas.openxmlformats.org/officeDocument/2006/customXml" ds:itemID="{8B32E23D-F441-40B0-8BD3-500F27940F29}">
   <ds:schemaRefs>
     <ds:schemaRef ds:uri="http://schemas.microsoft.com/office/2006/metadata/contentType"/>
@@ -8805,12 +9012,4 @@
     <ds:schemaRef ds:uri="http://schemas.microsoft.com/internal/obd"/>
   </ds:schemaRefs>
 </ds:datastoreItem>
-</file>
-
-<file path=customXml/itemProps3.xml><?xml version="1.0" encoding="utf-8"?>
-<ds:datastoreItem xmlns:ds="http://schemas.openxmlformats.org/officeDocument/2006/customXml" ds:itemID="{C7ED8927-B6BE-4A5E-8E7E-ABB33AB171D8}">
-  <ds:schemaRefs>
-    <ds:schemaRef ds:uri="http://schemas.microsoft.com/sharepoint/v3/contenttype/forms"/>
-  </ds:schemaRefs>
-</ds:datastoreItem>
 </file>
</xml_diff>

<commit_message>
docs: update thesis document to reflect WSL setup automation in setup.cmd
</commit_message>
<xml_diff>
--- a/documentation/Projekt_43995.docx
+++ b/documentation/Projekt_43995.docx
@@ -3658,6 +3658,159 @@
     <w:p>
       <w:r>
         <w:t>* Model bez adaptera w większości przypadków nie wykrywa technik (ogromna przewaga False Negatives nad True Positives dla niemal wszystkich klas), co potwierdza konieczność treningu specyficznego dla domeny detekcji dezinformacji.</w:t>
+      </w:r>
+    </w:p>
+    <w:p>
+      <w:pPr>
+        <w:pStyle w:val="Heading2"/>
+      </w:pPr>
+      <w:r>
+        <w:t>2.9. Instrukcja instalacji i uruchomienia systemu</w:t>
+      </w:r>
+    </w:p>
+    <w:p>
+      <w:pPr/>
+      <w:r>
+        <w:t>Kompletna instrukcja odtworzenia środowiska uruchomieniowego jest kluczowym elementem dokumentacji inżynierskiej. Poniższa sekcja opisuje wymagania sprzętowe i programowe, proces automatycznej konfiguracji oraz kolejność uruchomienia poszczególnych komponentów systemu.</w:t>
+      </w:r>
+    </w:p>
+    <w:p>
+      <w:pPr/>
+      <w:r/>
+      <w:r>
+        <w:rPr>
+          <w:b/>
+        </w:rPr>
+        <w:t>Wymagania sprzętowe i programowe</w:t>
+      </w:r>
+    </w:p>
+    <w:p>
+      <w:pPr/>
+      <w:r>
+        <w:t>System wymaga środowiska Windows 10/11 z aktywnym podsystemem WSL2 (Ubuntu) dla procesu treningu. Do inferencji wystarczy samo środowisko Windows. Wymagane jest GPU NVIDIA z minimum 8 GB VRAM (dla treningu w trybie 4-bit kwantyzacji). Zależności programowe obejmują: serwer Ollama (inferencja modelu), Python 3.11+, Node.js 18+ oraz Git.</w:t>
+      </w:r>
+    </w:p>
+    <w:p>
+      <w:pPr/>
+      <w:r/>
+      <w:r>
+        <w:rPr>
+          <w:b/>
+        </w:rPr>
+        <w:t>Proces instalacji — skrypt automatyczny (setup.cmd)</w:t>
+      </w:r>
+    </w:p>
+    <w:p>
+      <w:pPr/>
+      <w:r>
+        <w:t>W projekcie zaimplementowano skrypt setup.cmd, który automatyzuje cały proces konfiguracji środowiska. Skrypt stosuje wzorzec `goto :done` zamiast natychmiastowego przerywania — w przypadku błędu wyświetla komunikat i czeka na potwierdzenie użytkownika, pozwalając na diagnostykę problemu. Skrypt wykonuje następujące kroki w ściśle określonej kolejności:</w:t>
+      </w:r>
+    </w:p>
+    <w:p>
+      <w:pPr/>
+      <w:r>
+        <w:t>1. Weryfikacja obecności wymaganych programów (Python 3.11+, npm, Ollama) na zmiennej PATH. Dla każdego znalezionego programu wyświetlany jest komunikat [OK]; w przypadku braku któregoś z nich, skrypt wyświetla instrukcję instalacji wraz z linkiem do pobrania i przerywa dalsze kroki.</w:t>
+      </w:r>
+    </w:p>
+    <w:p>
+      <w:pPr/>
+      <w:r>
+        <w:t>2. Inicjalizacja submodułów Git (repozytorium llama.cpp) za pomocą git submodule update --init --recursive.</w:t>
+      </w:r>
+    </w:p>
+    <w:p>
+      <w:pPr/>
+      <w:r>
+        <w:t>3. Utworzenie wirtualnego środowiska Python (venv) w katalogu backend/.venv i instalacja zależności z pliku requirements.txt za pomocą pip.</w:t>
+      </w:r>
+    </w:p>
+    <w:p>
+      <w:pPr/>
+      <w:r>
+        <w:t>4. Instalacja zależności frontendowych (npm install) w katalogu frontend/.</w:t>
+      </w:r>
+    </w:p>
+    <w:p>
+      <w:pPr/>
+      <w:r>
+        <w:t>5. Konfiguracja środowiska treningowego WSL2 — skrypt sprawdza dostępność podsystemu WSL2, weryfikuje obecność python3 i modułu python3-venv, a następnie tworzy wirtualne środowisko (.venv-wsl) i instaluje zależności treningowe z pliku backend/requirements-wsl.txt. W przypadku braku WSL2 lub niepełnych wymagań, wyświetlany jest komunikat z instrukcją instalacji, a krok jest pomijany bez przerywania konfiguracji pozostałych komponentów.</w:t>
+      </w:r>
+    </w:p>
+    <w:p>
+      <w:pPr/>
+      <w:r>
+        <w:t>6. Aktualizacja ścieżki ADAPTER w pliku Modelfile na ścieżkę bezwzględną (wymaganie serwera Ollama) i rejestracja modelu bielik-lora-mipd za pomocą polecenia ollama create. Jeśli model jest już zarejestrowany w Ollama, krok jest pomijany.</w:t>
+      </w:r>
+    </w:p>
+    <w:p>
+      <w:pPr/>
+      <w:r>
+        <w:t>Katalog model/ (~7.7 GB) nie jest wersjonowany w repozytorium i musi zostać pobrany oddzielnie — pliki modelu są dostępne pod adresem https://drive.google.com/file/d/1b17N4rKeinj1ahqTz-nhMtxZT8k02OYD/view?usp=sharing. Skrypt setup.cmd wykrywa brak pliku adaptera i wyświetla odpowiedni komunikat ostrzegawczy, nie przerywając konfiguracji pozostałych komponentów.</w:t>
+      </w:r>
+    </w:p>
+    <w:p>
+      <w:pPr/>
+      <w:r>
+        <w:t>Skrypt setup.cmd wymaga dostępu do serwera Ollama podczas rejestracji modelu (krok 6). Skrypt run_app.cmd automatycznie uruchamia serwer Ollama, jeśli nie jest on dostępny. Idempotentność obu skryptów gwarantuje bezpieczeństwo ponownego uruchomienia: istniejące środowisko wirtualne, zainstalowane pakiety npm, skonfigurowane środowisko WSL2 i zarejestrowany model nie są nadpisywane. Dodatkowo, w przypadku błędu tworzenia środowiska wirtualnego Python, skrypt wyświetla szczegółowe instrukcje rozwiązywania problemów (np. ponowna instalacja Pythona z opcją „Add Python to PATH").</w:t>
+      </w:r>
+    </w:p>
+    <w:p>
+      <w:pPr/>
+      <w:r/>
+      <w:r>
+        <w:rPr>
+          <w:b/>
+        </w:rPr>
+        <w:t>Konfiguracja środowiska treningowego (WS</w:t>
+      </w:r>
+      <w:r>
+        <w:t>L2)</w:t>
+      </w:r>
+    </w:p>
+    <w:p>
+      <w:pPr/>
+      <w:r>
+        <w:t>Proces douczania modelu (Supervised Fine-Tuning) wymaga środowiska Linux i jest realizowany w podsystemie WSL2. Skrypt setup.cmd automatycznie wykrywa dostępność WSL2, weryfikuje wymagania (python3, python3-venv) i tworzy odizolowane środowisko wirtualne (.venv-wsl) z zależnościami z pliku requirements-wsl.txt. W przypadku niepowodzenia, skrypt wyświetla instrukcję ręcznej instalacji (sudo apt install python3 python3-venv python3-pip). Ręczna instalacja zależności w terminalu Ubuntu: pip install unsloth bitsandbytes accelerate torch trl datasets gguf. Trening nie jest uruchamiany bezpośrednio z wiersza poleceń — jest inicjowany z poziomu interfejsu użytkownika (Panel Ekspercki). Backend na Windowsie uruchamia proces treningowy w WSL za pomocą polecenia wsl --exec python3 -u -m app.training.trainer, przekazując ścieżki do danych i modelu jako argumenty. Postęp treningu jest raportowany w czasie rzeczywistym do backendu przez wywołania HTTP POST na endpoint /training/progress.</w:t>
+      </w:r>
+    </w:p>
+    <w:p>
+      <w:pPr/>
+      <w:r>
+        <w:t>Do uruchomienia wszystkich komponentów systemu służy skrypt run_app.cmd, który w osobnych oknach terminala uruchamia usługi w następującej kolejności:</w:t>
+      </w:r>
+    </w:p>
+    <w:p>
+      <w:pPr/>
+      <w:r/>
+      <w:r>
+        <w:rPr>
+          <w:b/>
+        </w:rPr>
+        <w:t>Uruchomienie systemu — kolejność startu usług</w:t>
+      </w:r>
+    </w:p>
+    <w:p>
+      <w:pPr/>
+      <w:r>
+        <w:t>1. Serwer Ollama (port 11434) — musi być uruchomiony jako pierwszy, ponieważ backend i proces treningu zależą od jego dostępności. Odpowiada za inferencję modelu językowego.</w:t>
+      </w:r>
+    </w:p>
+    <w:p>
+      <w:pPr/>
+      <w:r>
+        <w:t>2. Backend FastAPI (port 8000) — serwis orkiestracyjny. Uruchamiany poleceniem python -m app.main z aktywowanym środowiskiem wirtualnym. Obejmuje endpointy REST (/analyze, /upload, /train, /promote), WebSocket (/ws/training/status) oraz komunikację z bazą SQLite i serwerem Ollama.</w:t>
+      </w:r>
+    </w:p>
+    <w:p>
+      <w:pPr/>
+      <w:r>
+        <w:t>3. Frontend Vite/React (port 5173) — interfejs użytkownika. Uruchamiany poleceniem npm run dev. Łączy się z backendem za pomocą REST API i WebSocket, udostępniając panel analizy tekstu oraz Panel Ekspercki.</w:t>
+      </w:r>
+    </w:p>
+    <w:p>
+      <w:pPr/>
+      <w:r>
+        <w:t>Po uruchomieniu system jest dostępny pod adresem http://localhost:5173. Reset do stanu początkowego (przywrócenie adaptera xai-adapter jako aktywny model, usunięcie raportu benchmark i artefaktów treningowych) realizowany jest przez skrypt reset_state.cmd.</w:t>
       </w:r>
     </w:p>
     <w:p>

</xml_diff>

<commit_message>
feat: persist training run lifecycle to DB, update thesis docs
- Track current_run_id in orchestrator and update TrainingRun status
  (running→ready_to_promote→deployed/failed) with F1 scores and timestamps
- Add DB cleanup step to reset_state.py for stale training runs
- Update TrainingRun.status comment to reflect actual states
- Reformulate thesis document: remove template boilerplate, improve
  Polish terminology (Human-in-the-Loop, SOTA, Chain-of-Thought),
  reflow paragraphs for better readability
- Fix bibliography link formatting (remove stray HTML anchor tag)
- Add presentation file (Projekt_43995.pptx) and speaker script
- Delete outdated Project Plan.pdf
- Add troubleshooting section to README for WSL venv corruption
- Exclude font files in .gitignore
</commit_message>
<xml_diff>
--- a/documentation/Projekt_43995.docx
+++ b/documentation/Projekt_43995.docx
@@ -3669,14 +3669,11 @@
       </w:r>
     </w:p>
     <w:p>
-      <w:pPr/>
       <w:r>
         <w:t>Kompletna instrukcja odtworzenia środowiska uruchomieniowego jest kluczowym elementem dokumentacji inżynierskiej. Poniższa sekcja opisuje wymagania sprzętowe i programowe, proces automatycznej konfiguracji oraz kolejność uruchomienia poszczególnych komponentów systemu.</w:t>
       </w:r>
     </w:p>
     <w:p>
-      <w:pPr/>
-      <w:r/>
       <w:r>
         <w:rPr>
           <w:b/>
@@ -3685,14 +3682,12 @@
       </w:r>
     </w:p>
     <w:p>
-      <w:pPr/>
-      <w:r>
+      <w:r>
+        <w:lastRenderedPageBreak/>
         <w:t>System wymaga środowiska Windows 10/11 z aktywnym podsystemem WSL2 (Ubuntu) dla procesu treningu. Do inferencji wystarczy samo środowisko Windows. Wymagane jest GPU NVIDIA z minimum 8 GB VRAM (dla treningu w trybie 4-bit kwantyzacji). Zależności programowe obejmują: serwer Ollama (inferencja modelu), Python 3.11+, Node.js 18+ oraz Git.</w:t>
       </w:r>
     </w:p>
     <w:p>
-      <w:pPr/>
-      <w:r/>
       <w:r>
         <w:rPr>
           <w:b/>
@@ -3701,87 +3696,78 @@
       </w:r>
     </w:p>
     <w:p>
-      <w:pPr/>
       <w:r>
         <w:t>W projekcie zaimplementowano skrypt setup.cmd, który automatyzuje cały proces konfiguracji środowiska. Skrypt stosuje wzorzec `goto :done` zamiast natychmiastowego przerywania — w przypadku błędu wyświetla komunikat i czeka na potwierdzenie użytkownika, pozwalając na diagnostykę problemu. Skrypt wykonuje następujące kroki w ściśle określonej kolejności:</w:t>
       </w:r>
     </w:p>
     <w:p>
-      <w:pPr/>
       <w:r>
         <w:t>1. Weryfikacja obecności wymaganych programów (Python 3.11+, npm, Ollama) na zmiennej PATH. Dla każdego znalezionego programu wyświetlany jest komunikat [OK]; w przypadku braku któregoś z nich, skrypt wyświetla instrukcję instalacji wraz z linkiem do pobrania i przerywa dalsze kroki.</w:t>
       </w:r>
     </w:p>
     <w:p>
-      <w:pPr/>
       <w:r>
         <w:t>2. Inicjalizacja submodułów Git (repozytorium llama.cpp) za pomocą git submodule update --init --recursive.</w:t>
       </w:r>
     </w:p>
     <w:p>
-      <w:pPr/>
       <w:r>
         <w:t>3. Utworzenie wirtualnego środowiska Python (venv) w katalogu backend/.venv i instalacja zależności z pliku requirements.txt za pomocą pip.</w:t>
       </w:r>
     </w:p>
     <w:p>
-      <w:pPr/>
       <w:r>
         <w:t>4. Instalacja zależności frontendowych (npm install) w katalogu frontend/.</w:t>
       </w:r>
     </w:p>
     <w:p>
-      <w:pPr/>
       <w:r>
         <w:t>5. Konfiguracja środowiska treningowego WSL2 — skrypt sprawdza dostępność podsystemu WSL2, weryfikuje obecność python3 i modułu python3-venv, a następnie tworzy wirtualne środowisko (.venv-wsl) i instaluje zależności treningowe z pliku backend/requirements-wsl.txt. W przypadku braku WSL2 lub niepełnych wymagań, wyświetlany jest komunikat z instrukcją instalacji, a krok jest pomijany bez przerywania konfiguracji pozostałych komponentów.</w:t>
       </w:r>
     </w:p>
     <w:p>
-      <w:pPr/>
       <w:r>
         <w:t>6. Aktualizacja ścieżki ADAPTER w pliku Modelfile na ścieżkę bezwzględną (wymaganie serwera Ollama) i rejestracja modelu bielik-lora-mipd za pomocą polecenia ollama create. Jeśli model jest już zarejestrowany w Ollama, krok jest pomijany.</w:t>
       </w:r>
     </w:p>
     <w:p>
-      <w:pPr/>
       <w:r>
         <w:t>Katalog model/ (~7.7 GB) nie jest wersjonowany w repozytorium i musi zostać pobrany oddzielnie — pliki modelu są dostępne pod adresem https://drive.google.com/file/d/1b17N4rKeinj1ahqTz-nhMtxZT8k02OYD/view?usp=sharing. Skrypt setup.cmd wykrywa brak pliku adaptera i wyświetla odpowiedni komunikat ostrzegawczy, nie przerywając konfiguracji pozostałych komponentów.</w:t>
       </w:r>
     </w:p>
     <w:p>
-      <w:pPr/>
       <w:r>
         <w:t>Skrypt setup.cmd wymaga dostępu do serwera Ollama podczas rejestracji modelu (krok 6). Skrypt run_app.cmd automatycznie uruchamia serwer Ollama, jeśli nie jest on dostępny. Idempotentność obu skryptów gwarantuje bezpieczeństwo ponownego uruchomienia: istniejące środowisko wirtualne, zainstalowane pakiety npm, skonfigurowane środowisko WSL2 i zarejestrowany model nie są nadpisywane. Dodatkowo, w przypadku błędu tworzenia środowiska wirtualnego Python, skrypt wyświetla szczegółowe instrukcje rozwiązywania problemów (np. ponowna instalacja Pythona z opcją „Add Python to PATH").</w:t>
       </w:r>
     </w:p>
     <w:p>
-      <w:pPr/>
-      <w:r/>
-      <w:r>
+      <w:pPr>
         <w:rPr>
           <w:b/>
         </w:rPr>
-        <w:t>Konfiguracja środowiska treningowego (WS</w:t>
-      </w:r>
-      <w:r>
-        <w:t>L2)</w:t>
-      </w:r>
-    </w:p>
-    <w:p>
-      <w:pPr/>
-      <w:r>
-        <w:t>Proces douczania modelu (Supervised Fine-Tuning) wymaga środowiska Linux i jest realizowany w podsystemie WSL2. Skrypt setup.cmd automatycznie wykrywa dostępność WSL2, weryfikuje wymagania (python3, python3-venv) i tworzy odizolowane środowisko wirtualne (.venv-wsl) z zależnościami z pliku requirements-wsl.txt. W przypadku niepowodzenia, skrypt wyświetla instrukcję ręcznej instalacji (sudo apt install python3 python3-venv python3-pip). Ręczna instalacja zależności w terminalu Ubuntu: pip install unsloth bitsandbytes accelerate torch trl datasets gguf. Trening nie jest uruchamiany bezpośrednio z wiersza poleceń — jest inicjowany z poziomu interfejsu użytkownika (Panel Ekspercki). Backend na Windowsie uruchamia proces treningowy w WSL za pomocą polecenia wsl --exec python3 -u -m app.training.trainer, przekazując ścieżki do danych i modelu jako argumenty. Postęp treningu jest raportowany w czasie rzeczywistym do backendu przez wywołania HTTP POST na endpoint /training/progress.</w:t>
-      </w:r>
-    </w:p>
-    <w:p>
-      <w:pPr/>
+      </w:pPr>
+      <w:r>
+        <w:rPr>
+          <w:b/>
+        </w:rPr>
+        <w:t>Konfiguracja środowiska treningowego (WSL2)</w:t>
+      </w:r>
+    </w:p>
+    <w:p>
+      <w:r>
+        <w:t xml:space="preserve">Proces douczania modelu (Supervised Fine-Tuning) wymaga środowiska Linux i jest realizowany w podsystemie WSL2. Skrypt setup.cmd automatycznie wykrywa dostępność WSL2, weryfikuje wymagania (python3, python3-venv) i tworzy odizolowane środowisko wirtualne (.venv-wsl) z zależnościami z pliku requirements-wsl.txt. W przypadku niepowodzenia, skrypt wyświetla instrukcję ręcznej instalacji (sudo apt install python3 </w:t>
+      </w:r>
+      <w:r>
+        <w:lastRenderedPageBreak/>
+        <w:t>python3-venv python3-pip). Ręczna instalacja zależności w terminalu Ubuntu: pip install unsloth bitsandbytes accelerate torch trl datasets gguf. Trening nie jest uruchamiany bezpośrednio z wiersza poleceń — jest inicjowany z poziomu interfejsu użytkownika (Panel Ekspercki). Backend na Windowsie uruchamia proces treningowy w WSL za pomocą polecenia wsl --exec python3 -u -m app.training.trainer, przekazując ścieżki do danych i modelu jako argumenty. Postęp treningu jest raportowany w czasie rzeczywistym do backendu przez wywołania HTTP POST na endpoint /training/progress.</w:t>
+      </w:r>
+    </w:p>
+    <w:p>
       <w:r>
         <w:t>Do uruchomienia wszystkich komponentów systemu służy skrypt run_app.cmd, który w osobnych oknach terminala uruchamia usługi w następującej kolejności:</w:t>
       </w:r>
     </w:p>
     <w:p>
-      <w:pPr/>
-      <w:r/>
       <w:r>
         <w:rPr>
           <w:b/>
@@ -3790,25 +3776,21 @@
       </w:r>
     </w:p>
     <w:p>
-      <w:pPr/>
       <w:r>
         <w:t>1. Serwer Ollama (port 11434) — musi być uruchomiony jako pierwszy, ponieważ backend i proces treningu zależą od jego dostępności. Odpowiada za inferencję modelu językowego.</w:t>
       </w:r>
     </w:p>
     <w:p>
-      <w:pPr/>
       <w:r>
         <w:t>2. Backend FastAPI (port 8000) — serwis orkiestracyjny. Uruchamiany poleceniem python -m app.main z aktywowanym środowiskiem wirtualnym. Obejmuje endpointy REST (/analyze, /upload, /train, /promote), WebSocket (/ws/training/status) oraz komunikację z bazą SQLite i serwerem Ollama.</w:t>
       </w:r>
     </w:p>
     <w:p>
-      <w:pPr/>
       <w:r>
         <w:t>3. Frontend Vite/React (port 5173) — interfejs użytkownika. Uruchamiany poleceniem npm run dev. Łączy się z backendem za pomocą REST API i WebSocket, udostępniając panel analizy tekstu oraz Panel Ekspercki.</w:t>
       </w:r>
     </w:p>
     <w:p>
-      <w:pPr/>
       <w:r>
         <w:t>Po uruchomieniu system jest dostępny pod adresem http://localhost:5173. Reset do stanu początkowego (przywrócenie adaptera xai-adapter jako aktywny model, usunięcie raportu benchmark i artefaktów treningowych) realizowany jest przez skrypt reset_state.cmd.</w:t>
       </w:r>
@@ -4948,18 +4930,31 @@
         </w:rPr>
         <w:t xml:space="preserve"> preprint arXiv:2412.15115. </w:t>
       </w:r>
-      <w:hyperlink r:id="rId19" w:history="1">
-        <w:r>
-          <w:rPr>
-            <w:rStyle w:val="Hyperlink"/>
-            <w:rFonts w:ascii="Times New Roman" w:hAnsi="Times New Roman" w:cs="Times New Roman"/>
-            <w:sz w:val="20"/>
-            <w:szCs w:val="20"/>
-            <w:lang w:val="en-US"/>
-          </w:rPr>
-          <w:t>https://doi.org/10.48550/arXiv.2412.15115</w:t>
-        </w:r>
-      </w:hyperlink>
+      <w:r>
+        <w:fldChar w:fldCharType="begin"/>
+      </w:r>
+      <w:r>
+        <w:rPr>
+          <w:lang w:val="en-US"/>
+        </w:rPr>
+        <w:instrText>HYPERLINK "https://doi.org/10.48550/arXiv.2412.15115"</w:instrText>
+      </w:r>
+      <w:r>
+        <w:fldChar w:fldCharType="separate"/>
+      </w:r>
+      <w:r>
+        <w:rPr>
+          <w:rStyle w:val="Hyperlink"/>
+          <w:rFonts w:ascii="Times New Roman" w:hAnsi="Times New Roman" w:cs="Times New Roman"/>
+          <w:sz w:val="20"/>
+          <w:szCs w:val="20"/>
+          <w:lang w:val="en-US"/>
+        </w:rPr>
+        <w:t>https://doi.org/10.48550/arXiv.2412.15115</w:t>
+      </w:r>
+      <w:r>
+        <w:fldChar w:fldCharType="end"/>
+      </w:r>
     </w:p>
     <w:p>
       <w:pPr>
@@ -5007,7 +5002,7 @@
       </w:r>
     </w:p>
     <w:sectPr>
-      <w:headerReference w:type="first" r:id="rId20"/>
+      <w:headerReference w:type="first" r:id="rId19"/>
       <w:pgSz w:w="11900" w:h="16840" w:code="9"/>
       <w:pgMar w:top="1418" w:right="1418" w:bottom="1418" w:left="1418" w:header="709" w:footer="709" w:gutter="0"/>
       <w:cols w:space="708"/>
@@ -8492,6 +8487,7 @@
   <w:style w:type="character" w:default="1" w:styleId="DefaultParagraphFont">
     <w:name w:val="Default Paragraph Font"/>
     <w:uiPriority w:val="1"/>
+    <w:semiHidden/>
     <w:unhideWhenUsed/>
   </w:style>
   <w:style w:type="table" w:default="1" w:styleId="TableNormal">
@@ -8989,12 +8985,6 @@
 </file>
 
 <file path=customXml/item2.xml><?xml version="1.0" encoding="utf-8"?>
-<p:properties xmlns:p="http://schemas.microsoft.com/office/2006/metadata/properties" xmlns:xsi="http://www.w3.org/2001/XMLSchema-instance" xmlns:pc="http://schemas.microsoft.com/office/infopath/2007/PartnerControls">
-  <documentManagement/>
-</p:properties>
-</file>
-
-<file path=customXml/item3.xml><?xml version="1.0" encoding="utf-8"?>
 <ct:contentTypeSchema xmlns:ct="http://schemas.microsoft.com/office/2006/metadata/contentType" xmlns:ma="http://schemas.microsoft.com/office/2006/metadata/properties/metaAttributes" ct:_="" ma:_="" ma:contentTypeName="Dokument" ma:contentTypeID="0x010100C7B3477DA0B97842A4AB3CAC2FC7CCA9" ma:contentTypeVersion="3" ma:contentTypeDescription="Utwórz nowy dokument." ma:contentTypeScope="" ma:versionID="08acbf4e69e1c417c0654eb506165124">
   <xsd:schema xmlns:xsd="http://www.w3.org/2001/XMLSchema" xmlns:xs="http://www.w3.org/2001/XMLSchema" xmlns:p="http://schemas.microsoft.com/office/2006/metadata/properties" xmlns:ns2="90ad895e-3eee-4c0f-8ee5-203ad6452046" targetNamespace="http://schemas.microsoft.com/office/2006/metadata/properties" ma:root="true" ma:fieldsID="0612b0a3dcdc06ca4f4ab8731dc57d64" ns2:_="">
     <xsd:import namespace="90ad895e-3eee-4c0f-8ee5-203ad6452046"/>
@@ -9132,6 +9122,12 @@
 </ct:contentTypeSchema>
 </file>
 
+<file path=customXml/item3.xml><?xml version="1.0" encoding="utf-8"?>
+<p:properties xmlns:p="http://schemas.microsoft.com/office/2006/metadata/properties" xmlns:xsi="http://www.w3.org/2001/XMLSchema-instance" xmlns:pc="http://schemas.microsoft.com/office/infopath/2007/PartnerControls">
+  <documentManagement/>
+</p:properties>
+</file>
+
 <file path=customXml/itemProps1.xml><?xml version="1.0" encoding="utf-8"?>
 <ds:datastoreItem xmlns:ds="http://schemas.openxmlformats.org/officeDocument/2006/customXml" ds:itemID="{C7ED8927-B6BE-4A5E-8E7E-ABB33AB171D8}">
   <ds:schemaRefs>
@@ -9141,15 +9137,6 @@
 </file>
 
 <file path=customXml/itemProps2.xml><?xml version="1.0" encoding="utf-8"?>
-<ds:datastoreItem xmlns:ds="http://schemas.openxmlformats.org/officeDocument/2006/customXml" ds:itemID="{9A4B9707-3390-4BAA-9D3A-F1BCEDCBE263}">
-  <ds:schemaRefs>
-    <ds:schemaRef ds:uri="http://schemas.microsoft.com/office/2006/metadata/properties"/>
-    <ds:schemaRef ds:uri="http://schemas.microsoft.com/office/infopath/2007/PartnerControls"/>
-  </ds:schemaRefs>
-</ds:datastoreItem>
-</file>
-
-<file path=customXml/itemProps3.xml><?xml version="1.0" encoding="utf-8"?>
 <ds:datastoreItem xmlns:ds="http://schemas.openxmlformats.org/officeDocument/2006/customXml" ds:itemID="{8B32E23D-F441-40B0-8BD3-500F27940F29}">
   <ds:schemaRefs>
     <ds:schemaRef ds:uri="http://schemas.microsoft.com/office/2006/metadata/contentType"/>
@@ -9165,4 +9152,13 @@
     <ds:schemaRef ds:uri="http://schemas.microsoft.com/internal/obd"/>
   </ds:schemaRefs>
 </ds:datastoreItem>
+</file>
+
+<file path=customXml/itemProps3.xml><?xml version="1.0" encoding="utf-8"?>
+<ds:datastoreItem xmlns:ds="http://schemas.openxmlformats.org/officeDocument/2006/customXml" ds:itemID="{9A4B9707-3390-4BAA-9D3A-F1BCEDCBE263}">
+  <ds:schemaRefs>
+    <ds:schemaRef ds:uri="http://schemas.microsoft.com/office/2006/metadata/properties"/>
+    <ds:schemaRef ds:uri="http://schemas.microsoft.com/office/infopath/2007/PartnerControls"/>
+  </ds:schemaRefs>
+</ds:datastoreItem>
 </file>
</xml_diff>

<commit_message>
Update thesis defense materials
- Recreated documentation/changelog.txt as a comprehensive changelog covering the thesis document, presentation deck, speaking script, repository housekeeping, and known remaining follow-ups.
- Included the staged thesis and presentation artifact updates so the Word and PowerPoint deliverables match the revised defense narrative and report corrections.
- Updated the speaking script to use a simpler motivation-first flow, expanded architecture narration, reduced implementation jargon, and cautious benchmark framing.
- Added _thesis_build to .gitignore to keep generated thesis build output out of version control.
</commit_message>
<xml_diff>
--- a/documentation/Projekt_43995.docx
+++ b/documentation/Projekt_43995.docx
@@ -542,30 +542,7 @@
     </w:p>
     <w:p>
       <w:r>
-        <w:rPr>
-          <w:b/>
-          <w:bCs/>
-        </w:rPr>
-        <w:t>Metodyka i Architektura:</w:t>
-      </w:r>
-      <w:r>
-        <w:t xml:space="preserve"> Kluczowym elementem prac jest przygotowanie wysokiej jakości zbioru danych treningowych w oparciu o zbiór MIPD. Zastosowano strategię </w:t>
-      </w:r>
-      <w:r>
-        <w:rPr>
-          <w:b/>
-          <w:bCs/>
-        </w:rPr>
-        <w:t>"Label-Conditional Distillation" (destylację warunkową pod etykietą)</w:t>
-      </w:r>
-      <w:r>
-        <w:t>, gdzie większy model nauczycielski (</w:t>
-      </w:r>
-      <w:r>
-        <w:t>unsloth/Qwen2.5-7B-Instruct-bnb-4bit</w:t>
-      </w:r>
-      <w:r>
-        <w:t>) generuje uzasadnienia logiczne ściśle dopasowane do decyzji ludzkich ekspertów. Pozwala to na zachowanie "ludzkiej" oceny, przy jednoczesnym uzyskaniu spójnych wyjaśnień, na których uczony jest mniejszy model.</w:t>
+        <w:t>Metodyka i architektura: Kluczowym elementem prac jest przygotowanie wysokiej jakości zbioru danych treningowych w oparciu o zbiór MIPD. Zastosowano strategię destylacji warunkowej pod etykietą (Label-Conditional Distillation), w której większy model nauczycielski (unsloth/Qwen2.5-7B-Instruct-bnb-4bit) generuje uzasadnienia logiczne ściśle dopasowane do decyzji ludzkich ekspertów. Pozwala to na zachowanie "ludzkiej" oceny, przy jednoczesnym uzyskaniu spójnych wyjaśnień, na których uczony jest mniejszy model.</w:t>
       </w:r>
     </w:p>
     <w:p>
@@ -1106,48 +1083,7 @@
     </w:p>
     <w:p>
       <w:r>
-        <w:rPr>
-          <w:b/>
-          <w:bCs/>
-        </w:rPr>
-        <w:t>Przewaga proponowanego rozwiązania</w:t>
-      </w:r>
-      <w:r>
-        <w:t xml:space="preserve"> opiera się na trzech filarach. Po pierwsze, w przeciwieństwie do modeli BERT, system oferuje pełną </w:t>
-      </w:r>
-      <w:r>
-        <w:rPr>
-          <w:b/>
-          <w:bCs/>
-        </w:rPr>
-        <w:t>wyjaśnialność decyzji</w:t>
-      </w:r>
-      <w:r>
-        <w:t xml:space="preserve"> (uzasadnianie predykcji – Reasoning), budując zaufanie użytkownika. Po drugie, w odróżnieniu od GPT-4, jest to model </w:t>
-      </w:r>
-      <w:r>
-        <w:rPr>
-          <w:b/>
-          <w:bCs/>
-        </w:rPr>
-        <w:t>lokalny i uncenzurowany</w:t>
-      </w:r>
-      <w:r>
-        <w:t xml:space="preserve">, zdolny do analizy dowolnych treści bez ograniczeń </w:t>
-      </w:r>
-      <w:r>
-        <w:lastRenderedPageBreak/>
-        <w:t xml:space="preserve">korporacyjnych i kosztów API. Po trzecie, unikalny </w:t>
-      </w:r>
-      <w:r>
-        <w:rPr>
-          <w:b/>
-          <w:bCs/>
-        </w:rPr>
-        <w:t>moduł inżynierski ("Retrain Button")</w:t>
-      </w:r>
-      <w:r>
-        <w:t xml:space="preserve"> wprowadza funkcjonalność ciągłego uczenia się, pozwalając operatorowi na adaptację modelu do nowych narracji w kilkanaście minut, co stanowi istotną innowację w stosunku do statycznych rozwiązań akademickich.</w:t>
+        <w:t>Przewaga proponowanego rozwiązania opiera się na trzech filarach. Po pierwsze, w przeciwieństwie do modeli BERT, system oferuje pełną wyjaśnialność decyzji (uzasadnianie predykcji – Reasoning), budując zaufanie użytkownika. Po drugie, w odróżnieniu od GPT-4, jest to model lokalny, pozbawiony zewnętrznych filtrów moderacyjnych, zdolny do analizy treści bez ograniczeń korporacyjnych i kosztów API. Po trzecie, moduł ponownego dostrajania modelu umożliwia kontrolowaną aktualizację modelu, pozwalając operatorowi na adaptację modelu do nowych narracji w kilkanaście minut, co stanowi istotną innowację w stosunku do statycznych rozwiązań akademickich.</w:t>
       </w:r>
     </w:p>
     <w:p>
@@ -1468,7 +1404,7 @@
     </w:p>
     <w:p>
       <w:r>
-        <w:t>Separacja logiki: Model generował treść wyjaśnienia, a struktura JSON była składana programowo, co eliminowało błędy składniowe. W docelowym systemie (XAI Adapter) model jest trenowany, aby na wyjściu zwracać spójną strukturę zawierającą listę zidentyfikowanych technik oraz pole uzasadnienia:</w:t>
+        <w:t>Separacja logiki: Model generował treść wyjaśnienia, a struktura JSON była składana programowo, co eliminowało błędy składniowe. W docelowym systemie adapter wyjaśnialny (XAI Adapter) jest trenowany, aby na wyjściu zwracać spójną strukturę zawierającą listę zidentyfikowanych technik oraz pole uzasadnienia:</w:t>
       </w:r>
     </w:p>
     <w:p/>
@@ -2681,7 +2617,7 @@
         <w:t xml:space="preserve"> Scaling (Liu et al., 2023). </w:t>
       </w:r>
       <w:r>
-        <w:t>W konfiguracji trenera ustawiono parametr max_seq_length = 16384, co w połączeniu z gradient_checkpointing umożliwiło trening na dostępnych zasobach (w Colabie). Dodatkowo, zastosowano technikę maskowanie promptu (tzw. Completion Only LM) (maskowanie promptu użytkownika w funkcji straty), co zmusiło model do uczenia się wyłącznie generowania analizy, a nie reprodukcji długiego tekstu wejściowego, znacząco przyspieszając konwergencję. Model prototypowy osiągnął wynik F1 na poziomie 0.7824 na zbiorze testowym, dowodząc technicznej wykonalności przyjętej koncepcji.</w:t>
+        <w:t>W konfiguracji trenera ustawiono parametr max_seq_length = 16384, co w połączeniu z gradient_checkpointing umożliwiło trening na dostępnych zasobach (w Colabie). Dodatkowo, zastosowano technikę maskowanie promptu (tzw. Completion Only LM) (maskowanie promptu użytkownika w funkcji straty), co zmusiło model do uczenia się wyłącznie generowania analizy, a nie reprodukcji długiego tekstu wejściowego, znacząco przyspieszając konwergencję.</w:t>
       </w:r>
     </w:p>
     <w:p>
@@ -2748,7 +2684,7 @@
     </w:p>
     <w:p>
       <w:r>
-        <w:t>3. Wydajność Klasyfikacji (Mean Document-Level F1 - excluding empty gold-label docs): Główna metryka decyzyjna. Obliczana jako średnia harmoniczna precyzji i czułości (F1) liczona niezależnie dla każdego dokumentu, ale tylko dla tych próbek, które w rzeczywistości zawierają techniki manipulacji (niepuste gold labels).</w:t>
+        <w:t>3. Średni F1 na poziomie dokumentu dla próbek niepustych (Mean Document-Level F1 excluding empty gold-label docs): Główna metryka decyzyjna. Obliczana jako średnia harmoniczna precyzji i czułości (F1) liczona niezależnie dla każdego dokumentu, ale tylko dla tych próbek, które w rzeczywistości zawierają techniki manipulacji (niepuste gold labels).</w:t>
       </w:r>
     </w:p>
     <w:p>
@@ -2768,7 +2704,7 @@
         <w:pStyle w:val="Heading2"/>
       </w:pPr>
       <w:r>
-        <w:t>2.6. Projekt i architektura Systemu Inżynierskiego (MLOps Loop)</w:t>
+        <w:t>2.6. Projekt i architektura pętli inżynierskiej MLOps (MLOps Loop)</w:t>
       </w:r>
     </w:p>
     <w:p/>
@@ -3215,7 +3151,7 @@
     </w:p>
     <w:p>
       <w:r>
-        <w:t xml:space="preserve">3. Decyzji o Wdrożeniu: Logiki, która po zakończeniu automatycznego benchmarku zwraca wyniki do eksperta, zapalając odpowiednie wskaźniki w interfejsie graficznym. Interfejs podświetla na zielono lub czerwono kluczowe metryki, ułatwiając podjęcie decyzji. Ekspert zachowuje jednak pełną kontrolę – może zatwierdzić wdrożenie – dynamiczną wymianę </w:t>
+        <w:t xml:space="preserve">3. Decyzji o Wdrożeniu: Logiki, która po zakończeniu automatycznego benchmarku prezentuje ekspertowi wyniki za pomocą wskaźników interfejsu. Interfejs podświetla na zielono lub czerwono kluczowe metryki, ułatwiając podjęcie decyzji. Ekspert zachowuje jednak pełną kontrolę – może zatwierdzić wdrożenie – dynamiczną wymianę </w:t>
       </w:r>
       <w:r>
         <w:lastRenderedPageBreak/>
@@ -3345,7 +3281,7 @@
     <w:p/>
     <w:p>
       <w:r>
-        <w:t>Złożoność obliczeniowa i parametry czasowe systemu (czas treningu i inferencji) są ściśle uzależnione od wykorzystanej infrastruktury sprzętowej oraz rozmiaru przetwarzanego zbioru. Należy rozróżnić dwa scenariusze użycia. Po pierwsze, ze względu na zapotrzebowanie na zasoby, pełne cykle dostrajania (SFT) i wyczerpująca ewaluacja głównych wariantów modelu (Tabela 1) zostały przeprowadzone w środowisku Google Colab (T4 GPU) na pełnym zbiorze danych. Po drugie, w przypadku lokalnego modułu iteracyjnego douczania (pętla douczania), działającego na stacji roboczej z użyciem zredukowanego zbioru zgłoszeń dezinformacyjnych, szacunkowy czas jednego cyklu douczania (16 kroków) wynosi około 2 minuty. Czas lokalnej inferencji (generowania analizy w czasie rzeczywistym) dla pojedynczego zgłoszenia wynosi od 2 do 5 sekund na konsumenckiej karcie graficznej.</w:t>
+        <w:t>Złożoność obliczeniowa i parametry czasowe systemu (czas treningu i inferencji) są ściśle uzależnione od wykorzystanej infrastruktury sprzętowej oraz rozmiaru przetwarzanego zbioru. Należy rozróżnić dwa scenariusze użycia. Po pierwsze, ze względu na zapotrzebowanie na zasoby, pełne cykle dostrajania (SFT) i wyczerpująca ewaluacja głównych wariantów modelu (Tabela 2) zostały przeprowadzone w środowisku Google Colab (T4 GPU) na pełnym zbiorze testowym. Po drugie, w przypadku lokalnego modułu iteracyjnego douczania (pętla douczania), działającego na stacji roboczej z użyciem zredukowanego zbioru zgłoszeń dezinformacyjnych, czas cyklu zależy od liczby próbek, długości tekstów oraz dostępnej karty graficznej.</w:t>
       </w:r>
       <w:r>
         <w:tab/>
@@ -3359,17 +3295,17 @@
     </w:p>
     <w:p>
       <w:r>
-        <w:t>1. No Adapter: Model bazowy (Bielik-4.5B-Instruct) bez dostrajania.</w:t>
-      </w:r>
-    </w:p>
-    <w:p>
-      <w:r>
-        <w:t>2. Prototype Adapter: Model dostrojony pod kątem precyzji klasyfikacji (maksymalizacja F1).</w:t>
-      </w:r>
-    </w:p>
-    <w:p>
-      <w:r>
-        <w:t>3. XAI Adapter: Model dostrojony do generowania zarówno etykiet, jak i uzasadnień decyzji modelu.</w:t>
+        <w:t>1. Model bazowy bez adaptera (No Adapter): Bielik-4.5B-Instruct bez dostrajania do zadania detekcji manipulacji.</w:t>
+      </w:r>
+    </w:p>
+    <w:p>
+      <w:r>
+        <w:t>2. Adapter prototypowy (Prototype Adapter): model dostrojony pod kątem precyzji klasyfikacji, czyli maksymalizacji wyniku F1.</w:t>
+      </w:r>
+    </w:p>
+    <w:p>
+      <w:r>
+        <w:t>3. Adapter wyjaśnialny (XAI Adapter): model dostrojony do generowania zarówno etykiet, jak i uzasadnień decyzji modelu.</w:t>
       </w:r>
     </w:p>
     <w:p/>
@@ -3596,7 +3532,7 @@
     </w:p>
     <w:p>
       <w:r>
-        <w:t>* Wpływ dostrajania: Model bazowy ("No Adapter") wykazuje krytycznie niską zdolność do formowania poprawnego wyjścia JSON (PSR 20%), co dyskwalifikuje go z zastosowań produkcyjnych. Dostrajanie (Adaptery) podnosi stabilność formatu do poziomu &gt;96%.</w:t>
+        <w:t>* Wpływ dostrajania: Model bazowy bez adaptera (No Adapter) wykazuje krytycznie niską zdolność do formowania poprawnego wyjścia JSON (PSR 20%), co dyskwalifikuje go z zastosowań produkcyjnych. Dostrajanie (Adaptery) podnosi stabilność formatu do poziomu &gt;96%.</w:t>
       </w:r>
     </w:p>
     <w:p>
@@ -3606,58 +3542,38 @@
     </w:p>
     <w:p>
       <w:r>
-        <w:t xml:space="preserve">* Odniesienie do literatury: Uzyskane wyniki dla wariantu </w:t>
-      </w:r>
-      <w:r>
-        <w:rPr>
-          <w:i/>
-          <w:iCs/>
-        </w:rPr>
-        <w:t>Prototype Adapter</w:t>
-      </w:r>
-      <w:r>
-        <w:t xml:space="preserve"> (F1 = 0.49) przewyższają bazowe wyniki raportowane w literaturze dla zbioru MIPD (Modzelewski et al., 2024), gdzie modele PL-RoBERTa-Large osiągały ważone F1 na poziomie ok. 0.47 (±0.003). Potwierdza to wysoką skuteczność procesu dostrajania modelu Bielik-4.5B w zadaniu czystej klasyfikacji. Warto jednak zauważyć, że wariant </w:t>
-      </w:r>
-      <w:r>
-        <w:rPr>
-          <w:i/>
-          <w:iCs/>
-        </w:rPr>
-        <w:t>XAI Adapter</w:t>
-      </w:r>
-      <w:r>
-        <w:t>, wprowadzający warstwę wyjaśnialności, uzyskuje obecnie wyniki niższe od literatury (F1 = 0.28). Wskazuje to na istotne wyzwanie inżynierskie: wprowadzenie wyjaśnialności (NLE) wiąże się obecnie z kosztem wydajnościowym (tzw. podatkiem od wyjaśnialności – performance tax). Optymalizacja jakości danych syntetycznych oraz procesu destylacji wiedzy, mająca na celu zbliżenie skuteczności wariantu XAI do poziomu Prototype, stanowi jeden z głównych kierunków dalszych prac.</w:t>
-      </w:r>
-    </w:p>
-    <w:p>
-      <w:r>
-        <w:t>Należy zauważyć, że metryki nie są w pełni równoważne metodologicznie, ponieważ literatura raportuje weighted F1 dla pełnego zbioru, podczas gdy w niniejszej pracy zastosowano Mean Document-Level F1 dla próbek niepustych.</w:t>
+        <w:t>* Odniesienie do literatury: Uzyskane wyniki dla adaptera prototypowego (Prototype Adapter) (F1 = 0.49) przewyższają bazowe wyniki raportowane w literaturze dla zbioru MIPD (Modzelewski et al., 2024), gdzie modele PL-RoBERTa-Large osiągały ważone F1 na poziomie ok. 0.47 (±0.003). Potwierdza to wysoką skuteczność procesu dostrajania modelu Bielik-4.5B w zadaniu czystej klasyfikacji. Warto jednak zauważyć, że adapter wyjaśnialny (XAI Adapter), wprowadzający warstwę wyjaśnialności, uzyskuje obecnie wyniki niższe od literatury (F1 = 0.28). Wskazuje to na istotne wyzwanie inżynierskie: wprowadzenie wyjaśnialności (NLE) wiąże się obecnie z kosztem wydajnościowym (tzw. podatkiem od wyjaśnialności – performance tax). Optymalizacja jakości danych syntetycznych oraz procesu destylacji wiedzy, mająca na celu zbliżenie skuteczności adaptera wyjaśnialnego do poziomu adaptera prototypowego, stanowi jeden z głównych kierunków dalszych prac.</w:t>
+      </w:r>
+    </w:p>
+    <w:p>
+      <w:r>
+        <w:t>Należy zauważyć, że metryki nie są w pełni równoważne metodologicznie, ponieważ literatura raportuje weighted F1 dla pełnego zbioru, podczas gdy w niniejszej pracy zastosowano średni F1 na poziomie dokumentu dla próbek niepustych (Mean Document-Level F1).</w:t>
       </w:r>
     </w:p>
     <w:p/>
     <w:p>
       <w:r>
-        <w:t>Analiza Macierzy Pomyłek:</w:t>
-      </w:r>
-    </w:p>
-    <w:p>
-      <w:r>
-        <w:t>Analiza macierzy pomyłek (zawartych w Sekcji 3) potwierdza te obserwacje:</w:t>
-      </w:r>
-    </w:p>
-    <w:p>
-      <w:r>
-        <w:t>* Adapter Prototype najskuteczniej identyfikuje subtelne techniki jak EXAGGERATION (187 TP) czy CHERRY_PICKING (101 TP).</w:t>
-      </w:r>
-    </w:p>
-    <w:p>
-      <w:r>
-        <w:t>* Adapter XAI przyjmuje strategię bardziej konserwatywną, częściej "przeoczając" techniki (więcej False Negatives), np. dla EXAGGERATION wykrył 128 przypadków.</w:t>
-      </w:r>
-    </w:p>
-    <w:p>
-      <w:r>
-        <w:t>* Model bez adaptera w większości przypadków nie wykrywa technik (ogromna przewaga False Negatives nad True Positives dla niemal wszystkich klas), co potwierdza konieczność treningu specyficznego dla domeny detekcji dezinformacji.</w:t>
+        <w:t>Analiza macierzy pomyłek:</w:t>
+      </w:r>
+    </w:p>
+    <w:p>
+      <w:r>
+        <w:t>W Sekcji 3 pokazano zagregowane macierze pomyłek, w których każda para dokument-etykieta jest traktowana jako osobna decyzja binarna. Takie wizualizacje dobrze pokazują ogólny bilans odpowiedzi TP/FP/FN/TN, natomiast wnioski o konkretnych klasach pochodzą z raportów per-tag generowanych przez benchmark.</w:t>
+      </w:r>
+    </w:p>
+    <w:p>
+      <w:r>
+        <w:t>* Adapter prototypowy osiąga najlepszy ogólny bilans detekcji: 475 poprawnych wykryć (TP) przy 374 pominięciach (FN). W wynikach per-klasa najlepiej wypadają EXAGGERATION, REFERENCE_ERROR i CHERRY_PICKING, natomiast klasy rzadkie, takie jak LEADING_QUESTIONS, MISLEADING_CLICKBAI i QUOTE_MINING, pozostają trudne do wykrycia.</w:t>
+      </w:r>
+    </w:p>
+    <w:p>
+      <w:r>
+        <w:t>* Adapter wyjaśnialny (XAI Adapter) działa bardziej konserwatywnie: ogranicza liczbę fałszywych alarmów względem adaptera prototypowego, ale jednocześnie zwiększa liczbę pominiętych technik. Jest to zgodne z obserwowanym kosztem dodania warstwy wyjaśnień, która utrudnia modelowi jednoczesne utrzymanie jakości klasyfikacji i generowania uzasadnienia.</w:t>
+      </w:r>
+    </w:p>
+    <w:p>
+      <w:r>
+        <w:t>* Model bazowy bez adaptera generuje wiele błędnych wskazań i ma bardzo mało poprawnych wykryć, co potwierdza konieczność dostrojenia modelu do domeny detekcji dezinformacji oraz do wymaganego formatu odpowiedzi.</w:t>
       </w:r>
     </w:p>
     <w:p>
@@ -3806,6 +3722,12 @@
       <w:r>
         <w:lastRenderedPageBreak/>
         <w:t>Zrzuty ekranu, wizualizacje, itp.</w:t>
+      </w:r>
+    </w:p>
+    <w:p>
+      <w:pPr/>
+      <w:r>
+        <w:t>Poniższe rysunki dokumentują wyniki ewaluacji oraz najważniejsze ekrany działającego systemu. Macierze pomyłek mają charakter zagregowany dla wszystkich etykiet; interpretacja klas szczegółowych odwołuje się do raportów per-tag wygenerowanych przez moduł benchmarkowy.</w:t>
       </w:r>
     </w:p>
     <w:p>
@@ -3875,13 +3797,13 @@
         <w:keepNext/>
       </w:pPr>
       <w:r>
-        <w:t>No adapter</w:t>
-      </w:r>
-      <w:r>
-        <w:t xml:space="preserve"> </w:t>
-      </w:r>
-      <w:r>
-        <w:t>confusion matrix</w:t>
+        <w:t>Rysunek 1. Zagregowana macierz pomyłek - model bazowy bez adaptera (No Adapter)</w:t>
+      </w:r>
+    </w:p>
+    <w:p>
+      <w:pPr/>
+      <w:r>
+        <w:t>Model bazowy bez dostrajania uzyskał jedynie 111 poprawnych wykryć przy 738 pominięciach oraz 1779 fałszywych alarmach. Wynik pokazuje, że sam model Bielik-4.5B nie utrzymuje stabilnej klasyfikacji ani formatu odpowiedzi bez dostrojenia do domeny i zadania.</w:t>
       </w:r>
     </w:p>
     <w:p>
@@ -3949,13 +3871,13 @@
         <w:keepNext/>
       </w:pPr>
       <w:r>
-        <w:t>P</w:t>
-      </w:r>
-      <w:r>
-        <w:t>rototype adapter</w:t>
-      </w:r>
-      <w:r>
-        <w:t xml:space="preserve"> confusion matrix</w:t>
+        <w:t>Rysunek 2. Zagregowana macierz pomyłek - adapter prototypowy (Prototype Adapter)</w:t>
+      </w:r>
+    </w:p>
+    <w:p>
+      <w:pPr/>
+      <w:r>
+        <w:t>Adapter prototypowy osiąga najlepszy bilans detekcji spośród badanych wariantów: 475 poprawnych wykryć przy 374 pominięciach. Analiza per-klasa wskazuje, że model najlepiej rozpoznaje EXAGGERATION, REFERENCE_ERROR i CHERRY_PICKING, natomiast klasy rzadkie, m.in. LEADING_QUESTIONS, MISLEADING_CLICKBAI i QUOTE_MINING, pozostają problematyczne z powodu niezbalansowania danych.</w:t>
       </w:r>
     </w:p>
     <w:p>
@@ -4024,22 +3946,13 @@
         <w:keepNext/>
       </w:pPr>
       <w:r>
-        <w:t>Xa</w:t>
-      </w:r>
-      <w:r>
-        <w:t>i</w:t>
-      </w:r>
-      <w:r>
-        <w:t xml:space="preserve"> </w:t>
-      </w:r>
-      <w:r>
-        <w:t>adapter</w:t>
-      </w:r>
-      <w:r>
-        <w:t xml:space="preserve"> </w:t>
-      </w:r>
-      <w:r>
-        <w:t>confusion matrix</w:t>
+        <w:t>Rysunek 3. Zagregowana macierz pomyłek - adapter wyjaśnialny (XAI Adapter)</w:t>
+      </w:r>
+    </w:p>
+    <w:p>
+      <w:pPr/>
+      <w:r>
+        <w:t>Adapter wyjaśnialny zmniejsza liczbę fałszywych alarmów względem adaptera prototypowego (357 FP wobec 571 FP), ale jednocześnie pomija więcej rzeczywistych technik (589 FN). Oznacza to, że dodanie generowania uzasadnienia poprawia ostrożność modelu, lecz obniża skuteczność klasyfikacji w porównaniu z wariantem czysto klasyfikacyjnym.</w:t>
       </w:r>
     </w:p>
     <w:p>
@@ -4106,7 +4019,13 @@
         <w:pStyle w:val="Caption"/>
       </w:pPr>
       <w:r>
-        <w:t>Interfejs użytkownika</w:t>
+        <w:t>Rysunek 4. Interfejs użytkownika - formularz analizy tekstu</w:t>
+      </w:r>
+    </w:p>
+    <w:p>
+      <w:pPr/>
+      <w:r>
+        <w:t>Widok przedstawia główny ekran użytkownika końcowego, w którym można wkleić tekst artykułu i uruchomić analizę. Interfejs oddziela prosty przepływ użytkownika od złożoności backendu, dzięki czemu odbiorca nie musi znać szczegółów działania modelu ani procesu inferencji.</w:t>
       </w:r>
     </w:p>
     <w:p>
@@ -4161,7 +4080,13 @@
         <w:pStyle w:val="Caption"/>
       </w:pPr>
       <w:r>
-        <w:t>Wynik wnioskowania: interfejs wyświetla tagi wraz z podpowiedziami i objaśnieniami.</w:t>
+        <w:t>Rysunek 5. Wynik wnioskowania - etykiety i objaśnienie decyzji</w:t>
+      </w:r>
+    </w:p>
+    <w:p>
+      <w:pPr/>
+      <w:r>
+        <w:t>Po zakończeniu analizy system prezentuje wykryte techniki manipulacji wraz z opisem i uzasadnieniem. Taki sposób prezentacji realizuje cel wyjaśnialności: użytkownik otrzymuje nie tylko etykietę, lecz także informację, dlaczego dany fragment tekstu został uznany za manipulacyjny.</w:t>
       </w:r>
     </w:p>
     <w:p>
@@ -4228,19 +4153,13 @@
         <w:pStyle w:val="Caption"/>
       </w:pPr>
       <w:r>
-        <w:t>Interfejs p</w:t>
-      </w:r>
-      <w:r>
-        <w:t>anel</w:t>
-      </w:r>
-      <w:r>
-        <w:t>u</w:t>
-      </w:r>
-      <w:r>
-        <w:t xml:space="preserve"> ekspertski</w:t>
-      </w:r>
-      <w:r>
-        <w:t>ego</w:t>
+        <w:t>Rysunek 6. Panel ekspercki - zbiór danych i uruchamianie douczania</w:t>
+      </w:r>
+    </w:p>
+    <w:p>
+      <w:pPr/>
+      <w:r>
+        <w:t>Panel ekspercki służy do wprowadzania nowych przykładów treningowych i uruchamiania procesu dostrajania modelu. Jest to praktyczna realizacja pętli z udziałem człowieka (Human-in-the-Loop), w której ekspert może reagować na nowe narracje dezinformacyjne bez ręcznej przebudowy całego systemu.</w:t>
       </w:r>
     </w:p>
     <w:p>
@@ -4296,14 +4215,17 @@
         <w:keepNext/>
       </w:pPr>
       <w:r>
-        <w:t>Interfejs wdrożenia.</w:t>
-      </w:r>
-      <w:r>
-        <w:rPr>
-          <w:noProof/>
-        </w:rPr>
-        <w:t xml:space="preserve"> </w:t>
-      </w:r>
+        <w:t>Rysunek 7. Panel ekspercki - wdrożenie nowego adaptera</w:t>
+      </w:r>
+    </w:p>
+    <w:p>
+      <w:pPr/>
+      <w:r>
+        <w:t>Widok wdrożenia pokazuje etap decyzyjny po zakończeniu treningu i benchmarku. Ekspert może porównać wynik nowego adaptera z aktualnie używanym modelem i dopiero wtedy promować adapter do środowiska inferencyjnego, co ogranicza ryzyko automatycznego wdrożenia gorszego wariantu.</w:t>
+      </w:r>
+    </w:p>
+    <w:p>
+      <w:pPr/>
       <w:r>
         <w:rPr>
           <w:noProof/>
@@ -4363,10 +4285,13 @@
         <w:pStyle w:val="Caption"/>
       </w:pPr>
       <w:r>
-        <w:t xml:space="preserve">Diagram architektury </w:t>
-      </w:r>
-      <w:r>
-        <w:t>wnioskowania</w:t>
+        <w:t>Rysunek 8. Diagram architektury wnioskowania</w:t>
+      </w:r>
+    </w:p>
+    <w:p>
+      <w:pPr/>
+      <w:r>
+        <w:t>Diagram pokazuje przepływ żądania od interfejsu React, przez backend FastAPI, do lokalnego serwera Ollama z modelem Bielik i adapterem LoRA. Oddzielenie warstwy prezentacji, orkiestracji i inferencji upraszcza utrzymanie systemu oraz umożliwia wymianę adaptera bez zmian w interfejsie użytkownika.</w:t>
       </w:r>
     </w:p>
     <w:p>
@@ -4436,10 +4361,13 @@
         <w:pStyle w:val="Caption"/>
       </w:pPr>
       <w:r>
-        <w:t xml:space="preserve">Diagram architektury </w:t>
-      </w:r>
-      <w:r>
-        <w:t>MLOps</w:t>
+        <w:t>Rysunek 9. Diagram architektury pętli MLOps</w:t>
+      </w:r>
+    </w:p>
+    <w:p>
+      <w:pPr/>
+      <w:r>
+        <w:t>Diagram przedstawia pełny cykl doskonalenia modelu: dodanie danych przez eksperta, trening w środowisku WSL2, automatyczny benchmark i decyzję o wdrożeniu nowego adaptera. Taki przepływ zamienia statyczny klasyfikator w system możliwy do dalszego rozwijania po oddaniu projektu.</w:t>
       </w:r>
     </w:p>
     <w:p>
@@ -4999,6 +4927,12 @@
           <w:lang w:val="en-US"/>
         </w:rPr>
         <w:t>. GitHub. https://github.com/ggerganov/llama.cpp</w:t>
+      </w:r>
+    </w:p>
+    <w:p>
+      <w:pPr/>
+      <w:r>
+        <w:t>12. Danilevsky, M., Qian, K., Aharonov, R., Katsis, Y., Kawas, B., &amp; Sen, P. (2020). *A Survey of the State of Explainable AI for Natural Language Processing*. Proceedings of the 1st Conference of the Asia-Pacific Chapter of the Association for Computational Linguistics and the 10th International Joint Conference on Natural Language Processing, 447-459. https://doi.org/10.18653/v1/2020.aacl-main.46</w:t>
       </w:r>
     </w:p>
     <w:sectPr>

</xml_diff>